<commit_message>
Strip non-ABS/RBA/PTRS download scaffolding (Cotality/Domain/SQM/state rental)
Remove the third-party property-aggregator sources entirely so the source registry is real ABS/RBA/PTRS only: drop their PUBLIC_SOURCE_URLS entries, RAW_PUBLIC_DIR_* constants, downloader routing branches, report publisher/status classifiers, and test cases. Regenerated reports + parquet; 120 tests green.
</commit_message>
<xml_diff>
--- a/outputs/reports/Industry_Analysis_Q1_2026_Board.docx
+++ b/outputs/reports/Industry_Analysis_Q1_2026_Board.docx
@@ -37,7 +37,7 @@
           <w:color w:val="7F7F7F"/>
           <w:sz w:val="20"/>
         </w:rPr>
-        <w:t>Generated 2026-06-11</w:t>
+        <w:t>Generated 2026-06-12</w:t>
       </w:r>
     </w:p>
     <w:p>
@@ -1049,7 +1049,7 @@
                 <w:rFonts w:ascii="Arial" w:hAnsi="Arial"/>
                 <w:sz w:val="20"/>
               </w:rPr>
-              <w:t>2026-06-11</w:t>
+              <w:t>2026-06-12</w:t>
             </w:r>
           </w:p>
         </w:tc>
@@ -1212,7 +1212,7 @@
                 <w:rFonts w:ascii="Arial" w:hAnsi="Arial"/>
                 <w:sz w:val="20"/>
               </w:rPr>
-              <w:t>2026-06-11</w:t>
+              <w:t>2026-06-12</w:t>
             </w:r>
           </w:p>
         </w:tc>
@@ -1383,7 +1383,7 @@
                 <w:rFonts w:ascii="Arial" w:hAnsi="Arial"/>
                 <w:sz w:val="20"/>
               </w:rPr>
-              <w:t>2026-06-11</w:t>
+              <w:t>2026-06-12</w:t>
             </w:r>
           </w:p>
         </w:tc>
@@ -1546,7 +1546,7 @@
                 <w:rFonts w:ascii="Arial" w:hAnsi="Arial"/>
                 <w:sz w:val="20"/>
               </w:rPr>
-              <w:t>2026-06-11</w:t>
+              <w:t>2026-06-12</w:t>
             </w:r>
           </w:p>
         </w:tc>
@@ -1717,7 +1717,7 @@
                 <w:rFonts w:ascii="Arial" w:hAnsi="Arial"/>
                 <w:sz w:val="20"/>
               </w:rPr>
-              <w:t>2026-06-11</w:t>
+              <w:t>2026-06-12</w:t>
             </w:r>
           </w:p>
         </w:tc>
@@ -1880,7 +1880,7 @@
                 <w:rFonts w:ascii="Arial" w:hAnsi="Arial"/>
                 <w:sz w:val="20"/>
               </w:rPr>
-              <w:t>2026-06-11</w:t>
+              <w:t>2026-06-12</w:t>
             </w:r>
           </w:p>
         </w:tc>
@@ -2051,7 +2051,7 @@
                 <w:rFonts w:ascii="Arial" w:hAnsi="Arial"/>
                 <w:sz w:val="20"/>
               </w:rPr>
-              <w:t>2026-06-11</w:t>
+              <w:t>2026-06-12</w:t>
             </w:r>
           </w:p>
         </w:tc>
@@ -2214,7 +2214,7 @@
                 <w:rFonts w:ascii="Arial" w:hAnsi="Arial"/>
                 <w:sz w:val="20"/>
               </w:rPr>
-              <w:t>2026-06-11</w:t>
+              <w:t>2026-06-12</w:t>
             </w:r>
           </w:p>
         </w:tc>
@@ -2385,7 +2385,7 @@
                 <w:rFonts w:ascii="Arial" w:hAnsi="Arial"/>
                 <w:sz w:val="20"/>
               </w:rPr>
-              <w:t>2026-06-11</w:t>
+              <w:t>2026-06-12</w:t>
             </w:r>
           </w:p>
         </w:tc>
@@ -2548,7 +2548,7 @@
                 <w:rFonts w:ascii="Arial" w:hAnsi="Arial"/>
                 <w:sz w:val="20"/>
               </w:rPr>
-              <w:t>2026-06-11</w:t>
+              <w:t>2026-06-12</w:t>
             </w:r>
           </w:p>
         </w:tc>
@@ -2719,7 +2719,7 @@
                 <w:rFonts w:ascii="Arial" w:hAnsi="Arial"/>
                 <w:sz w:val="20"/>
               </w:rPr>
-              <w:t>2026-06-11</w:t>
+              <w:t>2026-06-12</w:t>
             </w:r>
           </w:p>
         </w:tc>
@@ -2882,7 +2882,7 @@
                 <w:rFonts w:ascii="Arial" w:hAnsi="Arial"/>
                 <w:sz w:val="20"/>
               </w:rPr>
-              <w:t>2026-06-11</w:t>
+              <w:t>2026-06-12</w:t>
             </w:r>
           </w:p>
         </w:tc>
@@ -3053,7 +3053,7 @@
                 <w:rFonts w:ascii="Arial" w:hAnsi="Arial"/>
                 <w:sz w:val="20"/>
               </w:rPr>
-              <w:t>2026-06-11</w:t>
+              <w:t>2026-06-12</w:t>
             </w:r>
           </w:p>
         </w:tc>
@@ -3216,7 +3216,7 @@
                 <w:rFonts w:ascii="Arial" w:hAnsi="Arial"/>
                 <w:sz w:val="20"/>
               </w:rPr>
-              <w:t>2026-06-11</w:t>
+              <w:t>2026-06-12</w:t>
             </w:r>
           </w:p>
         </w:tc>
@@ -3387,7 +3387,7 @@
                 <w:rFonts w:ascii="Arial" w:hAnsi="Arial"/>
                 <w:sz w:val="20"/>
               </w:rPr>
-              <w:t>2026-06-11</w:t>
+              <w:t>2026-06-12</w:t>
             </w:r>
           </w:p>
         </w:tc>
@@ -3550,7 +3550,7 @@
                 <w:rFonts w:ascii="Arial" w:hAnsi="Arial"/>
                 <w:sz w:val="20"/>
               </w:rPr>
-              <w:t>2026-06-11</w:t>
+              <w:t>2026-06-12</w:t>
             </w:r>
           </w:p>
         </w:tc>
@@ -3721,7 +3721,7 @@
                 <w:rFonts w:ascii="Arial" w:hAnsi="Arial"/>
                 <w:sz w:val="20"/>
               </w:rPr>
-              <w:t>2026-06-11</w:t>
+              <w:t>2026-06-12</w:t>
             </w:r>
           </w:p>
         </w:tc>
@@ -3884,7 +3884,7 @@
                 <w:rFonts w:ascii="Arial" w:hAnsi="Arial"/>
                 <w:sz w:val="20"/>
               </w:rPr>
-              <w:t>2026-06-11</w:t>
+              <w:t>2026-06-12</w:t>
             </w:r>
           </w:p>
         </w:tc>
@@ -6097,7 +6097,7 @@
                 <w:rFonts w:ascii="Arial" w:hAnsi="Arial"/>
                 <w:sz w:val="20"/>
               </w:rPr>
-              <w:t>cotality_auction_clearance_page</w:t>
+              <w:t>cpi_all_groups_xlsx</w:t>
             </w:r>
           </w:p>
         </w:tc>
@@ -6113,7 +6113,7 @@
                 <w:rFonts w:ascii="Arial" w:hAnsi="Arial"/>
                 <w:sz w:val="20"/>
               </w:rPr>
-              <w:t>Cotality</w:t>
+              <w:t>Australian Bureau of Statistics</w:t>
             </w:r>
           </w:p>
         </w:tc>
@@ -6129,7 +6129,7 @@
                 <w:rFonts w:ascii="Arial" w:hAnsi="Arial"/>
                 <w:sz w:val="20"/>
               </w:rPr>
-              <w:t>https://www.cotality.com/au/our-data/auction-results</w:t>
+              <w:t>https://www.abs.gov.au/statistics/economy/price-indexes-and-inflation/consumer-price-index-australia/dec-2025/640101.xlsx</w:t>
             </w:r>
           </w:p>
         </w:tc>
@@ -6145,7 +6145,7 @@
                 <w:rFonts w:ascii="Arial" w:hAnsi="Arial"/>
                 <w:sz w:val="20"/>
               </w:rPr>
-              <w:t>landing page</w:t>
+              <w:t>XLSX</w:t>
             </w:r>
           </w:p>
         </w:tc>
@@ -6206,7 +6206,7 @@
                 <w:rFonts w:ascii="Arial" w:hAnsi="Arial"/>
                 <w:sz w:val="20"/>
               </w:rPr>
-              <w:t>manually staged</w:t>
+              <w:t>missing</w:t>
             </w:r>
           </w:p>
         </w:tc>
@@ -6240,7 +6240,7 @@
                 <w:rFonts w:ascii="Arial" w:hAnsi="Arial"/>
                 <w:sz w:val="20"/>
               </w:rPr>
-              <w:t>cotality_hvi_page</w:t>
+              <w:t>cpi_subgroups_xlsx</w:t>
             </w:r>
           </w:p>
         </w:tc>
@@ -6257,7 +6257,7 @@
                 <w:rFonts w:ascii="Arial" w:hAnsi="Arial"/>
                 <w:sz w:val="20"/>
               </w:rPr>
-              <w:t>Cotality</w:t>
+              <w:t>Australian Bureau of Statistics</w:t>
             </w:r>
           </w:p>
         </w:tc>
@@ -6274,7 +6274,7 @@
                 <w:rFonts w:ascii="Arial" w:hAnsi="Arial"/>
                 <w:sz w:val="20"/>
               </w:rPr>
-              <w:t>https://www.cotality.com/au/news-research/insights/home-value-index/</w:t>
+              <w:t>https://www.abs.gov.au/statistics/economy/price-indexes-and-inflation/consumer-price-index-australia/dec-2025/640107.xlsx</w:t>
             </w:r>
           </w:p>
         </w:tc>
@@ -6291,7 +6291,7 @@
                 <w:rFonts w:ascii="Arial" w:hAnsi="Arial"/>
                 <w:sz w:val="20"/>
               </w:rPr>
-              <w:t>landing page</w:t>
+              <w:t>XLSX</w:t>
             </w:r>
           </w:p>
         </w:tc>
@@ -6356,7 +6356,7 @@
                 <w:rFonts w:ascii="Arial" w:hAnsi="Arial"/>
                 <w:sz w:val="20"/>
               </w:rPr>
-              <w:t>manually staged</w:t>
+              <w:t>missing</w:t>
             </w:r>
           </w:p>
         </w:tc>
@@ -6390,7 +6390,7 @@
                 <w:rFonts w:ascii="Arial" w:hAnsi="Arial"/>
                 <w:sz w:val="20"/>
               </w:rPr>
-              <w:t>cpi_all_groups_xlsx</w:t>
+              <w:t>dwelling_approvals_xlsx</w:t>
             </w:r>
           </w:p>
         </w:tc>
@@ -6422,7 +6422,7 @@
                 <w:rFonts w:ascii="Arial" w:hAnsi="Arial"/>
                 <w:sz w:val="20"/>
               </w:rPr>
-              <w:t>https://www.abs.gov.au/statistics/economy/price-indexes-and-inflation/consumer-price-index-australia/dec-2025/640101.xlsx</w:t>
+              <w:t>https://www.abs.gov.au/statistics/industry/building-and-construction/building-approvals-australia/feb-2026/875206.xlsx</w:t>
             </w:r>
           </w:p>
         </w:tc>
@@ -6533,7 +6533,7 @@
                 <w:rFonts w:ascii="Arial" w:hAnsi="Arial"/>
                 <w:sz w:val="20"/>
               </w:rPr>
-              <w:t>cpi_subgroups_xlsx</w:t>
+              <w:t>dwelling_value_xlsx</w:t>
             </w:r>
           </w:p>
         </w:tc>
@@ -6567,7 +6567,7 @@
                 <w:rFonts w:ascii="Arial" w:hAnsi="Arial"/>
                 <w:sz w:val="20"/>
               </w:rPr>
-              <w:t>https://www.abs.gov.au/statistics/economy/price-indexes-and-inflation/consumer-price-index-australia/dec-2025/640107.xlsx</w:t>
+              <w:t>https://www.abs.gov.au/statistics/industry/building-and-construction/building-approvals-australia/feb-2026/875211.xlsx</w:t>
             </w:r>
           </w:p>
         </w:tc>
@@ -6683,7 +6683,7 @@
                 <w:rFonts w:ascii="Arial" w:hAnsi="Arial"/>
                 <w:sz w:val="20"/>
               </w:rPr>
-              <w:t>domain_quarterly_page</w:t>
+              <w:t>labour_force_industry_xlsx</w:t>
             </w:r>
           </w:p>
         </w:tc>
@@ -6699,7 +6699,7 @@
                 <w:rFonts w:ascii="Arial" w:hAnsi="Arial"/>
                 <w:sz w:val="20"/>
               </w:rPr>
-              <w:t>Domain</w:t>
+              <w:t>Australian Bureau of Statistics</w:t>
             </w:r>
           </w:p>
         </w:tc>
@@ -6715,7 +6715,7 @@
                 <w:rFonts w:ascii="Arial" w:hAnsi="Arial"/>
                 <w:sz w:val="20"/>
               </w:rPr>
-              <w:t>https://www.domain.com.au/research/house-price-report/</w:t>
+              <w:t>https://www.abs.gov.au/statistics/labour/employment-and-unemployment/labour-force-australia-detailed/feb-2026/6291004.xlsx</w:t>
             </w:r>
           </w:p>
         </w:tc>
@@ -6731,7 +6731,7 @@
                 <w:rFonts w:ascii="Arial" w:hAnsi="Arial"/>
                 <w:sz w:val="20"/>
               </w:rPr>
-              <w:t>landing page</w:t>
+              <w:t>XLSX</w:t>
             </w:r>
           </w:p>
         </w:tc>
@@ -6762,6 +6762,7 @@
                 <w:rFonts w:ascii="Arial" w:hAnsi="Arial"/>
                 <w:sz w:val="20"/>
               </w:rPr>
+              <w:t>2026-04-04T00:14:08+00:00</w:t>
             </w:r>
           </w:p>
         </w:tc>
@@ -6777,6 +6778,7 @@
                 <w:rFonts w:ascii="Arial" w:hAnsi="Arial"/>
                 <w:sz w:val="20"/>
               </w:rPr>
+              <w:t>160939</w:t>
             </w:r>
           </w:p>
         </w:tc>
@@ -6826,7 +6828,7 @@
                 <w:rFonts w:ascii="Arial" w:hAnsi="Arial"/>
                 <w:sz w:val="20"/>
               </w:rPr>
-              <w:t>dwelling_approvals_xlsx</w:t>
+              <w:t>lending_indicators_xlsx</w:t>
             </w:r>
           </w:p>
         </w:tc>
@@ -6860,7 +6862,7 @@
                 <w:rFonts w:ascii="Arial" w:hAnsi="Arial"/>
                 <w:sz w:val="20"/>
               </w:rPr>
-              <w:t>https://www.abs.gov.au/statistics/industry/building-and-construction/building-approvals-australia/feb-2026/875206.xlsx</w:t>
+              <w:t>https://www.abs.gov.au/statistics/economy/finance/lending-indicators/feb-2026/560101.xlsx</w:t>
             </w:r>
           </w:p>
         </w:tc>
@@ -6976,7 +6978,7 @@
                 <w:rFonts w:ascii="Arial" w:hAnsi="Arial"/>
                 <w:sz w:val="20"/>
               </w:rPr>
-              <w:t>dwelling_value_xlsx</w:t>
+              <w:t>ppi_construction_xlsx</w:t>
             </w:r>
           </w:p>
         </w:tc>
@@ -7008,7 +7010,7 @@
                 <w:rFonts w:ascii="Arial" w:hAnsi="Arial"/>
                 <w:sz w:val="20"/>
               </w:rPr>
-              <w:t>https://www.abs.gov.au/statistics/industry/building-and-construction/building-approvals-australia/feb-2026/875211.xlsx</w:t>
+              <w:t>https://www.abs.gov.au/statistics/economy/price-indexes-and-inflation/producer-price-indexes-australia/dec-2025/642713.xlsx</w:t>
             </w:r>
           </w:p>
         </w:tc>
@@ -7119,7 +7121,7 @@
                 <w:rFonts w:ascii="Arial" w:hAnsi="Arial"/>
                 <w:sz w:val="20"/>
               </w:rPr>
-              <w:t>labour_force_industry_xlsx</w:t>
+              <w:t>ppi_manufacturing_xlsx</w:t>
             </w:r>
           </w:p>
         </w:tc>
@@ -7153,7 +7155,7 @@
                 <w:rFonts w:ascii="Arial" w:hAnsi="Arial"/>
                 <w:sz w:val="20"/>
               </w:rPr>
-              <w:t>https://www.abs.gov.au/statistics/labour/employment-and-unemployment/labour-force-australia-detailed/feb-2026/6291004.xlsx</w:t>
+              <w:t>https://www.abs.gov.au/statistics/economy/price-indexes-and-inflation/producer-price-indexes-australia/dec-2025/642712.xlsx</w:t>
             </w:r>
           </w:p>
         </w:tc>
@@ -7203,7 +7205,6 @@
                 <w:rFonts w:ascii="Arial" w:hAnsi="Arial"/>
                 <w:sz w:val="20"/>
               </w:rPr>
-              <w:t>2026-04-04T00:14:08+00:00</w:t>
             </w:r>
           </w:p>
         </w:tc>
@@ -7220,7 +7221,6 @@
                 <w:rFonts w:ascii="Arial" w:hAnsi="Arial"/>
                 <w:sz w:val="20"/>
               </w:rPr>
-              <w:t>160939</w:t>
             </w:r>
           </w:p>
         </w:tc>
@@ -7237,7 +7237,7 @@
                 <w:rFonts w:ascii="Arial" w:hAnsi="Arial"/>
                 <w:sz w:val="20"/>
               </w:rPr>
-              <w:t>manually staged</w:t>
+              <w:t>missing</w:t>
             </w:r>
           </w:p>
         </w:tc>
@@ -7271,7 +7271,7 @@
                 <w:rFonts w:ascii="Arial" w:hAnsi="Arial"/>
                 <w:sz w:val="20"/>
               </w:rPr>
-              <w:t>lending_indicators_xlsx</w:t>
+              <w:t>property_price_capitals_xlsx</w:t>
             </w:r>
           </w:p>
         </w:tc>
@@ -7303,7 +7303,7 @@
                 <w:rFonts w:ascii="Arial" w:hAnsi="Arial"/>
                 <w:sz w:val="20"/>
               </w:rPr>
-              <w:t>https://www.abs.gov.au/statistics/economy/finance/lending-indicators/feb-2026/560101.xlsx</w:t>
+              <w:t>https://www.abs.gov.au/statistics/economy/price-indexes-and-inflation/residential-property-price-indexes-eight-capital-cities/dec-2025/641602.xlsx</w:t>
             </w:r>
           </w:p>
         </w:tc>
@@ -7414,7 +7414,7 @@
                 <w:rFonts w:ascii="Arial" w:hAnsi="Arial"/>
                 <w:sz w:val="20"/>
               </w:rPr>
-              <w:t>nsw_rental_bonds_page</w:t>
+              <w:t>property_price_index_xlsx</w:t>
             </w:r>
           </w:p>
         </w:tc>
@@ -7431,7 +7431,7 @@
                 <w:rFonts w:ascii="Arial" w:hAnsi="Arial"/>
                 <w:sz w:val="20"/>
               </w:rPr>
-              <w:t>State rental bond authorities</w:t>
+              <w:t>Australian Bureau of Statistics</w:t>
             </w:r>
           </w:p>
         </w:tc>
@@ -7448,7 +7448,7 @@
                 <w:rFonts w:ascii="Arial" w:hAnsi="Arial"/>
                 <w:sz w:val="20"/>
               </w:rPr>
-              <w:t>https://www.fairtrading.nsw.gov.au/</w:t>
+              <w:t>https://www.abs.gov.au/statistics/economy/price-indexes-and-inflation/residential-property-price-indexes-eight-capital-cities/dec-2025/641601.xlsx</w:t>
             </w:r>
           </w:p>
         </w:tc>
@@ -7465,7 +7465,7 @@
                 <w:rFonts w:ascii="Arial" w:hAnsi="Arial"/>
                 <w:sz w:val="20"/>
               </w:rPr>
-              <w:t>AU</w:t>
+              <w:t>XLSX</w:t>
             </w:r>
           </w:p>
         </w:tc>
@@ -7530,7 +7530,7 @@
                 <w:rFonts w:ascii="Arial" w:hAnsi="Arial"/>
                 <w:sz w:val="20"/>
               </w:rPr>
-              <w:t>manually staged</w:t>
+              <w:t>missing</w:t>
             </w:r>
           </w:p>
         </w:tc>
@@ -7564,7 +7564,7 @@
                 <w:rFonts w:ascii="Arial" w:hAnsi="Arial"/>
                 <w:sz w:val="20"/>
               </w:rPr>
-              <w:t>ppi_construction_xlsx</w:t>
+              <w:t>ptrs_cycle_8_pdf</w:t>
             </w:r>
           </w:p>
         </w:tc>
@@ -7580,7 +7580,7 @@
                 <w:rFonts w:ascii="Arial" w:hAnsi="Arial"/>
                 <w:sz w:val="20"/>
               </w:rPr>
-              <w:t>Australian Bureau of Statistics</w:t>
+              <w:t>Payment Times Reporting Scheme</w:t>
             </w:r>
           </w:p>
         </w:tc>
@@ -7596,7 +7596,7 @@
                 <w:rFonts w:ascii="Arial" w:hAnsi="Arial"/>
                 <w:sz w:val="20"/>
               </w:rPr>
-              <w:t>https://www.abs.gov.au/statistics/economy/price-indexes-and-inflation/producer-price-indexes-australia/dec-2025/642713.xlsx</w:t>
+              <w:t>https://paymenttimes.gov.au/sites/ptrs.gov.au/files/2025-07/reg-update-july-2025.pdf</w:t>
             </w:r>
           </w:p>
         </w:tc>
@@ -7612,7 +7612,7 @@
                 <w:rFonts w:ascii="Arial" w:hAnsi="Arial"/>
                 <w:sz w:val="20"/>
               </w:rPr>
-              <w:t>XLSX</w:t>
+              <w:t>PDF</w:t>
             </w:r>
           </w:p>
         </w:tc>
@@ -7643,6 +7643,7 @@
                 <w:rFonts w:ascii="Arial" w:hAnsi="Arial"/>
                 <w:sz w:val="20"/>
               </w:rPr>
+              <w:t>2026-06-11T12:01:13+00:00</w:t>
             </w:r>
           </w:p>
         </w:tc>
@@ -7658,6 +7659,7 @@
                 <w:rFonts w:ascii="Arial" w:hAnsi="Arial"/>
                 <w:sz w:val="20"/>
               </w:rPr>
+              <w:t>2055606</w:t>
             </w:r>
           </w:p>
         </w:tc>
@@ -7673,7 +7675,7 @@
                 <w:rFonts w:ascii="Arial" w:hAnsi="Arial"/>
                 <w:sz w:val="20"/>
               </w:rPr>
-              <w:t>missing</w:t>
+              <w:t>manually staged</w:t>
             </w:r>
           </w:p>
         </w:tc>
@@ -7707,7 +7709,7 @@
                 <w:rFonts w:ascii="Arial" w:hAnsi="Arial"/>
                 <w:sz w:val="20"/>
               </w:rPr>
-              <w:t>ppi_manufacturing_xlsx</w:t>
+              <w:t>ptrs_cycle_9_pdf</w:t>
             </w:r>
           </w:p>
         </w:tc>
@@ -7724,7 +7726,7 @@
                 <w:rFonts w:ascii="Arial" w:hAnsi="Arial"/>
                 <w:sz w:val="20"/>
               </w:rPr>
-              <w:t>Australian Bureau of Statistics</w:t>
+              <w:t>Payment Times Reporting Scheme</w:t>
             </w:r>
           </w:p>
         </w:tc>
@@ -7741,7 +7743,7 @@
                 <w:rFonts w:ascii="Arial" w:hAnsi="Arial"/>
                 <w:sz w:val="20"/>
               </w:rPr>
-              <w:t>https://www.abs.gov.au/statistics/economy/price-indexes-and-inflation/producer-price-indexes-australia/dec-2025/642712.xlsx</w:t>
+              <w:t>https://paymenttimes.gov.au/sites/ptrs.gov.au/files/2026-01/regulators-update-202601.pdf</w:t>
             </w:r>
           </w:p>
         </w:tc>
@@ -7758,7 +7760,7 @@
                 <w:rFonts w:ascii="Arial" w:hAnsi="Arial"/>
                 <w:sz w:val="20"/>
               </w:rPr>
-              <w:t>XLSX</w:t>
+              <w:t>PDF</w:t>
             </w:r>
           </w:p>
         </w:tc>
@@ -7791,6 +7793,7 @@
                 <w:rFonts w:ascii="Arial" w:hAnsi="Arial"/>
                 <w:sz w:val="20"/>
               </w:rPr>
+              <w:t>2026-06-11T12:01:14+00:00</w:t>
             </w:r>
           </w:p>
         </w:tc>
@@ -7807,6 +7810,7 @@
                 <w:rFonts w:ascii="Arial" w:hAnsi="Arial"/>
                 <w:sz w:val="20"/>
               </w:rPr>
+              <w:t>3629142</w:t>
             </w:r>
           </w:p>
         </w:tc>
@@ -7823,7 +7827,7 @@
                 <w:rFonts w:ascii="Arial" w:hAnsi="Arial"/>
                 <w:sz w:val="20"/>
               </w:rPr>
-              <w:t>missing</w:t>
+              <w:t>manually staged</w:t>
             </w:r>
           </w:p>
         </w:tc>
@@ -7857,7 +7861,7 @@
                 <w:rFonts w:ascii="Arial" w:hAnsi="Arial"/>
                 <w:sz w:val="20"/>
               </w:rPr>
-              <w:t>property_price_capitals_xlsx</w:t>
+              <w:t>ptrs_guidance</w:t>
             </w:r>
           </w:p>
         </w:tc>
@@ -7873,7 +7877,7 @@
                 <w:rFonts w:ascii="Arial" w:hAnsi="Arial"/>
                 <w:sz w:val="20"/>
               </w:rPr>
-              <w:t>Australian Bureau of Statistics</w:t>
+              <w:t>Payment Times Reporting Scheme</w:t>
             </w:r>
           </w:p>
         </w:tc>
@@ -7889,7 +7893,7 @@
                 <w:rFonts w:ascii="Arial" w:hAnsi="Arial"/>
                 <w:sz w:val="20"/>
               </w:rPr>
-              <w:t>https://www.abs.gov.au/statistics/economy/price-indexes-and-inflation/residential-property-price-indexes-eight-capital-cities/dec-2025/641602.xlsx</w:t>
+              <w:t>https://paymenttimes.gov.au/sites/ptrs.gov.au/files/regulatory-resource/ptrs-guidance-materials-march2025.pdf</w:t>
             </w:r>
           </w:p>
         </w:tc>
@@ -7905,7 +7909,7 @@
                 <w:rFonts w:ascii="Arial" w:hAnsi="Arial"/>
                 <w:sz w:val="20"/>
               </w:rPr>
-              <w:t>XLSX</w:t>
+              <w:t>PDF</w:t>
             </w:r>
           </w:p>
         </w:tc>
@@ -7936,6 +7940,7 @@
                 <w:rFonts w:ascii="Arial" w:hAnsi="Arial"/>
                 <w:sz w:val="20"/>
               </w:rPr>
+              <w:t>2026-06-11T12:01:14+00:00</w:t>
             </w:r>
           </w:p>
         </w:tc>
@@ -7951,6 +7956,7 @@
                 <w:rFonts w:ascii="Arial" w:hAnsi="Arial"/>
                 <w:sz w:val="20"/>
               </w:rPr>
+              <w:t>947450</w:t>
             </w:r>
           </w:p>
         </w:tc>
@@ -7966,7 +7972,7 @@
                 <w:rFonts w:ascii="Arial" w:hAnsi="Arial"/>
                 <w:sz w:val="20"/>
               </w:rPr>
-              <w:t>missing</w:t>
+              <w:t>manually staged</w:t>
             </w:r>
           </w:p>
         </w:tc>
@@ -8000,7 +8006,7 @@
                 <w:rFonts w:ascii="Arial" w:hAnsi="Arial"/>
                 <w:sz w:val="20"/>
               </w:rPr>
-              <w:t>property_price_index_xlsx</w:t>
+              <w:t>rba_cash_rate_csv</w:t>
             </w:r>
           </w:p>
         </w:tc>
@@ -8017,7 +8023,7 @@
                 <w:rFonts w:ascii="Arial" w:hAnsi="Arial"/>
                 <w:sz w:val="20"/>
               </w:rPr>
-              <w:t>Australian Bureau of Statistics</w:t>
+              <w:t>Reserve Bank of Australia</w:t>
             </w:r>
           </w:p>
         </w:tc>
@@ -8034,7 +8040,7 @@
                 <w:rFonts w:ascii="Arial" w:hAnsi="Arial"/>
                 <w:sz w:val="20"/>
               </w:rPr>
-              <w:t>https://www.abs.gov.au/statistics/economy/price-indexes-and-inflation/residential-property-price-indexes-eight-capital-cities/dec-2025/641601.xlsx</w:t>
+              <w:t>https://www.rba.gov.au/statistics/tables/csv/f1-data.csv</w:t>
             </w:r>
           </w:p>
         </w:tc>
@@ -8051,7 +8057,7 @@
                 <w:rFonts w:ascii="Arial" w:hAnsi="Arial"/>
                 <w:sz w:val="20"/>
               </w:rPr>
-              <w:t>XLSX</w:t>
+              <w:t>CSV</w:t>
             </w:r>
           </w:p>
         </w:tc>
@@ -8084,6 +8090,7 @@
                 <w:rFonts w:ascii="Arial" w:hAnsi="Arial"/>
                 <w:sz w:val="20"/>
               </w:rPr>
+              <w:t>2026-04-04T00:14:08+00:00</w:t>
             </w:r>
           </w:p>
         </w:tc>
@@ -8100,6 +8107,7 @@
                 <w:rFonts w:ascii="Arial" w:hAnsi="Arial"/>
                 <w:sz w:val="20"/>
               </w:rPr>
+              <w:t>298051</w:t>
             </w:r>
           </w:p>
         </w:tc>
@@ -8116,7 +8124,7 @@
                 <w:rFonts w:ascii="Arial" w:hAnsi="Arial"/>
                 <w:sz w:val="20"/>
               </w:rPr>
-              <w:t>missing</w:t>
+              <w:t>manually staged</w:t>
             </w:r>
           </w:p>
         </w:tc>
@@ -8150,7 +8158,7 @@
                 <w:rFonts w:ascii="Arial" w:hAnsi="Arial"/>
                 <w:sz w:val="20"/>
               </w:rPr>
-              <w:t>ptrs_cycle_8_pdf</w:t>
+              <w:t>rba_chart_pack_page</w:t>
             </w:r>
           </w:p>
         </w:tc>
@@ -8166,7 +8174,7 @@
                 <w:rFonts w:ascii="Arial" w:hAnsi="Arial"/>
                 <w:sz w:val="20"/>
               </w:rPr>
-              <w:t>Payment Times Reporting Scheme</w:t>
+              <w:t>Reserve Bank of Australia</w:t>
             </w:r>
           </w:p>
         </w:tc>
@@ -8182,7 +8190,7 @@
                 <w:rFonts w:ascii="Arial" w:hAnsi="Arial"/>
                 <w:sz w:val="20"/>
               </w:rPr>
-              <w:t>https://paymenttimes.gov.au/sites/ptrs.gov.au/files/2025-07/reg-update-july-2025.pdf</w:t>
+              <w:t>https://www.rba.gov.au/chart-pack/</w:t>
             </w:r>
           </w:p>
         </w:tc>
@@ -8198,7 +8206,7 @@
                 <w:rFonts w:ascii="Arial" w:hAnsi="Arial"/>
                 <w:sz w:val="20"/>
               </w:rPr>
-              <w:t>PDF</w:t>
+              <w:t>landing page</w:t>
             </w:r>
           </w:p>
         </w:tc>
@@ -8229,7 +8237,6 @@
                 <w:rFonts w:ascii="Arial" w:hAnsi="Arial"/>
                 <w:sz w:val="20"/>
               </w:rPr>
-              <w:t>2026-04-07T01:41:27+00:00</w:t>
             </w:r>
           </w:p>
         </w:tc>
@@ -8245,7 +8252,6 @@
                 <w:rFonts w:ascii="Arial" w:hAnsi="Arial"/>
                 <w:sz w:val="20"/>
               </w:rPr>
-              <w:t>2055606</w:t>
             </w:r>
           </w:p>
         </w:tc>
@@ -8261,7 +8267,7 @@
                 <w:rFonts w:ascii="Arial" w:hAnsi="Arial"/>
                 <w:sz w:val="20"/>
               </w:rPr>
-              <w:t>manually staged</w:t>
+              <w:t>missing</w:t>
             </w:r>
           </w:p>
         </w:tc>
@@ -8295,7 +8301,7 @@
                 <w:rFonts w:ascii="Arial" w:hAnsi="Arial"/>
                 <w:sz w:val="20"/>
               </w:rPr>
-              <w:t>ptrs_cycle_9_pdf</w:t>
+              <w:t>rba_chart_pack_pdf</w:t>
             </w:r>
           </w:p>
         </w:tc>
@@ -8312,7 +8318,7 @@
                 <w:rFonts w:ascii="Arial" w:hAnsi="Arial"/>
                 <w:sz w:val="20"/>
               </w:rPr>
-              <w:t>Payment Times Reporting Scheme</w:t>
+              <w:t>Reserve Bank of Australia</w:t>
             </w:r>
           </w:p>
         </w:tc>
@@ -8329,7 +8335,7 @@
                 <w:rFonts w:ascii="Arial" w:hAnsi="Arial"/>
                 <w:sz w:val="20"/>
               </w:rPr>
-              <w:t>https://paymenttimes.gov.au/sites/ptrs.gov.au/files/2026-01/regulators-update-202601.pdf</w:t>
+              <w:t>https://www.rba.gov.au/chart-pack/</w:t>
             </w:r>
           </w:p>
         </w:tc>
@@ -8363,6 +8369,7 @@
                 <w:rFonts w:ascii="Arial" w:hAnsi="Arial"/>
                 <w:sz w:val="20"/>
               </w:rPr>
+              <w:t>March 2026</w:t>
             </w:r>
           </w:p>
         </w:tc>
@@ -8379,7 +8386,7 @@
                 <w:rFonts w:ascii="Arial" w:hAnsi="Arial"/>
                 <w:sz w:val="20"/>
               </w:rPr>
-              <w:t>2026-04-07T01:41:27+00:00</w:t>
+              <w:t>2026-04-28T08:01:43+00:00</w:t>
             </w:r>
           </w:p>
         </w:tc>
@@ -8396,7 +8403,7 @@
                 <w:rFonts w:ascii="Arial" w:hAnsi="Arial"/>
                 <w:sz w:val="20"/>
               </w:rPr>
-              <w:t>3629142</w:t>
+              <w:t>5434746</w:t>
             </w:r>
           </w:p>
         </w:tc>
@@ -8413,7 +8420,7 @@
                 <w:rFonts w:ascii="Arial" w:hAnsi="Arial"/>
                 <w:sz w:val="20"/>
               </w:rPr>
-              <w:t>manually staged</w:t>
+              <w:t>auto-downloaded</w:t>
             </w:r>
           </w:p>
         </w:tc>
@@ -8430,6 +8437,7 @@
                 <w:rFonts w:ascii="Arial" w:hAnsi="Arial"/>
                 <w:sz w:val="20"/>
               </w:rPr>
+              <w:t>66945f0e420217b86069e72880c20b4670f17a2ff52e6e0de9c9d13a174364d9</w:t>
             </w:r>
           </w:p>
         </w:tc>
@@ -8447,7 +8455,7 @@
                 <w:rFonts w:ascii="Arial" w:hAnsi="Arial"/>
                 <w:sz w:val="20"/>
               </w:rPr>
-              <w:t>ptrs_guidance</w:t>
+              <w:t>rba_fsr_page</w:t>
             </w:r>
           </w:p>
         </w:tc>
@@ -8463,7 +8471,7 @@
                 <w:rFonts w:ascii="Arial" w:hAnsi="Arial"/>
                 <w:sz w:val="20"/>
               </w:rPr>
-              <w:t>Payment Times Reporting Scheme</w:t>
+              <w:t>Reserve Bank of Australia</w:t>
             </w:r>
           </w:p>
         </w:tc>
@@ -8479,7 +8487,7 @@
                 <w:rFonts w:ascii="Arial" w:hAnsi="Arial"/>
                 <w:sz w:val="20"/>
               </w:rPr>
-              <w:t>https://paymenttimes.gov.au/sites/ptrs.gov.au/files/regulatory-resource/ptrs-guidance-materials-march2025.pdf</w:t>
+              <w:t>https://www.rba.gov.au/publications/fsr/</w:t>
             </w:r>
           </w:p>
         </w:tc>
@@ -8495,7 +8503,7 @@
                 <w:rFonts w:ascii="Arial" w:hAnsi="Arial"/>
                 <w:sz w:val="20"/>
               </w:rPr>
-              <w:t>PDF</w:t>
+              <w:t>landing page</w:t>
             </w:r>
           </w:p>
         </w:tc>
@@ -8526,7 +8534,6 @@
                 <w:rFonts w:ascii="Arial" w:hAnsi="Arial"/>
                 <w:sz w:val="20"/>
               </w:rPr>
-              <w:t>2026-04-07T01:41:27+00:00</w:t>
             </w:r>
           </w:p>
         </w:tc>
@@ -8542,7 +8549,6 @@
                 <w:rFonts w:ascii="Arial" w:hAnsi="Arial"/>
                 <w:sz w:val="20"/>
               </w:rPr>
-              <w:t>947450</w:t>
             </w:r>
           </w:p>
         </w:tc>
@@ -8558,7 +8564,7 @@
                 <w:rFonts w:ascii="Arial" w:hAnsi="Arial"/>
                 <w:sz w:val="20"/>
               </w:rPr>
-              <w:t>manually staged</w:t>
+              <w:t>missing</w:t>
             </w:r>
           </w:p>
         </w:tc>
@@ -8592,7 +8598,7 @@
                 <w:rFonts w:ascii="Arial" w:hAnsi="Arial"/>
                 <w:sz w:val="20"/>
               </w:rPr>
-              <w:t>qld_median_rents_page</w:t>
+              <w:t>rba_fsr_pdf</w:t>
             </w:r>
           </w:p>
         </w:tc>
@@ -8609,7 +8615,7 @@
                 <w:rFonts w:ascii="Arial" w:hAnsi="Arial"/>
                 <w:sz w:val="20"/>
               </w:rPr>
-              <w:t>Public source</w:t>
+              <w:t>Reserve Bank of Australia</w:t>
             </w:r>
           </w:p>
         </w:tc>
@@ -8626,7 +8632,7 @@
                 <w:rFonts w:ascii="Arial" w:hAnsi="Arial"/>
                 <w:sz w:val="20"/>
               </w:rPr>
-              <w:t>https://www.rta.qld.gov.au/about-the-rta/research-and-reports/median-rents-quarterly-data</w:t>
+              <w:t>https://www.rba.gov.au/publications/fsr/</w:t>
             </w:r>
           </w:p>
         </w:tc>
@@ -8643,7 +8649,7 @@
                 <w:rFonts w:ascii="Arial" w:hAnsi="Arial"/>
                 <w:sz w:val="20"/>
               </w:rPr>
-              <w:t>landing page</w:t>
+              <w:t>PDF</w:t>
             </w:r>
           </w:p>
         </w:tc>
@@ -8660,6 +8666,7 @@
                 <w:rFonts w:ascii="Arial" w:hAnsi="Arial"/>
                 <w:sz w:val="20"/>
               </w:rPr>
+              <w:t>March 2026</w:t>
             </w:r>
           </w:p>
         </w:tc>
@@ -8676,6 +8683,7 @@
                 <w:rFonts w:ascii="Arial" w:hAnsi="Arial"/>
                 <w:sz w:val="20"/>
               </w:rPr>
+              <w:t>2026-04-28T08:01:42+00:00</w:t>
             </w:r>
           </w:p>
         </w:tc>
@@ -8692,6 +8700,7 @@
                 <w:rFonts w:ascii="Arial" w:hAnsi="Arial"/>
                 <w:sz w:val="20"/>
               </w:rPr>
+              <w:t>3272062</w:t>
             </w:r>
           </w:p>
         </w:tc>
@@ -8708,7 +8717,7 @@
                 <w:rFonts w:ascii="Arial" w:hAnsi="Arial"/>
                 <w:sz w:val="20"/>
               </w:rPr>
-              <w:t>missing</w:t>
+              <w:t>auto-downloaded</w:t>
             </w:r>
           </w:p>
         </w:tc>
@@ -8725,6 +8734,7 @@
                 <w:rFonts w:ascii="Arial" w:hAnsi="Arial"/>
                 <w:sz w:val="20"/>
               </w:rPr>
+              <w:t>342ec105f1c623e507ef4e8434ade6f0788ef58ed26b2accaa8ec7df04acc13e</w:t>
             </w:r>
           </w:p>
         </w:tc>
@@ -8742,7 +8752,7 @@
                 <w:rFonts w:ascii="Arial" w:hAnsi="Arial"/>
                 <w:sz w:val="20"/>
               </w:rPr>
-              <w:t>rba_cash_rate_csv</w:t>
+              <w:t>rba_smp_page</w:t>
             </w:r>
           </w:p>
         </w:tc>
@@ -8774,7 +8784,7 @@
                 <w:rFonts w:ascii="Arial" w:hAnsi="Arial"/>
                 <w:sz w:val="20"/>
               </w:rPr>
-              <w:t>https://www.rba.gov.au/statistics/tables/csv/f1-data.csv</w:t>
+              <w:t>https://www.rba.gov.au/publications/smp/</w:t>
             </w:r>
           </w:p>
         </w:tc>
@@ -8790,7 +8800,7 @@
                 <w:rFonts w:ascii="Arial" w:hAnsi="Arial"/>
                 <w:sz w:val="20"/>
               </w:rPr>
-              <w:t>CSV</w:t>
+              <w:t>landing page</w:t>
             </w:r>
           </w:p>
         </w:tc>
@@ -8821,7 +8831,6 @@
                 <w:rFonts w:ascii="Arial" w:hAnsi="Arial"/>
                 <w:sz w:val="20"/>
               </w:rPr>
-              <w:t>2026-04-04T00:14:08+00:00</w:t>
             </w:r>
           </w:p>
         </w:tc>
@@ -8837,7 +8846,6 @@
                 <w:rFonts w:ascii="Arial" w:hAnsi="Arial"/>
                 <w:sz w:val="20"/>
               </w:rPr>
-              <w:t>298051</w:t>
             </w:r>
           </w:p>
         </w:tc>
@@ -8853,7 +8861,7 @@
                 <w:rFonts w:ascii="Arial" w:hAnsi="Arial"/>
                 <w:sz w:val="20"/>
               </w:rPr>
-              <w:t>manually staged</w:t>
+              <w:t>missing</w:t>
             </w:r>
           </w:p>
         </w:tc>
@@ -8887,7 +8895,7 @@
                 <w:rFonts w:ascii="Arial" w:hAnsi="Arial"/>
                 <w:sz w:val="20"/>
               </w:rPr>
-              <w:t>rba_chart_pack_page</w:t>
+              <w:t>rba_smp_pdf</w:t>
             </w:r>
           </w:p>
         </w:tc>
@@ -8921,7 +8929,7 @@
                 <w:rFonts w:ascii="Arial" w:hAnsi="Arial"/>
                 <w:sz w:val="20"/>
               </w:rPr>
-              <w:t>https://www.rba.gov.au/chart-pack/</w:t>
+              <w:t>https://www.rba.gov.au/publications/smp/</w:t>
             </w:r>
           </w:p>
         </w:tc>
@@ -8938,7 +8946,7 @@
                 <w:rFonts w:ascii="Arial" w:hAnsi="Arial"/>
                 <w:sz w:val="20"/>
               </w:rPr>
-              <w:t>landing page</w:t>
+              <w:t>PDF</w:t>
             </w:r>
           </w:p>
         </w:tc>
@@ -8955,6 +8963,7 @@
                 <w:rFonts w:ascii="Arial" w:hAnsi="Arial"/>
                 <w:sz w:val="20"/>
               </w:rPr>
+              <w:t>February 2026</w:t>
             </w:r>
           </w:p>
         </w:tc>
@@ -8971,6 +8980,7 @@
                 <w:rFonts w:ascii="Arial" w:hAnsi="Arial"/>
                 <w:sz w:val="20"/>
               </w:rPr>
+              <w:t>2026-04-28T08:01:42+00:00</w:t>
             </w:r>
           </w:p>
         </w:tc>
@@ -8987,6 +8997,7 @@
                 <w:rFonts w:ascii="Arial" w:hAnsi="Arial"/>
                 <w:sz w:val="20"/>
               </w:rPr>
+              <w:t>4201271</w:t>
             </w:r>
           </w:p>
         </w:tc>
@@ -9003,7 +9014,7 @@
                 <w:rFonts w:ascii="Arial" w:hAnsi="Arial"/>
                 <w:sz w:val="20"/>
               </w:rPr>
-              <w:t>missing</w:t>
+              <w:t>auto-downloaded</w:t>
             </w:r>
           </w:p>
         </w:tc>
@@ -9020,6 +9031,7 @@
                 <w:rFonts w:ascii="Arial" w:hAnsi="Arial"/>
                 <w:sz w:val="20"/>
               </w:rPr>
+              <w:t>db42f94329b6c229844fb8da8cbc4308d707af57b3d5ba90d0aaa9bd7e21ca89</w:t>
             </w:r>
           </w:p>
         </w:tc>
@@ -9037,7 +9049,7 @@
                 <w:rFonts w:ascii="Arial" w:hAnsi="Arial"/>
                 <w:sz w:val="20"/>
               </w:rPr>
-              <w:t>rba_chart_pack_pdf</w:t>
+              <w:t>rba_table_e2_xls</w:t>
             </w:r>
           </w:p>
         </w:tc>
@@ -9069,7 +9081,7 @@
                 <w:rFonts w:ascii="Arial" w:hAnsi="Arial"/>
                 <w:sz w:val="20"/>
               </w:rPr>
-              <w:t>https://www.rba.gov.au/chart-pack/</w:t>
+              <w:t>https://www.rba.gov.au/statistics/tables/xls/e02hist.xls</w:t>
             </w:r>
           </w:p>
         </w:tc>
@@ -9085,7 +9097,7 @@
                 <w:rFonts w:ascii="Arial" w:hAnsi="Arial"/>
                 <w:sz w:val="20"/>
               </w:rPr>
-              <w:t>PDF</w:t>
+              <w:t>XLS</w:t>
             </w:r>
           </w:p>
         </w:tc>
@@ -9101,7 +9113,6 @@
                 <w:rFonts w:ascii="Arial" w:hAnsi="Arial"/>
                 <w:sz w:val="20"/>
               </w:rPr>
-              <w:t>March 2026</w:t>
             </w:r>
           </w:p>
         </w:tc>
@@ -9117,7 +9128,6 @@
                 <w:rFonts w:ascii="Arial" w:hAnsi="Arial"/>
                 <w:sz w:val="20"/>
               </w:rPr>
-              <w:t>2026-04-28T08:01:43+00:00</w:t>
             </w:r>
           </w:p>
         </w:tc>
@@ -9133,7 +9143,6 @@
                 <w:rFonts w:ascii="Arial" w:hAnsi="Arial"/>
                 <w:sz w:val="20"/>
               </w:rPr>
-              <w:t>5434746</w:t>
             </w:r>
           </w:p>
         </w:tc>
@@ -9149,7 +9158,7 @@
                 <w:rFonts w:ascii="Arial" w:hAnsi="Arial"/>
                 <w:sz w:val="20"/>
               </w:rPr>
-              <w:t>auto-downloaded</w:t>
+              <w:t>missing</w:t>
             </w:r>
           </w:p>
         </w:tc>
@@ -9165,7 +9174,6 @@
                 <w:rFonts w:ascii="Arial" w:hAnsi="Arial"/>
                 <w:sz w:val="20"/>
               </w:rPr>
-              <w:t>66945f0e420217b86069e72880c20b4670f17a2ff52e6e0de9c9d13a174364d9</w:t>
             </w:r>
           </w:p>
         </w:tc>
@@ -9184,7 +9192,7 @@
                 <w:rFonts w:ascii="Arial" w:hAnsi="Arial"/>
                 <w:sz w:val="20"/>
               </w:rPr>
-              <w:t>rba_fsr_page</w:t>
+              <w:t>total_value_dwellings_xlsx</w:t>
             </w:r>
           </w:p>
         </w:tc>
@@ -9201,7 +9209,7 @@
                 <w:rFonts w:ascii="Arial" w:hAnsi="Arial"/>
                 <w:sz w:val="20"/>
               </w:rPr>
-              <w:t>Reserve Bank of Australia</w:t>
+              <w:t>Australian Bureau of Statistics</w:t>
             </w:r>
           </w:p>
         </w:tc>
@@ -9218,7 +9226,7 @@
                 <w:rFonts w:ascii="Arial" w:hAnsi="Arial"/>
                 <w:sz w:val="20"/>
               </w:rPr>
-              <w:t>https://www.rba.gov.au/publications/fsr/</w:t>
+              <w:t>https://www.abs.gov.au/statistics/economy/finance/total-value-dwellings/dec-2025/643201.xlsx</w:t>
             </w:r>
           </w:p>
         </w:tc>
@@ -9235,7 +9243,7 @@
                 <w:rFonts w:ascii="Arial" w:hAnsi="Arial"/>
                 <w:sz w:val="20"/>
               </w:rPr>
-              <w:t>landing page</w:t>
+              <w:t>XLSX</w:t>
             </w:r>
           </w:p>
         </w:tc>
@@ -9308,1035 +9316,6 @@
           <w:tcPr>
             <w:tcW w:type="dxa" w:w="1040"/>
             <w:shd w:val="clear" w:color="auto" w:fill="F2F2F2"/>
-            <w:vAlign w:val="center"/>
-          </w:tcPr>
-          <w:p>
-            <w:r/>
-            <w:r>
-              <w:rPr>
-                <w:rFonts w:ascii="Arial" w:hAnsi="Arial"/>
-                <w:sz w:val="20"/>
-              </w:rPr>
-            </w:r>
-          </w:p>
-        </w:tc>
-      </w:tr>
-      <w:tr>
-        <w:tc>
-          <w:tcPr>
-            <w:tcW w:type="dxa" w:w="1040"/>
-            <w:vAlign w:val="center"/>
-          </w:tcPr>
-          <w:p>
-            <w:r/>
-            <w:r>
-              <w:rPr>
-                <w:rFonts w:ascii="Arial" w:hAnsi="Arial"/>
-                <w:sz w:val="20"/>
-              </w:rPr>
-              <w:t>rba_fsr_pdf</w:t>
-            </w:r>
-          </w:p>
-        </w:tc>
-        <w:tc>
-          <w:tcPr>
-            <w:tcW w:type="dxa" w:w="1040"/>
-            <w:vAlign w:val="center"/>
-          </w:tcPr>
-          <w:p>
-            <w:r/>
-            <w:r>
-              <w:rPr>
-                <w:rFonts w:ascii="Arial" w:hAnsi="Arial"/>
-                <w:sz w:val="20"/>
-              </w:rPr>
-              <w:t>Reserve Bank of Australia</w:t>
-            </w:r>
-          </w:p>
-        </w:tc>
-        <w:tc>
-          <w:tcPr>
-            <w:tcW w:type="dxa" w:w="1040"/>
-            <w:vAlign w:val="center"/>
-          </w:tcPr>
-          <w:p>
-            <w:r/>
-            <w:r>
-              <w:rPr>
-                <w:rFonts w:ascii="Arial" w:hAnsi="Arial"/>
-                <w:sz w:val="20"/>
-              </w:rPr>
-              <w:t>https://www.rba.gov.au/publications/fsr/</w:t>
-            </w:r>
-          </w:p>
-        </w:tc>
-        <w:tc>
-          <w:tcPr>
-            <w:tcW w:type="dxa" w:w="1040"/>
-            <w:vAlign w:val="center"/>
-          </w:tcPr>
-          <w:p>
-            <w:r/>
-            <w:r>
-              <w:rPr>
-                <w:rFonts w:ascii="Arial" w:hAnsi="Arial"/>
-                <w:sz w:val="20"/>
-              </w:rPr>
-              <w:t>PDF</w:t>
-            </w:r>
-          </w:p>
-        </w:tc>
-        <w:tc>
-          <w:tcPr>
-            <w:tcW w:type="dxa" w:w="1040"/>
-            <w:vAlign w:val="center"/>
-          </w:tcPr>
-          <w:p>
-            <w:r/>
-            <w:r>
-              <w:rPr>
-                <w:rFonts w:ascii="Arial" w:hAnsi="Arial"/>
-                <w:sz w:val="20"/>
-              </w:rPr>
-              <w:t>March 2026</w:t>
-            </w:r>
-          </w:p>
-        </w:tc>
-        <w:tc>
-          <w:tcPr>
-            <w:tcW w:type="dxa" w:w="1040"/>
-            <w:vAlign w:val="center"/>
-          </w:tcPr>
-          <w:p>
-            <w:r/>
-            <w:r>
-              <w:rPr>
-                <w:rFonts w:ascii="Arial" w:hAnsi="Arial"/>
-                <w:sz w:val="20"/>
-              </w:rPr>
-              <w:t>2026-04-28T08:01:42+00:00</w:t>
-            </w:r>
-          </w:p>
-        </w:tc>
-        <w:tc>
-          <w:tcPr>
-            <w:tcW w:type="dxa" w:w="1040"/>
-            <w:vAlign w:val="center"/>
-          </w:tcPr>
-          <w:p>
-            <w:r/>
-            <w:r>
-              <w:rPr>
-                <w:rFonts w:ascii="Arial" w:hAnsi="Arial"/>
-                <w:sz w:val="20"/>
-              </w:rPr>
-              <w:t>3272062</w:t>
-            </w:r>
-          </w:p>
-        </w:tc>
-        <w:tc>
-          <w:tcPr>
-            <w:tcW w:type="dxa" w:w="1040"/>
-            <w:vAlign w:val="center"/>
-          </w:tcPr>
-          <w:p>
-            <w:r/>
-            <w:r>
-              <w:rPr>
-                <w:rFonts w:ascii="Arial" w:hAnsi="Arial"/>
-                <w:sz w:val="20"/>
-              </w:rPr>
-              <w:t>auto-downloaded</w:t>
-            </w:r>
-          </w:p>
-        </w:tc>
-        <w:tc>
-          <w:tcPr>
-            <w:tcW w:type="dxa" w:w="1040"/>
-            <w:vAlign w:val="center"/>
-          </w:tcPr>
-          <w:p>
-            <w:r/>
-            <w:r>
-              <w:rPr>
-                <w:rFonts w:ascii="Arial" w:hAnsi="Arial"/>
-                <w:sz w:val="20"/>
-              </w:rPr>
-              <w:t>342ec105f1c623e507ef4e8434ade6f0788ef58ed26b2accaa8ec7df04acc13e</w:t>
-            </w:r>
-          </w:p>
-        </w:tc>
-      </w:tr>
-      <w:tr>
-        <w:tc>
-          <w:tcPr>
-            <w:tcW w:type="dxa" w:w="1040"/>
-            <w:shd w:val="clear" w:color="auto" w:fill="F2F2F2"/>
-            <w:vAlign w:val="center"/>
-          </w:tcPr>
-          <w:p>
-            <w:r/>
-            <w:r>
-              <w:rPr>
-                <w:rFonts w:ascii="Arial" w:hAnsi="Arial"/>
-                <w:sz w:val="20"/>
-              </w:rPr>
-              <w:t>rba_smp_page</w:t>
-            </w:r>
-          </w:p>
-        </w:tc>
-        <w:tc>
-          <w:tcPr>
-            <w:tcW w:type="dxa" w:w="1040"/>
-            <w:shd w:val="clear" w:color="auto" w:fill="F2F2F2"/>
-            <w:vAlign w:val="center"/>
-          </w:tcPr>
-          <w:p>
-            <w:r/>
-            <w:r>
-              <w:rPr>
-                <w:rFonts w:ascii="Arial" w:hAnsi="Arial"/>
-                <w:sz w:val="20"/>
-              </w:rPr>
-              <w:t>Reserve Bank of Australia</w:t>
-            </w:r>
-          </w:p>
-        </w:tc>
-        <w:tc>
-          <w:tcPr>
-            <w:tcW w:type="dxa" w:w="1040"/>
-            <w:shd w:val="clear" w:color="auto" w:fill="F2F2F2"/>
-            <w:vAlign w:val="center"/>
-          </w:tcPr>
-          <w:p>
-            <w:r/>
-            <w:r>
-              <w:rPr>
-                <w:rFonts w:ascii="Arial" w:hAnsi="Arial"/>
-                <w:sz w:val="20"/>
-              </w:rPr>
-              <w:t>https://www.rba.gov.au/publications/smp/</w:t>
-            </w:r>
-          </w:p>
-        </w:tc>
-        <w:tc>
-          <w:tcPr>
-            <w:tcW w:type="dxa" w:w="1040"/>
-            <w:shd w:val="clear" w:color="auto" w:fill="F2F2F2"/>
-            <w:vAlign w:val="center"/>
-          </w:tcPr>
-          <w:p>
-            <w:r/>
-            <w:r>
-              <w:rPr>
-                <w:rFonts w:ascii="Arial" w:hAnsi="Arial"/>
-                <w:sz w:val="20"/>
-              </w:rPr>
-              <w:t>landing page</w:t>
-            </w:r>
-          </w:p>
-        </w:tc>
-        <w:tc>
-          <w:tcPr>
-            <w:tcW w:type="dxa" w:w="1040"/>
-            <w:shd w:val="clear" w:color="auto" w:fill="F2F2F2"/>
-            <w:vAlign w:val="center"/>
-          </w:tcPr>
-          <w:p>
-            <w:r/>
-            <w:r>
-              <w:rPr>
-                <w:rFonts w:ascii="Arial" w:hAnsi="Arial"/>
-                <w:sz w:val="20"/>
-              </w:rPr>
-            </w:r>
-          </w:p>
-        </w:tc>
-        <w:tc>
-          <w:tcPr>
-            <w:tcW w:type="dxa" w:w="1040"/>
-            <w:shd w:val="clear" w:color="auto" w:fill="F2F2F2"/>
-            <w:vAlign w:val="center"/>
-          </w:tcPr>
-          <w:p>
-            <w:r/>
-            <w:r>
-              <w:rPr>
-                <w:rFonts w:ascii="Arial" w:hAnsi="Arial"/>
-                <w:sz w:val="20"/>
-              </w:rPr>
-            </w:r>
-          </w:p>
-        </w:tc>
-        <w:tc>
-          <w:tcPr>
-            <w:tcW w:type="dxa" w:w="1040"/>
-            <w:shd w:val="clear" w:color="auto" w:fill="F2F2F2"/>
-            <w:vAlign w:val="center"/>
-          </w:tcPr>
-          <w:p>
-            <w:r/>
-            <w:r>
-              <w:rPr>
-                <w:rFonts w:ascii="Arial" w:hAnsi="Arial"/>
-                <w:sz w:val="20"/>
-              </w:rPr>
-            </w:r>
-          </w:p>
-        </w:tc>
-        <w:tc>
-          <w:tcPr>
-            <w:tcW w:type="dxa" w:w="1040"/>
-            <w:shd w:val="clear" w:color="auto" w:fill="F2F2F2"/>
-            <w:vAlign w:val="center"/>
-          </w:tcPr>
-          <w:p>
-            <w:r/>
-            <w:r>
-              <w:rPr>
-                <w:rFonts w:ascii="Arial" w:hAnsi="Arial"/>
-                <w:sz w:val="20"/>
-              </w:rPr>
-              <w:t>missing</w:t>
-            </w:r>
-          </w:p>
-        </w:tc>
-        <w:tc>
-          <w:tcPr>
-            <w:tcW w:type="dxa" w:w="1040"/>
-            <w:shd w:val="clear" w:color="auto" w:fill="F2F2F2"/>
-            <w:vAlign w:val="center"/>
-          </w:tcPr>
-          <w:p>
-            <w:r/>
-            <w:r>
-              <w:rPr>
-                <w:rFonts w:ascii="Arial" w:hAnsi="Arial"/>
-                <w:sz w:val="20"/>
-              </w:rPr>
-            </w:r>
-          </w:p>
-        </w:tc>
-      </w:tr>
-      <w:tr>
-        <w:tc>
-          <w:tcPr>
-            <w:tcW w:type="dxa" w:w="1040"/>
-            <w:vAlign w:val="center"/>
-          </w:tcPr>
-          <w:p>
-            <w:r/>
-            <w:r>
-              <w:rPr>
-                <w:rFonts w:ascii="Arial" w:hAnsi="Arial"/>
-                <w:sz w:val="20"/>
-              </w:rPr>
-              <w:t>rba_smp_pdf</w:t>
-            </w:r>
-          </w:p>
-        </w:tc>
-        <w:tc>
-          <w:tcPr>
-            <w:tcW w:type="dxa" w:w="1040"/>
-            <w:vAlign w:val="center"/>
-          </w:tcPr>
-          <w:p>
-            <w:r/>
-            <w:r>
-              <w:rPr>
-                <w:rFonts w:ascii="Arial" w:hAnsi="Arial"/>
-                <w:sz w:val="20"/>
-              </w:rPr>
-              <w:t>Reserve Bank of Australia</w:t>
-            </w:r>
-          </w:p>
-        </w:tc>
-        <w:tc>
-          <w:tcPr>
-            <w:tcW w:type="dxa" w:w="1040"/>
-            <w:vAlign w:val="center"/>
-          </w:tcPr>
-          <w:p>
-            <w:r/>
-            <w:r>
-              <w:rPr>
-                <w:rFonts w:ascii="Arial" w:hAnsi="Arial"/>
-                <w:sz w:val="20"/>
-              </w:rPr>
-              <w:t>https://www.rba.gov.au/publications/smp/</w:t>
-            </w:r>
-          </w:p>
-        </w:tc>
-        <w:tc>
-          <w:tcPr>
-            <w:tcW w:type="dxa" w:w="1040"/>
-            <w:vAlign w:val="center"/>
-          </w:tcPr>
-          <w:p>
-            <w:r/>
-            <w:r>
-              <w:rPr>
-                <w:rFonts w:ascii="Arial" w:hAnsi="Arial"/>
-                <w:sz w:val="20"/>
-              </w:rPr>
-              <w:t>PDF</w:t>
-            </w:r>
-          </w:p>
-        </w:tc>
-        <w:tc>
-          <w:tcPr>
-            <w:tcW w:type="dxa" w:w="1040"/>
-            <w:vAlign w:val="center"/>
-          </w:tcPr>
-          <w:p>
-            <w:r/>
-            <w:r>
-              <w:rPr>
-                <w:rFonts w:ascii="Arial" w:hAnsi="Arial"/>
-                <w:sz w:val="20"/>
-              </w:rPr>
-              <w:t>February 2026</w:t>
-            </w:r>
-          </w:p>
-        </w:tc>
-        <w:tc>
-          <w:tcPr>
-            <w:tcW w:type="dxa" w:w="1040"/>
-            <w:vAlign w:val="center"/>
-          </w:tcPr>
-          <w:p>
-            <w:r/>
-            <w:r>
-              <w:rPr>
-                <w:rFonts w:ascii="Arial" w:hAnsi="Arial"/>
-                <w:sz w:val="20"/>
-              </w:rPr>
-              <w:t>2026-04-28T08:01:42+00:00</w:t>
-            </w:r>
-          </w:p>
-        </w:tc>
-        <w:tc>
-          <w:tcPr>
-            <w:tcW w:type="dxa" w:w="1040"/>
-            <w:vAlign w:val="center"/>
-          </w:tcPr>
-          <w:p>
-            <w:r/>
-            <w:r>
-              <w:rPr>
-                <w:rFonts w:ascii="Arial" w:hAnsi="Arial"/>
-                <w:sz w:val="20"/>
-              </w:rPr>
-              <w:t>4201271</w:t>
-            </w:r>
-          </w:p>
-        </w:tc>
-        <w:tc>
-          <w:tcPr>
-            <w:tcW w:type="dxa" w:w="1040"/>
-            <w:vAlign w:val="center"/>
-          </w:tcPr>
-          <w:p>
-            <w:r/>
-            <w:r>
-              <w:rPr>
-                <w:rFonts w:ascii="Arial" w:hAnsi="Arial"/>
-                <w:sz w:val="20"/>
-              </w:rPr>
-              <w:t>auto-downloaded</w:t>
-            </w:r>
-          </w:p>
-        </w:tc>
-        <w:tc>
-          <w:tcPr>
-            <w:tcW w:type="dxa" w:w="1040"/>
-            <w:vAlign w:val="center"/>
-          </w:tcPr>
-          <w:p>
-            <w:r/>
-            <w:r>
-              <w:rPr>
-                <w:rFonts w:ascii="Arial" w:hAnsi="Arial"/>
-                <w:sz w:val="20"/>
-              </w:rPr>
-              <w:t>db42f94329b6c229844fb8da8cbc4308d707af57b3d5ba90d0aaa9bd7e21ca89</w:t>
-            </w:r>
-          </w:p>
-        </w:tc>
-      </w:tr>
-      <w:tr>
-        <w:tc>
-          <w:tcPr>
-            <w:tcW w:type="dxa" w:w="1040"/>
-            <w:shd w:val="clear" w:color="auto" w:fill="F2F2F2"/>
-            <w:vAlign w:val="center"/>
-          </w:tcPr>
-          <w:p>
-            <w:r/>
-            <w:r>
-              <w:rPr>
-                <w:rFonts w:ascii="Arial" w:hAnsi="Arial"/>
-                <w:sz w:val="20"/>
-              </w:rPr>
-              <w:t>rba_table_e2_xls</w:t>
-            </w:r>
-          </w:p>
-        </w:tc>
-        <w:tc>
-          <w:tcPr>
-            <w:tcW w:type="dxa" w:w="1040"/>
-            <w:shd w:val="clear" w:color="auto" w:fill="F2F2F2"/>
-            <w:vAlign w:val="center"/>
-          </w:tcPr>
-          <w:p>
-            <w:r/>
-            <w:r>
-              <w:rPr>
-                <w:rFonts w:ascii="Arial" w:hAnsi="Arial"/>
-                <w:sz w:val="20"/>
-              </w:rPr>
-              <w:t>Reserve Bank of Australia</w:t>
-            </w:r>
-          </w:p>
-        </w:tc>
-        <w:tc>
-          <w:tcPr>
-            <w:tcW w:type="dxa" w:w="1040"/>
-            <w:shd w:val="clear" w:color="auto" w:fill="F2F2F2"/>
-            <w:vAlign w:val="center"/>
-          </w:tcPr>
-          <w:p>
-            <w:r/>
-            <w:r>
-              <w:rPr>
-                <w:rFonts w:ascii="Arial" w:hAnsi="Arial"/>
-                <w:sz w:val="20"/>
-              </w:rPr>
-              <w:t>https://www.rba.gov.au/statistics/tables/xls/e02hist.xls</w:t>
-            </w:r>
-          </w:p>
-        </w:tc>
-        <w:tc>
-          <w:tcPr>
-            <w:tcW w:type="dxa" w:w="1040"/>
-            <w:shd w:val="clear" w:color="auto" w:fill="F2F2F2"/>
-            <w:vAlign w:val="center"/>
-          </w:tcPr>
-          <w:p>
-            <w:r/>
-            <w:r>
-              <w:rPr>
-                <w:rFonts w:ascii="Arial" w:hAnsi="Arial"/>
-                <w:sz w:val="20"/>
-              </w:rPr>
-              <w:t>XLS</w:t>
-            </w:r>
-          </w:p>
-        </w:tc>
-        <w:tc>
-          <w:tcPr>
-            <w:tcW w:type="dxa" w:w="1040"/>
-            <w:shd w:val="clear" w:color="auto" w:fill="F2F2F2"/>
-            <w:vAlign w:val="center"/>
-          </w:tcPr>
-          <w:p>
-            <w:r/>
-            <w:r>
-              <w:rPr>
-                <w:rFonts w:ascii="Arial" w:hAnsi="Arial"/>
-                <w:sz w:val="20"/>
-              </w:rPr>
-            </w:r>
-          </w:p>
-        </w:tc>
-        <w:tc>
-          <w:tcPr>
-            <w:tcW w:type="dxa" w:w="1040"/>
-            <w:shd w:val="clear" w:color="auto" w:fill="F2F2F2"/>
-            <w:vAlign w:val="center"/>
-          </w:tcPr>
-          <w:p>
-            <w:r/>
-            <w:r>
-              <w:rPr>
-                <w:rFonts w:ascii="Arial" w:hAnsi="Arial"/>
-                <w:sz w:val="20"/>
-              </w:rPr>
-            </w:r>
-          </w:p>
-        </w:tc>
-        <w:tc>
-          <w:tcPr>
-            <w:tcW w:type="dxa" w:w="1040"/>
-            <w:shd w:val="clear" w:color="auto" w:fill="F2F2F2"/>
-            <w:vAlign w:val="center"/>
-          </w:tcPr>
-          <w:p>
-            <w:r/>
-            <w:r>
-              <w:rPr>
-                <w:rFonts w:ascii="Arial" w:hAnsi="Arial"/>
-                <w:sz w:val="20"/>
-              </w:rPr>
-            </w:r>
-          </w:p>
-        </w:tc>
-        <w:tc>
-          <w:tcPr>
-            <w:tcW w:type="dxa" w:w="1040"/>
-            <w:shd w:val="clear" w:color="auto" w:fill="F2F2F2"/>
-            <w:vAlign w:val="center"/>
-          </w:tcPr>
-          <w:p>
-            <w:r/>
-            <w:r>
-              <w:rPr>
-                <w:rFonts w:ascii="Arial" w:hAnsi="Arial"/>
-                <w:sz w:val="20"/>
-              </w:rPr>
-              <w:t>missing</w:t>
-            </w:r>
-          </w:p>
-        </w:tc>
-        <w:tc>
-          <w:tcPr>
-            <w:tcW w:type="dxa" w:w="1040"/>
-            <w:shd w:val="clear" w:color="auto" w:fill="F2F2F2"/>
-            <w:vAlign w:val="center"/>
-          </w:tcPr>
-          <w:p>
-            <w:r/>
-            <w:r>
-              <w:rPr>
-                <w:rFonts w:ascii="Arial" w:hAnsi="Arial"/>
-                <w:sz w:val="20"/>
-              </w:rPr>
-            </w:r>
-          </w:p>
-        </w:tc>
-      </w:tr>
-      <w:tr>
-        <w:tc>
-          <w:tcPr>
-            <w:tcW w:type="dxa" w:w="1040"/>
-            <w:vAlign w:val="center"/>
-          </w:tcPr>
-          <w:p>
-            <w:r/>
-            <w:r>
-              <w:rPr>
-                <w:rFonts w:ascii="Arial" w:hAnsi="Arial"/>
-                <w:sz w:val="20"/>
-              </w:rPr>
-              <w:t>sqm_headline_page</w:t>
-            </w:r>
-          </w:p>
-        </w:tc>
-        <w:tc>
-          <w:tcPr>
-            <w:tcW w:type="dxa" w:w="1040"/>
-            <w:vAlign w:val="center"/>
-          </w:tcPr>
-          <w:p>
-            <w:r/>
-            <w:r>
-              <w:rPr>
-                <w:rFonts w:ascii="Arial" w:hAnsi="Arial"/>
-                <w:sz w:val="20"/>
-              </w:rPr>
-              <w:t>SQM Research</w:t>
-            </w:r>
-          </w:p>
-        </w:tc>
-        <w:tc>
-          <w:tcPr>
-            <w:tcW w:type="dxa" w:w="1040"/>
-            <w:vAlign w:val="center"/>
-          </w:tcPr>
-          <w:p>
-            <w:r/>
-            <w:r>
-              <w:rPr>
-                <w:rFonts w:ascii="Arial" w:hAnsi="Arial"/>
-                <w:sz w:val="20"/>
-              </w:rPr>
-              <w:t>https://sqmresearch.com.au/</w:t>
-            </w:r>
-          </w:p>
-        </w:tc>
-        <w:tc>
-          <w:tcPr>
-            <w:tcW w:type="dxa" w:w="1040"/>
-            <w:vAlign w:val="center"/>
-          </w:tcPr>
-          <w:p>
-            <w:r/>
-            <w:r>
-              <w:rPr>
-                <w:rFonts w:ascii="Arial" w:hAnsi="Arial"/>
-                <w:sz w:val="20"/>
-              </w:rPr>
-              <w:t>AU</w:t>
-            </w:r>
-          </w:p>
-        </w:tc>
-        <w:tc>
-          <w:tcPr>
-            <w:tcW w:type="dxa" w:w="1040"/>
-            <w:vAlign w:val="center"/>
-          </w:tcPr>
-          <w:p>
-            <w:r/>
-            <w:r>
-              <w:rPr>
-                <w:rFonts w:ascii="Arial" w:hAnsi="Arial"/>
-                <w:sz w:val="20"/>
-              </w:rPr>
-            </w:r>
-          </w:p>
-        </w:tc>
-        <w:tc>
-          <w:tcPr>
-            <w:tcW w:type="dxa" w:w="1040"/>
-            <w:vAlign w:val="center"/>
-          </w:tcPr>
-          <w:p>
-            <w:r/>
-            <w:r>
-              <w:rPr>
-                <w:rFonts w:ascii="Arial" w:hAnsi="Arial"/>
-                <w:sz w:val="20"/>
-              </w:rPr>
-            </w:r>
-          </w:p>
-        </w:tc>
-        <w:tc>
-          <w:tcPr>
-            <w:tcW w:type="dxa" w:w="1040"/>
-            <w:vAlign w:val="center"/>
-          </w:tcPr>
-          <w:p>
-            <w:r/>
-            <w:r>
-              <w:rPr>
-                <w:rFonts w:ascii="Arial" w:hAnsi="Arial"/>
-                <w:sz w:val="20"/>
-              </w:rPr>
-            </w:r>
-          </w:p>
-        </w:tc>
-        <w:tc>
-          <w:tcPr>
-            <w:tcW w:type="dxa" w:w="1040"/>
-            <w:vAlign w:val="center"/>
-          </w:tcPr>
-          <w:p>
-            <w:r/>
-            <w:r>
-              <w:rPr>
-                <w:rFonts w:ascii="Arial" w:hAnsi="Arial"/>
-                <w:sz w:val="20"/>
-              </w:rPr>
-              <w:t>manually staged</w:t>
-            </w:r>
-          </w:p>
-        </w:tc>
-        <w:tc>
-          <w:tcPr>
-            <w:tcW w:type="dxa" w:w="1040"/>
-            <w:vAlign w:val="center"/>
-          </w:tcPr>
-          <w:p>
-            <w:r/>
-            <w:r>
-              <w:rPr>
-                <w:rFonts w:ascii="Arial" w:hAnsi="Arial"/>
-                <w:sz w:val="20"/>
-              </w:rPr>
-            </w:r>
-          </w:p>
-        </w:tc>
-      </w:tr>
-      <w:tr>
-        <w:tc>
-          <w:tcPr>
-            <w:tcW w:type="dxa" w:w="1040"/>
-            <w:shd w:val="clear" w:color="auto" w:fill="F2F2F2"/>
-            <w:vAlign w:val="center"/>
-          </w:tcPr>
-          <w:p>
-            <w:r/>
-            <w:r>
-              <w:rPr>
-                <w:rFonts w:ascii="Arial" w:hAnsi="Arial"/>
-                <w:sz w:val="20"/>
-              </w:rPr>
-              <w:t>total_value_dwellings_xlsx</w:t>
-            </w:r>
-          </w:p>
-        </w:tc>
-        <w:tc>
-          <w:tcPr>
-            <w:tcW w:type="dxa" w:w="1040"/>
-            <w:shd w:val="clear" w:color="auto" w:fill="F2F2F2"/>
-            <w:vAlign w:val="center"/>
-          </w:tcPr>
-          <w:p>
-            <w:r/>
-            <w:r>
-              <w:rPr>
-                <w:rFonts w:ascii="Arial" w:hAnsi="Arial"/>
-                <w:sz w:val="20"/>
-              </w:rPr>
-              <w:t>Australian Bureau of Statistics</w:t>
-            </w:r>
-          </w:p>
-        </w:tc>
-        <w:tc>
-          <w:tcPr>
-            <w:tcW w:type="dxa" w:w="1040"/>
-            <w:shd w:val="clear" w:color="auto" w:fill="F2F2F2"/>
-            <w:vAlign w:val="center"/>
-          </w:tcPr>
-          <w:p>
-            <w:r/>
-            <w:r>
-              <w:rPr>
-                <w:rFonts w:ascii="Arial" w:hAnsi="Arial"/>
-                <w:sz w:val="20"/>
-              </w:rPr>
-              <w:t>https://www.abs.gov.au/statistics/economy/finance/total-value-dwellings/dec-2025/643201.xlsx</w:t>
-            </w:r>
-          </w:p>
-        </w:tc>
-        <w:tc>
-          <w:tcPr>
-            <w:tcW w:type="dxa" w:w="1040"/>
-            <w:shd w:val="clear" w:color="auto" w:fill="F2F2F2"/>
-            <w:vAlign w:val="center"/>
-          </w:tcPr>
-          <w:p>
-            <w:r/>
-            <w:r>
-              <w:rPr>
-                <w:rFonts w:ascii="Arial" w:hAnsi="Arial"/>
-                <w:sz w:val="20"/>
-              </w:rPr>
-              <w:t>XLSX</w:t>
-            </w:r>
-          </w:p>
-        </w:tc>
-        <w:tc>
-          <w:tcPr>
-            <w:tcW w:type="dxa" w:w="1040"/>
-            <w:shd w:val="clear" w:color="auto" w:fill="F2F2F2"/>
-            <w:vAlign w:val="center"/>
-          </w:tcPr>
-          <w:p>
-            <w:r/>
-            <w:r>
-              <w:rPr>
-                <w:rFonts w:ascii="Arial" w:hAnsi="Arial"/>
-                <w:sz w:val="20"/>
-              </w:rPr>
-            </w:r>
-          </w:p>
-        </w:tc>
-        <w:tc>
-          <w:tcPr>
-            <w:tcW w:type="dxa" w:w="1040"/>
-            <w:shd w:val="clear" w:color="auto" w:fill="F2F2F2"/>
-            <w:vAlign w:val="center"/>
-          </w:tcPr>
-          <w:p>
-            <w:r/>
-            <w:r>
-              <w:rPr>
-                <w:rFonts w:ascii="Arial" w:hAnsi="Arial"/>
-                <w:sz w:val="20"/>
-              </w:rPr>
-            </w:r>
-          </w:p>
-        </w:tc>
-        <w:tc>
-          <w:tcPr>
-            <w:tcW w:type="dxa" w:w="1040"/>
-            <w:shd w:val="clear" w:color="auto" w:fill="F2F2F2"/>
-            <w:vAlign w:val="center"/>
-          </w:tcPr>
-          <w:p>
-            <w:r/>
-            <w:r>
-              <w:rPr>
-                <w:rFonts w:ascii="Arial" w:hAnsi="Arial"/>
-                <w:sz w:val="20"/>
-              </w:rPr>
-            </w:r>
-          </w:p>
-        </w:tc>
-        <w:tc>
-          <w:tcPr>
-            <w:tcW w:type="dxa" w:w="1040"/>
-            <w:shd w:val="clear" w:color="auto" w:fill="F2F2F2"/>
-            <w:vAlign w:val="center"/>
-          </w:tcPr>
-          <w:p>
-            <w:r/>
-            <w:r>
-              <w:rPr>
-                <w:rFonts w:ascii="Arial" w:hAnsi="Arial"/>
-                <w:sz w:val="20"/>
-              </w:rPr>
-              <w:t>missing</w:t>
-            </w:r>
-          </w:p>
-        </w:tc>
-        <w:tc>
-          <w:tcPr>
-            <w:tcW w:type="dxa" w:w="1040"/>
-            <w:shd w:val="clear" w:color="auto" w:fill="F2F2F2"/>
-            <w:vAlign w:val="center"/>
-          </w:tcPr>
-          <w:p>
-            <w:r/>
-            <w:r>
-              <w:rPr>
-                <w:rFonts w:ascii="Arial" w:hAnsi="Arial"/>
-                <w:sz w:val="20"/>
-              </w:rPr>
-            </w:r>
-          </w:p>
-        </w:tc>
-      </w:tr>
-      <w:tr>
-        <w:tc>
-          <w:tcPr>
-            <w:tcW w:type="dxa" w:w="1040"/>
-            <w:vAlign w:val="center"/>
-          </w:tcPr>
-          <w:p>
-            <w:r/>
-            <w:r>
-              <w:rPr>
-                <w:rFonts w:ascii="Arial" w:hAnsi="Arial"/>
-                <w:sz w:val="20"/>
-              </w:rPr>
-              <w:t>vic_rental_report_page</w:t>
-            </w:r>
-          </w:p>
-        </w:tc>
-        <w:tc>
-          <w:tcPr>
-            <w:tcW w:type="dxa" w:w="1040"/>
-            <w:vAlign w:val="center"/>
-          </w:tcPr>
-          <w:p>
-            <w:r/>
-            <w:r>
-              <w:rPr>
-                <w:rFonts w:ascii="Arial" w:hAnsi="Arial"/>
-                <w:sz w:val="20"/>
-              </w:rPr>
-              <w:t>State rental bond authorities</w:t>
-            </w:r>
-          </w:p>
-        </w:tc>
-        <w:tc>
-          <w:tcPr>
-            <w:tcW w:type="dxa" w:w="1040"/>
-            <w:vAlign w:val="center"/>
-          </w:tcPr>
-          <w:p>
-            <w:r/>
-            <w:r>
-              <w:rPr>
-                <w:rFonts w:ascii="Arial" w:hAnsi="Arial"/>
-                <w:sz w:val="20"/>
-              </w:rPr>
-              <w:t>https://www.dffh.vic.gov.au/publications/rental-report</w:t>
-            </w:r>
-          </w:p>
-        </w:tc>
-        <w:tc>
-          <w:tcPr>
-            <w:tcW w:type="dxa" w:w="1040"/>
-            <w:vAlign w:val="center"/>
-          </w:tcPr>
-          <w:p>
-            <w:r/>
-            <w:r>
-              <w:rPr>
-                <w:rFonts w:ascii="Arial" w:hAnsi="Arial"/>
-                <w:sz w:val="20"/>
-              </w:rPr>
-              <w:t>landing page</w:t>
-            </w:r>
-          </w:p>
-        </w:tc>
-        <w:tc>
-          <w:tcPr>
-            <w:tcW w:type="dxa" w:w="1040"/>
-            <w:vAlign w:val="center"/>
-          </w:tcPr>
-          <w:p>
-            <w:r/>
-            <w:r>
-              <w:rPr>
-                <w:rFonts w:ascii="Arial" w:hAnsi="Arial"/>
-                <w:sz w:val="20"/>
-              </w:rPr>
-            </w:r>
-          </w:p>
-        </w:tc>
-        <w:tc>
-          <w:tcPr>
-            <w:tcW w:type="dxa" w:w="1040"/>
-            <w:vAlign w:val="center"/>
-          </w:tcPr>
-          <w:p>
-            <w:r/>
-            <w:r>
-              <w:rPr>
-                <w:rFonts w:ascii="Arial" w:hAnsi="Arial"/>
-                <w:sz w:val="20"/>
-              </w:rPr>
-            </w:r>
-          </w:p>
-        </w:tc>
-        <w:tc>
-          <w:tcPr>
-            <w:tcW w:type="dxa" w:w="1040"/>
-            <w:vAlign w:val="center"/>
-          </w:tcPr>
-          <w:p>
-            <w:r/>
-            <w:r>
-              <w:rPr>
-                <w:rFonts w:ascii="Arial" w:hAnsi="Arial"/>
-                <w:sz w:val="20"/>
-              </w:rPr>
-            </w:r>
-          </w:p>
-        </w:tc>
-        <w:tc>
-          <w:tcPr>
-            <w:tcW w:type="dxa" w:w="1040"/>
-            <w:vAlign w:val="center"/>
-          </w:tcPr>
-          <w:p>
-            <w:r/>
-            <w:r>
-              <w:rPr>
-                <w:rFonts w:ascii="Arial" w:hAnsi="Arial"/>
-                <w:sz w:val="20"/>
-              </w:rPr>
-              <w:t>manually staged</w:t>
-            </w:r>
-          </w:p>
-        </w:tc>
-        <w:tc>
-          <w:tcPr>
-            <w:tcW w:type="dxa" w:w="1040"/>
             <w:vAlign w:val="center"/>
           </w:tcPr>
           <w:p>
@@ -10595,7 +9574,7 @@
                 <w:rFonts w:ascii="Arial" w:hAnsi="Arial"/>
                 <w:sz w:val="20"/>
               </w:rPr>
-              <w:t>2026-06-11T21:49:06</w:t>
+              <w:t>2026-06-12T09:37:59</w:t>
             </w:r>
           </w:p>
         </w:tc>
@@ -10698,7 +9677,7 @@
                 <w:rFonts w:ascii="Arial" w:hAnsi="Arial"/>
                 <w:sz w:val="20"/>
               </w:rPr>
-              <w:t>2026-06-11T21:49:06</w:t>
+              <w:t>2026-06-12T09:37:59</w:t>
             </w:r>
           </w:p>
         </w:tc>
@@ -10797,7 +9776,7 @@
                 <w:rFonts w:ascii="Arial" w:hAnsi="Arial"/>
                 <w:sz w:val="20"/>
               </w:rPr>
-              <w:t>2026-06-11T21:49:06</w:t>
+              <w:t>2026-06-12T09:37:59</w:t>
             </w:r>
           </w:p>
         </w:tc>
@@ -10900,7 +9879,7 @@
                 <w:rFonts w:ascii="Arial" w:hAnsi="Arial"/>
                 <w:sz w:val="20"/>
               </w:rPr>
-              <w:t>2026-06-11T21:49:06</w:t>
+              <w:t>2026-06-12T09:37:59</w:t>
             </w:r>
           </w:p>
         </w:tc>
@@ -10999,7 +9978,7 @@
                 <w:rFonts w:ascii="Arial" w:hAnsi="Arial"/>
                 <w:sz w:val="20"/>
               </w:rPr>
-              <w:t>2026-06-11T21:49:06</w:t>
+              <w:t>2026-06-12T09:37:59</w:t>
             </w:r>
           </w:p>
         </w:tc>
@@ -11102,7 +10081,7 @@
                 <w:rFonts w:ascii="Arial" w:hAnsi="Arial"/>
                 <w:sz w:val="20"/>
               </w:rPr>
-              <w:t>2026-06-11T21:49:06</w:t>
+              <w:t>2026-06-12T09:37:59</w:t>
             </w:r>
           </w:p>
         </w:tc>
@@ -11201,7 +10180,7 @@
                 <w:rFonts w:ascii="Arial" w:hAnsi="Arial"/>
                 <w:sz w:val="20"/>
               </w:rPr>
-              <w:t>2026-06-11T21:49:06</w:t>
+              <w:t>2026-06-12T09:37:59</w:t>
             </w:r>
           </w:p>
         </w:tc>
@@ -11304,7 +10283,7 @@
                 <w:rFonts w:ascii="Arial" w:hAnsi="Arial"/>
                 <w:sz w:val="20"/>
               </w:rPr>
-              <w:t>2026-06-11T21:49:06</w:t>
+              <w:t>2026-06-12T09:37:59</w:t>
             </w:r>
           </w:p>
         </w:tc>
@@ -12083,7 +11062,7 @@
                 <w:rFonts w:ascii="Arial" w:hAnsi="Arial"/>
                 <w:sz w:val="20"/>
               </w:rPr>
-              <w:t>2026-06-11</w:t>
+              <w:t>2026-06-12</w:t>
             </w:r>
           </w:p>
         </w:tc>
@@ -12246,7 +11225,7 @@
                 <w:rFonts w:ascii="Arial" w:hAnsi="Arial"/>
                 <w:sz w:val="20"/>
               </w:rPr>
-              <w:t>2026-06-11</w:t>
+              <w:t>2026-06-12</w:t>
             </w:r>
           </w:p>
         </w:tc>
@@ -12417,7 +11396,7 @@
                 <w:rFonts w:ascii="Arial" w:hAnsi="Arial"/>
                 <w:sz w:val="20"/>
               </w:rPr>
-              <w:t>2026-06-11</w:t>
+              <w:t>2026-06-12</w:t>
             </w:r>
           </w:p>
         </w:tc>
@@ -12580,7 +11559,7 @@
                 <w:rFonts w:ascii="Arial" w:hAnsi="Arial"/>
                 <w:sz w:val="20"/>
               </w:rPr>
-              <w:t>2026-06-11</w:t>
+              <w:t>2026-06-12</w:t>
             </w:r>
           </w:p>
         </w:tc>
@@ -12751,7 +11730,7 @@
                 <w:rFonts w:ascii="Arial" w:hAnsi="Arial"/>
                 <w:sz w:val="20"/>
               </w:rPr>
-              <w:t>2026-06-11</w:t>
+              <w:t>2026-06-12</w:t>
             </w:r>
           </w:p>
         </w:tc>
@@ -12914,7 +11893,7 @@
                 <w:rFonts w:ascii="Arial" w:hAnsi="Arial"/>
                 <w:sz w:val="20"/>
               </w:rPr>
-              <w:t>2026-06-11</w:t>
+              <w:t>2026-06-12</w:t>
             </w:r>
           </w:p>
         </w:tc>
@@ -13085,7 +12064,7 @@
                 <w:rFonts w:ascii="Arial" w:hAnsi="Arial"/>
                 <w:sz w:val="20"/>
               </w:rPr>
-              <w:t>2026-06-11</w:t>
+              <w:t>2026-06-12</w:t>
             </w:r>
           </w:p>
         </w:tc>
@@ -13248,7 +12227,7 @@
                 <w:rFonts w:ascii="Arial" w:hAnsi="Arial"/>
                 <w:sz w:val="20"/>
               </w:rPr>
-              <w:t>2026-06-11</w:t>
+              <w:t>2026-06-12</w:t>
             </w:r>
           </w:p>
         </w:tc>
@@ -13419,7 +12398,7 @@
                 <w:rFonts w:ascii="Arial" w:hAnsi="Arial"/>
                 <w:sz w:val="20"/>
               </w:rPr>
-              <w:t>2026-06-11</w:t>
+              <w:t>2026-06-12</w:t>
             </w:r>
           </w:p>
         </w:tc>
@@ -13582,7 +12561,7 @@
                 <w:rFonts w:ascii="Arial" w:hAnsi="Arial"/>
                 <w:sz w:val="20"/>
               </w:rPr>
-              <w:t>2026-06-11</w:t>
+              <w:t>2026-06-12</w:t>
             </w:r>
           </w:p>
         </w:tc>
@@ -13753,7 +12732,7 @@
                 <w:rFonts w:ascii="Arial" w:hAnsi="Arial"/>
                 <w:sz w:val="20"/>
               </w:rPr>
-              <w:t>2026-06-11</w:t>
+              <w:t>2026-06-12</w:t>
             </w:r>
           </w:p>
         </w:tc>
@@ -13916,7 +12895,7 @@
                 <w:rFonts w:ascii="Arial" w:hAnsi="Arial"/>
                 <w:sz w:val="20"/>
               </w:rPr>
-              <w:t>2026-06-11</w:t>
+              <w:t>2026-06-12</w:t>
             </w:r>
           </w:p>
         </w:tc>
@@ -14087,7 +13066,7 @@
                 <w:rFonts w:ascii="Arial" w:hAnsi="Arial"/>
                 <w:sz w:val="20"/>
               </w:rPr>
-              <w:t>2026-06-11</w:t>
+              <w:t>2026-06-12</w:t>
             </w:r>
           </w:p>
         </w:tc>
@@ -14250,7 +13229,7 @@
                 <w:rFonts w:ascii="Arial" w:hAnsi="Arial"/>
                 <w:sz w:val="20"/>
               </w:rPr>
-              <w:t>2026-06-11</w:t>
+              <w:t>2026-06-12</w:t>
             </w:r>
           </w:p>
         </w:tc>
@@ -14421,7 +13400,7 @@
                 <w:rFonts w:ascii="Arial" w:hAnsi="Arial"/>
                 <w:sz w:val="20"/>
               </w:rPr>
-              <w:t>2026-06-11</w:t>
+              <w:t>2026-06-12</w:t>
             </w:r>
           </w:p>
         </w:tc>
@@ -14584,7 +13563,7 @@
                 <w:rFonts w:ascii="Arial" w:hAnsi="Arial"/>
                 <w:sz w:val="20"/>
               </w:rPr>
-              <w:t>2026-06-11</w:t>
+              <w:t>2026-06-12</w:t>
             </w:r>
           </w:p>
         </w:tc>
@@ -14755,7 +13734,7 @@
                 <w:rFonts w:ascii="Arial" w:hAnsi="Arial"/>
                 <w:sz w:val="20"/>
               </w:rPr>
-              <w:t>2026-06-11</w:t>
+              <w:t>2026-06-12</w:t>
             </w:r>
           </w:p>
         </w:tc>
@@ -14918,7 +13897,7 @@
                 <w:rFonts w:ascii="Arial" w:hAnsi="Arial"/>
                 <w:sz w:val="20"/>
               </w:rPr>
-              <w:t>2026-06-11</w:t>
+              <w:t>2026-06-12</w:t>
             </w:r>
           </w:p>
         </w:tc>
@@ -15313,7 +14292,7 @@
                 <w:rFonts w:ascii="Arial" w:hAnsi="Arial"/>
                 <w:sz w:val="20"/>
               </w:rPr>
-              <w:t>2026-06-11</w:t>
+              <w:t>2026-06-12</w:t>
             </w:r>
           </w:p>
         </w:tc>
@@ -15476,7 +14455,7 @@
                 <w:rFonts w:ascii="Arial" w:hAnsi="Arial"/>
                 <w:sz w:val="20"/>
               </w:rPr>
-              <w:t>2026-06-11</w:t>
+              <w:t>2026-06-12</w:t>
             </w:r>
           </w:p>
         </w:tc>
@@ -15647,7 +14626,7 @@
                 <w:rFonts w:ascii="Arial" w:hAnsi="Arial"/>
                 <w:sz w:val="20"/>
               </w:rPr>
-              <w:t>2026-06-11</w:t>
+              <w:t>2026-06-12</w:t>
             </w:r>
           </w:p>
         </w:tc>
@@ -15810,7 +14789,7 @@
                 <w:rFonts w:ascii="Arial" w:hAnsi="Arial"/>
                 <w:sz w:val="20"/>
               </w:rPr>
-              <w:t>2026-06-11</w:t>
+              <w:t>2026-06-12</w:t>
             </w:r>
           </w:p>
         </w:tc>
@@ -15981,7 +14960,7 @@
                 <w:rFonts w:ascii="Arial" w:hAnsi="Arial"/>
                 <w:sz w:val="20"/>
               </w:rPr>
-              <w:t>2026-06-11</w:t>
+              <w:t>2026-06-12</w:t>
             </w:r>
           </w:p>
         </w:tc>
@@ -17243,7 +16222,7 @@
                 <w:rFonts w:ascii="Arial" w:hAnsi="Arial"/>
                 <w:sz w:val="20"/>
               </w:rPr>
-              <w:t>2026-06-11</w:t>
+              <w:t>2026-06-12</w:t>
             </w:r>
           </w:p>
         </w:tc>
@@ -17405,7 +16384,7 @@
                 <w:rFonts w:ascii="Arial" w:hAnsi="Arial"/>
                 <w:sz w:val="20"/>
               </w:rPr>
-              <w:t>2026-06-11</w:t>
+              <w:t>2026-06-12</w:t>
             </w:r>
           </w:p>
         </w:tc>
@@ -17576,7 +16555,7 @@
                 <w:rFonts w:ascii="Arial" w:hAnsi="Arial"/>
                 <w:sz w:val="20"/>
               </w:rPr>
-              <w:t>2026-06-11</w:t>
+              <w:t>2026-06-12</w:t>
             </w:r>
           </w:p>
         </w:tc>
@@ -17739,7 +16718,7 @@
                 <w:rFonts w:ascii="Arial" w:hAnsi="Arial"/>
                 <w:sz w:val="20"/>
               </w:rPr>
-              <w:t>2026-06-11</w:t>
+              <w:t>2026-06-12</w:t>
             </w:r>
           </w:p>
         </w:tc>
@@ -17910,7 +16889,7 @@
                 <w:rFonts w:ascii="Arial" w:hAnsi="Arial"/>
                 <w:sz w:val="20"/>
               </w:rPr>
-              <w:t>2026-06-11</w:t>
+              <w:t>2026-06-12</w:t>
             </w:r>
           </w:p>
         </w:tc>
@@ -18073,7 +17052,7 @@
                 <w:rFonts w:ascii="Arial" w:hAnsi="Arial"/>
                 <w:sz w:val="20"/>
               </w:rPr>
-              <w:t>2026-06-11</w:t>
+              <w:t>2026-06-12</w:t>
             </w:r>
           </w:p>
         </w:tc>
@@ -18244,7 +17223,7 @@
                 <w:rFonts w:ascii="Arial" w:hAnsi="Arial"/>
                 <w:sz w:val="20"/>
               </w:rPr>
-              <w:t>2026-06-11</w:t>
+              <w:t>2026-06-12</w:t>
             </w:r>
           </w:p>
         </w:tc>
@@ -18407,7 +17386,7 @@
                 <w:rFonts w:ascii="Arial" w:hAnsi="Arial"/>
                 <w:sz w:val="20"/>
               </w:rPr>
-              <w:t>2026-06-11</w:t>
+              <w:t>2026-06-12</w:t>
             </w:r>
           </w:p>
         </w:tc>
@@ -18578,7 +17557,7 @@
                 <w:rFonts w:ascii="Arial" w:hAnsi="Arial"/>
                 <w:sz w:val="20"/>
               </w:rPr>
-              <w:t>2026-06-11</w:t>
+              <w:t>2026-06-12</w:t>
             </w:r>
           </w:p>
         </w:tc>
@@ -18741,7 +17720,7 @@
                 <w:rFonts w:ascii="Arial" w:hAnsi="Arial"/>
                 <w:sz w:val="20"/>
               </w:rPr>
-              <w:t>2026-06-11</w:t>
+              <w:t>2026-06-12</w:t>
             </w:r>
           </w:p>
         </w:tc>
@@ -18912,7 +17891,7 @@
                 <w:rFonts w:ascii="Arial" w:hAnsi="Arial"/>
                 <w:sz w:val="20"/>
               </w:rPr>
-              <w:t>2026-06-11</w:t>
+              <w:t>2026-06-12</w:t>
             </w:r>
           </w:p>
         </w:tc>
@@ -19075,7 +18054,7 @@
                 <w:rFonts w:ascii="Arial" w:hAnsi="Arial"/>
                 <w:sz w:val="20"/>
               </w:rPr>
-              <w:t>2026-06-11</w:t>
+              <w:t>2026-06-12</w:t>
             </w:r>
           </w:p>
         </w:tc>
@@ -19246,7 +18225,7 @@
                 <w:rFonts w:ascii="Arial" w:hAnsi="Arial"/>
                 <w:sz w:val="20"/>
               </w:rPr>
-              <w:t>2026-06-11</w:t>
+              <w:t>2026-06-12</w:t>
             </w:r>
           </w:p>
         </w:tc>
@@ -19409,7 +18388,7 @@
                 <w:rFonts w:ascii="Arial" w:hAnsi="Arial"/>
                 <w:sz w:val="20"/>
               </w:rPr>
-              <w:t>2026-06-11</w:t>
+              <w:t>2026-06-12</w:t>
             </w:r>
           </w:p>
         </w:tc>
@@ -19579,7 +18558,7 @@
                 <w:rFonts w:ascii="Arial" w:hAnsi="Arial"/>
                 <w:sz w:val="20"/>
               </w:rPr>
-              <w:t>2026-06-11</w:t>
+              <w:t>2026-06-12</w:t>
             </w:r>
           </w:p>
         </w:tc>
@@ -19741,7 +18720,7 @@
                 <w:rFonts w:ascii="Arial" w:hAnsi="Arial"/>
                 <w:sz w:val="20"/>
               </w:rPr>
-              <w:t>2026-06-11</w:t>
+              <w:t>2026-06-12</w:t>
             </w:r>
           </w:p>
         </w:tc>
@@ -19911,7 +18890,7 @@
                 <w:rFonts w:ascii="Arial" w:hAnsi="Arial"/>
                 <w:sz w:val="20"/>
               </w:rPr>
-              <w:t>2026-06-11</w:t>
+              <w:t>2026-06-12</w:t>
             </w:r>
           </w:p>
         </w:tc>
@@ -20074,7 +19053,7 @@
                 <w:rFonts w:ascii="Arial" w:hAnsi="Arial"/>
                 <w:sz w:val="20"/>
               </w:rPr>
-              <w:t>2026-06-11</w:t>
+              <w:t>2026-06-12</w:t>
             </w:r>
           </w:p>
         </w:tc>
@@ -25755,7 +24734,7 @@
                 <w:rFonts w:ascii="Arial" w:hAnsi="Arial"/>
                 <w:sz w:val="20"/>
               </w:rPr>
-              <w:t>2026-06-11</w:t>
+              <w:t>2026-06-12</w:t>
             </w:r>
           </w:p>
         </w:tc>
@@ -25918,7 +24897,7 @@
                 <w:rFonts w:ascii="Arial" w:hAnsi="Arial"/>
                 <w:sz w:val="20"/>
               </w:rPr>
-              <w:t>2026-06-11</w:t>
+              <w:t>2026-06-12</w:t>
             </w:r>
           </w:p>
         </w:tc>
@@ -26089,7 +25068,7 @@
                 <w:rFonts w:ascii="Arial" w:hAnsi="Arial"/>
                 <w:sz w:val="20"/>
               </w:rPr>
-              <w:t>2026-06-11</w:t>
+              <w:t>2026-06-12</w:t>
             </w:r>
           </w:p>
         </w:tc>
@@ -26252,7 +25231,7 @@
                 <w:rFonts w:ascii="Arial" w:hAnsi="Arial"/>
                 <w:sz w:val="20"/>
               </w:rPr>
-              <w:t>2026-06-11</w:t>
+              <w:t>2026-06-12</w:t>
             </w:r>
           </w:p>
         </w:tc>
@@ -26423,7 +25402,7 @@
                 <w:rFonts w:ascii="Arial" w:hAnsi="Arial"/>
                 <w:sz w:val="20"/>
               </w:rPr>
-              <w:t>2026-06-11</w:t>
+              <w:t>2026-06-12</w:t>
             </w:r>
           </w:p>
         </w:tc>
@@ -26586,7 +25565,7 @@
                 <w:rFonts w:ascii="Arial" w:hAnsi="Arial"/>
                 <w:sz w:val="20"/>
               </w:rPr>
-              <w:t>2026-06-11</w:t>
+              <w:t>2026-06-12</w:t>
             </w:r>
           </w:p>
         </w:tc>
@@ -26757,7 +25736,7 @@
                 <w:rFonts w:ascii="Arial" w:hAnsi="Arial"/>
                 <w:sz w:val="20"/>
               </w:rPr>
-              <w:t>2026-06-11</w:t>
+              <w:t>2026-06-12</w:t>
             </w:r>
           </w:p>
         </w:tc>
@@ -26920,7 +25899,7 @@
                 <w:rFonts w:ascii="Arial" w:hAnsi="Arial"/>
                 <w:sz w:val="20"/>
               </w:rPr>
-              <w:t>2026-06-11</w:t>
+              <w:t>2026-06-12</w:t>
             </w:r>
           </w:p>
         </w:tc>
@@ -27091,7 +26070,7 @@
                 <w:rFonts w:ascii="Arial" w:hAnsi="Arial"/>
                 <w:sz w:val="20"/>
               </w:rPr>
-              <w:t>2026-06-11</w:t>
+              <w:t>2026-06-12</w:t>
             </w:r>
           </w:p>
         </w:tc>
@@ -27254,7 +26233,7 @@
                 <w:rFonts w:ascii="Arial" w:hAnsi="Arial"/>
                 <w:sz w:val="20"/>
               </w:rPr>
-              <w:t>2026-06-11</w:t>
+              <w:t>2026-06-12</w:t>
             </w:r>
           </w:p>
         </w:tc>
@@ -27425,7 +26404,7 @@
                 <w:rFonts w:ascii="Arial" w:hAnsi="Arial"/>
                 <w:sz w:val="20"/>
               </w:rPr>
-              <w:t>2026-06-11</w:t>
+              <w:t>2026-06-12</w:t>
             </w:r>
           </w:p>
         </w:tc>
@@ -29235,7 +28214,7 @@
                 <w:rFonts w:ascii="Arial" w:hAnsi="Arial"/>
                 <w:sz w:val="20"/>
               </w:rPr>
-              <w:t>cotality_auction_clearance_page</w:t>
+              <w:t>cpi_all_groups_xlsx</w:t>
             </w:r>
           </w:p>
         </w:tc>
@@ -29251,7 +28230,7 @@
                 <w:rFonts w:ascii="Arial" w:hAnsi="Arial"/>
                 <w:sz w:val="20"/>
               </w:rPr>
-              <w:t>Paid, gated, or manually extracted source</w:t>
+              <w:t>No successful manifest entry for this registry item</w:t>
             </w:r>
           </w:p>
         </w:tc>
@@ -29267,7 +28246,7 @@
                 <w:rFonts w:ascii="Arial" w:hAnsi="Arial"/>
                 <w:sz w:val="20"/>
               </w:rPr>
-              <w:t>Manual staging required - see data/raw/manual or source-specific raw-public directory</w:t>
+              <w:t>Awaiting next release or implement downloader/scraper</w:t>
             </w:r>
           </w:p>
         </w:tc>
@@ -29302,7 +28281,7 @@
                 <w:rFonts w:ascii="Arial" w:hAnsi="Arial"/>
                 <w:sz w:val="20"/>
               </w:rPr>
-              <w:t>cotality_hvi_page</w:t>
+              <w:t>cpi_subgroups_xlsx</w:t>
             </w:r>
           </w:p>
         </w:tc>
@@ -29319,7 +28298,7 @@
                 <w:rFonts w:ascii="Arial" w:hAnsi="Arial"/>
                 <w:sz w:val="20"/>
               </w:rPr>
-              <w:t>Paid, gated, or manually extracted source</w:t>
+              <w:t>No successful manifest entry for this registry item</w:t>
             </w:r>
           </w:p>
         </w:tc>
@@ -29336,7 +28315,7 @@
                 <w:rFonts w:ascii="Arial" w:hAnsi="Arial"/>
                 <w:sz w:val="20"/>
               </w:rPr>
-              <w:t>Manual staging required - see data/raw/manual or source-specific raw-public directory</w:t>
+              <w:t>Awaiting next release or implement downloader/scraper</w:t>
             </w:r>
           </w:p>
         </w:tc>
@@ -29371,7 +28350,7 @@
                 <w:rFonts w:ascii="Arial" w:hAnsi="Arial"/>
                 <w:sz w:val="20"/>
               </w:rPr>
-              <w:t>cpi_all_groups_xlsx</w:t>
+              <w:t>dwelling_approvals_xlsx</w:t>
             </w:r>
           </w:p>
         </w:tc>
@@ -29438,7 +28417,7 @@
                 <w:rFonts w:ascii="Arial" w:hAnsi="Arial"/>
                 <w:sz w:val="20"/>
               </w:rPr>
-              <w:t>cpi_subgroups_xlsx</w:t>
+              <w:t>dwelling_value_xlsx</w:t>
             </w:r>
           </w:p>
         </w:tc>
@@ -29507,7 +28486,7 @@
                 <w:rFonts w:ascii="Arial" w:hAnsi="Arial"/>
                 <w:sz w:val="20"/>
               </w:rPr>
-              <w:t>domain_quarterly_page</w:t>
+              <w:t>labour_force_industry_xlsx</w:t>
             </w:r>
           </w:p>
         </w:tc>
@@ -29574,7 +28553,7 @@
                 <w:rFonts w:ascii="Arial" w:hAnsi="Arial"/>
                 <w:sz w:val="20"/>
               </w:rPr>
-              <w:t>dwelling_approvals_xlsx</w:t>
+              <w:t>lending_indicators_xlsx</w:t>
             </w:r>
           </w:p>
         </w:tc>
@@ -29643,7 +28622,7 @@
                 <w:rFonts w:ascii="Arial" w:hAnsi="Arial"/>
                 <w:sz w:val="20"/>
               </w:rPr>
-              <w:t>dwelling_value_xlsx</w:t>
+              <w:t>ppi_construction_xlsx</w:t>
             </w:r>
           </w:p>
         </w:tc>
@@ -29710,7 +28689,7 @@
                 <w:rFonts w:ascii="Arial" w:hAnsi="Arial"/>
                 <w:sz w:val="20"/>
               </w:rPr>
-              <w:t>labour_force_industry_xlsx</w:t>
+              <w:t>ppi_manufacturing_xlsx</w:t>
             </w:r>
           </w:p>
         </w:tc>
@@ -29727,7 +28706,7 @@
                 <w:rFonts w:ascii="Arial" w:hAnsi="Arial"/>
                 <w:sz w:val="20"/>
               </w:rPr>
-              <w:t>Paid, gated, or manually extracted source</w:t>
+              <w:t>No successful manifest entry for this registry item</w:t>
             </w:r>
           </w:p>
         </w:tc>
@@ -29744,7 +28723,7 @@
                 <w:rFonts w:ascii="Arial" w:hAnsi="Arial"/>
                 <w:sz w:val="20"/>
               </w:rPr>
-              <w:t>Manual staging required - see data/raw/manual or source-specific raw-public directory</w:t>
+              <w:t>Awaiting next release or implement downloader/scraper</w:t>
             </w:r>
           </w:p>
         </w:tc>
@@ -29779,7 +28758,7 @@
                 <w:rFonts w:ascii="Arial" w:hAnsi="Arial"/>
                 <w:sz w:val="20"/>
               </w:rPr>
-              <w:t>lending_indicators_xlsx</w:t>
+              <w:t>property_price_capitals_xlsx</w:t>
             </w:r>
           </w:p>
         </w:tc>
@@ -29846,7 +28825,7 @@
                 <w:rFonts w:ascii="Arial" w:hAnsi="Arial"/>
                 <w:sz w:val="20"/>
               </w:rPr>
-              <w:t>nsw_rental_bonds_page</w:t>
+              <w:t>property_price_index_xlsx</w:t>
             </w:r>
           </w:p>
         </w:tc>
@@ -29863,7 +28842,7 @@
                 <w:rFonts w:ascii="Arial" w:hAnsi="Arial"/>
                 <w:sz w:val="20"/>
               </w:rPr>
-              <w:t>Paid, gated, or manually extracted source</w:t>
+              <w:t>No successful manifest entry for this registry item</w:t>
             </w:r>
           </w:p>
         </w:tc>
@@ -29880,7 +28859,7 @@
                 <w:rFonts w:ascii="Arial" w:hAnsi="Arial"/>
                 <w:sz w:val="20"/>
               </w:rPr>
-              <w:t>Manual staging required - see data/raw/manual or source-specific raw-public directory</w:t>
+              <w:t>Awaiting next release or implement downloader/scraper</w:t>
             </w:r>
           </w:p>
         </w:tc>
@@ -29915,7 +28894,7 @@
                 <w:rFonts w:ascii="Arial" w:hAnsi="Arial"/>
                 <w:sz w:val="20"/>
               </w:rPr>
-              <w:t>ppi_construction_xlsx</w:t>
+              <w:t>ptrs_cycle_8_pdf</w:t>
             </w:r>
           </w:p>
         </w:tc>
@@ -29931,7 +28910,7 @@
                 <w:rFonts w:ascii="Arial" w:hAnsi="Arial"/>
                 <w:sz w:val="20"/>
               </w:rPr>
-              <w:t>No successful manifest entry for this registry item</w:t>
+              <w:t>Paid, gated, or manually extracted source</w:t>
             </w:r>
           </w:p>
         </w:tc>
@@ -29947,7 +28926,7 @@
                 <w:rFonts w:ascii="Arial" w:hAnsi="Arial"/>
                 <w:sz w:val="20"/>
               </w:rPr>
-              <w:t>Awaiting next release or implement downloader/scraper</w:t>
+              <w:t>Manual staging required - see data/raw/manual or source-specific raw-public directory</w:t>
             </w:r>
           </w:p>
         </w:tc>
@@ -29982,7 +28961,7 @@
                 <w:rFonts w:ascii="Arial" w:hAnsi="Arial"/>
                 <w:sz w:val="20"/>
               </w:rPr>
-              <w:t>ppi_manufacturing_xlsx</w:t>
+              <w:t>ptrs_cycle_9_pdf</w:t>
             </w:r>
           </w:p>
         </w:tc>
@@ -29999,7 +28978,7 @@
                 <w:rFonts w:ascii="Arial" w:hAnsi="Arial"/>
                 <w:sz w:val="20"/>
               </w:rPr>
-              <w:t>No successful manifest entry for this registry item</w:t>
+              <w:t>Paid, gated, or manually extracted source</w:t>
             </w:r>
           </w:p>
         </w:tc>
@@ -30016,7 +28995,7 @@
                 <w:rFonts w:ascii="Arial" w:hAnsi="Arial"/>
                 <w:sz w:val="20"/>
               </w:rPr>
-              <w:t>Awaiting next release or implement downloader/scraper</w:t>
+              <w:t>Manual staging required - see data/raw/manual or source-specific raw-public directory</w:t>
             </w:r>
           </w:p>
         </w:tc>
@@ -30051,7 +29030,7 @@
                 <w:rFonts w:ascii="Arial" w:hAnsi="Arial"/>
                 <w:sz w:val="20"/>
               </w:rPr>
-              <w:t>property_price_capitals_xlsx</w:t>
+              <w:t>ptrs_guidance</w:t>
             </w:r>
           </w:p>
         </w:tc>
@@ -30067,7 +29046,7 @@
                 <w:rFonts w:ascii="Arial" w:hAnsi="Arial"/>
                 <w:sz w:val="20"/>
               </w:rPr>
-              <w:t>No successful manifest entry for this registry item</w:t>
+              <w:t>Paid, gated, or manually extracted source</w:t>
             </w:r>
           </w:p>
         </w:tc>
@@ -30083,7 +29062,7 @@
                 <w:rFonts w:ascii="Arial" w:hAnsi="Arial"/>
                 <w:sz w:val="20"/>
               </w:rPr>
-              <w:t>Awaiting next release or implement downloader/scraper</w:t>
+              <w:t>Manual staging required - see data/raw/manual or source-specific raw-public directory</w:t>
             </w:r>
           </w:p>
         </w:tc>
@@ -30118,7 +29097,7 @@
                 <w:rFonts w:ascii="Arial" w:hAnsi="Arial"/>
                 <w:sz w:val="20"/>
               </w:rPr>
-              <w:t>property_price_index_xlsx</w:t>
+              <w:t>rba_cash_rate_csv</w:t>
             </w:r>
           </w:p>
         </w:tc>
@@ -30135,7 +29114,7 @@
                 <w:rFonts w:ascii="Arial" w:hAnsi="Arial"/>
                 <w:sz w:val="20"/>
               </w:rPr>
-              <w:t>No successful manifest entry for this registry item</w:t>
+              <w:t>Paid, gated, or manually extracted source</w:t>
             </w:r>
           </w:p>
         </w:tc>
@@ -30152,7 +29131,7 @@
                 <w:rFonts w:ascii="Arial" w:hAnsi="Arial"/>
                 <w:sz w:val="20"/>
               </w:rPr>
-              <w:t>Awaiting next release or implement downloader/scraper</w:t>
+              <w:t>Manual staging required - see data/raw/manual or source-specific raw-public directory</w:t>
             </w:r>
           </w:p>
         </w:tc>
@@ -30187,7 +29166,7 @@
                 <w:rFonts w:ascii="Arial" w:hAnsi="Arial"/>
                 <w:sz w:val="20"/>
               </w:rPr>
-              <w:t>ptrs_cycle_8_pdf</w:t>
+              <w:t>rba_chart_pack_page</w:t>
             </w:r>
           </w:p>
         </w:tc>
@@ -30203,7 +29182,7 @@
                 <w:rFonts w:ascii="Arial" w:hAnsi="Arial"/>
                 <w:sz w:val="20"/>
               </w:rPr>
-              <w:t>Paid, gated, or manually extracted source</w:t>
+              <w:t>No successful manifest entry for this registry item</w:t>
             </w:r>
           </w:p>
         </w:tc>
@@ -30219,7 +29198,7 @@
                 <w:rFonts w:ascii="Arial" w:hAnsi="Arial"/>
                 <w:sz w:val="20"/>
               </w:rPr>
-              <w:t>Manual staging required - see data/raw/manual or source-specific raw-public directory</w:t>
+              <w:t>Awaiting next release or implement downloader/scraper</w:t>
             </w:r>
           </w:p>
         </w:tc>
@@ -30254,7 +29233,7 @@
                 <w:rFonts w:ascii="Arial" w:hAnsi="Arial"/>
                 <w:sz w:val="20"/>
               </w:rPr>
-              <w:t>ptrs_cycle_9_pdf</w:t>
+              <w:t>rba_fsr_page</w:t>
             </w:r>
           </w:p>
         </w:tc>
@@ -30271,7 +29250,7 @@
                 <w:rFonts w:ascii="Arial" w:hAnsi="Arial"/>
                 <w:sz w:val="20"/>
               </w:rPr>
-              <w:t>Paid, gated, or manually extracted source</w:t>
+              <w:t>No successful manifest entry for this registry item</w:t>
             </w:r>
           </w:p>
         </w:tc>
@@ -30288,7 +29267,7 @@
                 <w:rFonts w:ascii="Arial" w:hAnsi="Arial"/>
                 <w:sz w:val="20"/>
               </w:rPr>
-              <w:t>Manual staging required - see data/raw/manual or source-specific raw-public directory</w:t>
+              <w:t>Awaiting next release or implement downloader/scraper</w:t>
             </w:r>
           </w:p>
         </w:tc>
@@ -30323,7 +29302,7 @@
                 <w:rFonts w:ascii="Arial" w:hAnsi="Arial"/>
                 <w:sz w:val="20"/>
               </w:rPr>
-              <w:t>ptrs_guidance</w:t>
+              <w:t>rba_smp_page</w:t>
             </w:r>
           </w:p>
         </w:tc>
@@ -30339,7 +29318,7 @@
                 <w:rFonts w:ascii="Arial" w:hAnsi="Arial"/>
                 <w:sz w:val="20"/>
               </w:rPr>
-              <w:t>Paid, gated, or manually extracted source</w:t>
+              <w:t>No successful manifest entry for this registry item</w:t>
             </w:r>
           </w:p>
         </w:tc>
@@ -30355,7 +29334,7 @@
                 <w:rFonts w:ascii="Arial" w:hAnsi="Arial"/>
                 <w:sz w:val="20"/>
               </w:rPr>
-              <w:t>Manual staging required - see data/raw/manual or source-specific raw-public directory</w:t>
+              <w:t>Awaiting next release or implement downloader/scraper</w:t>
             </w:r>
           </w:p>
         </w:tc>
@@ -30390,7 +29369,7 @@
                 <w:rFonts w:ascii="Arial" w:hAnsi="Arial"/>
                 <w:sz w:val="20"/>
               </w:rPr>
-              <w:t>qld_median_rents_page</w:t>
+              <w:t>rba_table_e2_xls</w:t>
             </w:r>
           </w:p>
         </w:tc>
@@ -30459,7 +29438,7 @@
                 <w:rFonts w:ascii="Arial" w:hAnsi="Arial"/>
                 <w:sz w:val="20"/>
               </w:rPr>
-              <w:t>rba_cash_rate_csv</w:t>
+              <w:t>total_value_dwellings_xlsx</w:t>
             </w:r>
           </w:p>
         </w:tc>
@@ -30475,7 +29454,7 @@
                 <w:rFonts w:ascii="Arial" w:hAnsi="Arial"/>
                 <w:sz w:val="20"/>
               </w:rPr>
-              <w:t>Paid, gated, or manually extracted source</w:t>
+              <w:t>No successful manifest entry for this registry item</w:t>
             </w:r>
           </w:p>
         </w:tc>
@@ -30491,491 +29470,13 @@
                 <w:rFonts w:ascii="Arial" w:hAnsi="Arial"/>
                 <w:sz w:val="20"/>
               </w:rPr>
-              <w:t>Manual staging required - see data/raw/manual or source-specific raw-public directory</w:t>
+              <w:t>Awaiting next release or implement downloader/scraper</w:t>
             </w:r>
           </w:p>
         </w:tc>
         <w:tc>
           <w:tcPr>
             <w:tcW w:type="dxa" w:w="2340"/>
-            <w:vAlign w:val="center"/>
-          </w:tcPr>
-          <w:p>
-            <w:r/>
-            <w:r>
-              <w:rPr>
-                <w:rFonts w:ascii="Arial" w:hAnsi="Arial"/>
-                <w:sz w:val="20"/>
-              </w:rPr>
-              <w:t>Next scheduled refresh cycle</w:t>
-            </w:r>
-          </w:p>
-        </w:tc>
-      </w:tr>
-      <w:tr>
-        <w:tc>
-          <w:tcPr>
-            <w:tcW w:type="dxa" w:w="2340"/>
-            <w:shd w:val="clear" w:color="auto" w:fill="F2F2F2"/>
-            <w:vAlign w:val="center"/>
-          </w:tcPr>
-          <w:p>
-            <w:r/>
-            <w:r>
-              <w:rPr>
-                <w:rFonts w:ascii="Arial" w:hAnsi="Arial"/>
-                <w:sz w:val="20"/>
-              </w:rPr>
-              <w:t>rba_chart_pack_page</w:t>
-            </w:r>
-          </w:p>
-        </w:tc>
-        <w:tc>
-          <w:tcPr>
-            <w:tcW w:type="dxa" w:w="2340"/>
-            <w:shd w:val="clear" w:color="auto" w:fill="F2F2F2"/>
-            <w:vAlign w:val="center"/>
-          </w:tcPr>
-          <w:p>
-            <w:r/>
-            <w:r>
-              <w:rPr>
-                <w:rFonts w:ascii="Arial" w:hAnsi="Arial"/>
-                <w:sz w:val="20"/>
-              </w:rPr>
-              <w:t>No successful manifest entry for this registry item</w:t>
-            </w:r>
-          </w:p>
-        </w:tc>
-        <w:tc>
-          <w:tcPr>
-            <w:tcW w:type="dxa" w:w="2340"/>
-            <w:shd w:val="clear" w:color="auto" w:fill="F2F2F2"/>
-            <w:vAlign w:val="center"/>
-          </w:tcPr>
-          <w:p>
-            <w:r/>
-            <w:r>
-              <w:rPr>
-                <w:rFonts w:ascii="Arial" w:hAnsi="Arial"/>
-                <w:sz w:val="20"/>
-              </w:rPr>
-              <w:t>Awaiting next release or implement downloader/scraper</w:t>
-            </w:r>
-          </w:p>
-        </w:tc>
-        <w:tc>
-          <w:tcPr>
-            <w:tcW w:type="dxa" w:w="2340"/>
-            <w:shd w:val="clear" w:color="auto" w:fill="F2F2F2"/>
-            <w:vAlign w:val="center"/>
-          </w:tcPr>
-          <w:p>
-            <w:r/>
-            <w:r>
-              <w:rPr>
-                <w:rFonts w:ascii="Arial" w:hAnsi="Arial"/>
-                <w:sz w:val="20"/>
-              </w:rPr>
-              <w:t>Next scheduled refresh cycle</w:t>
-            </w:r>
-          </w:p>
-        </w:tc>
-      </w:tr>
-      <w:tr>
-        <w:tc>
-          <w:tcPr>
-            <w:tcW w:type="dxa" w:w="2340"/>
-            <w:vAlign w:val="center"/>
-          </w:tcPr>
-          <w:p>
-            <w:r/>
-            <w:r>
-              <w:rPr>
-                <w:rFonts w:ascii="Arial" w:hAnsi="Arial"/>
-                <w:sz w:val="20"/>
-              </w:rPr>
-              <w:t>rba_fsr_page</w:t>
-            </w:r>
-          </w:p>
-        </w:tc>
-        <w:tc>
-          <w:tcPr>
-            <w:tcW w:type="dxa" w:w="2340"/>
-            <w:vAlign w:val="center"/>
-          </w:tcPr>
-          <w:p>
-            <w:r/>
-            <w:r>
-              <w:rPr>
-                <w:rFonts w:ascii="Arial" w:hAnsi="Arial"/>
-                <w:sz w:val="20"/>
-              </w:rPr>
-              <w:t>No successful manifest entry for this registry item</w:t>
-            </w:r>
-          </w:p>
-        </w:tc>
-        <w:tc>
-          <w:tcPr>
-            <w:tcW w:type="dxa" w:w="2340"/>
-            <w:vAlign w:val="center"/>
-          </w:tcPr>
-          <w:p>
-            <w:r/>
-            <w:r>
-              <w:rPr>
-                <w:rFonts w:ascii="Arial" w:hAnsi="Arial"/>
-                <w:sz w:val="20"/>
-              </w:rPr>
-              <w:t>Awaiting next release or implement downloader/scraper</w:t>
-            </w:r>
-          </w:p>
-        </w:tc>
-        <w:tc>
-          <w:tcPr>
-            <w:tcW w:type="dxa" w:w="2340"/>
-            <w:vAlign w:val="center"/>
-          </w:tcPr>
-          <w:p>
-            <w:r/>
-            <w:r>
-              <w:rPr>
-                <w:rFonts w:ascii="Arial" w:hAnsi="Arial"/>
-                <w:sz w:val="20"/>
-              </w:rPr>
-              <w:t>Next scheduled refresh cycle</w:t>
-            </w:r>
-          </w:p>
-        </w:tc>
-      </w:tr>
-      <w:tr>
-        <w:tc>
-          <w:tcPr>
-            <w:tcW w:type="dxa" w:w="2340"/>
-            <w:shd w:val="clear" w:color="auto" w:fill="F2F2F2"/>
-            <w:vAlign w:val="center"/>
-          </w:tcPr>
-          <w:p>
-            <w:r/>
-            <w:r>
-              <w:rPr>
-                <w:rFonts w:ascii="Arial" w:hAnsi="Arial"/>
-                <w:sz w:val="20"/>
-              </w:rPr>
-              <w:t>rba_smp_page</w:t>
-            </w:r>
-          </w:p>
-        </w:tc>
-        <w:tc>
-          <w:tcPr>
-            <w:tcW w:type="dxa" w:w="2340"/>
-            <w:shd w:val="clear" w:color="auto" w:fill="F2F2F2"/>
-            <w:vAlign w:val="center"/>
-          </w:tcPr>
-          <w:p>
-            <w:r/>
-            <w:r>
-              <w:rPr>
-                <w:rFonts w:ascii="Arial" w:hAnsi="Arial"/>
-                <w:sz w:val="20"/>
-              </w:rPr>
-              <w:t>No successful manifest entry for this registry item</w:t>
-            </w:r>
-          </w:p>
-        </w:tc>
-        <w:tc>
-          <w:tcPr>
-            <w:tcW w:type="dxa" w:w="2340"/>
-            <w:shd w:val="clear" w:color="auto" w:fill="F2F2F2"/>
-            <w:vAlign w:val="center"/>
-          </w:tcPr>
-          <w:p>
-            <w:r/>
-            <w:r>
-              <w:rPr>
-                <w:rFonts w:ascii="Arial" w:hAnsi="Arial"/>
-                <w:sz w:val="20"/>
-              </w:rPr>
-              <w:t>Awaiting next release or implement downloader/scraper</w:t>
-            </w:r>
-          </w:p>
-        </w:tc>
-        <w:tc>
-          <w:tcPr>
-            <w:tcW w:type="dxa" w:w="2340"/>
-            <w:shd w:val="clear" w:color="auto" w:fill="F2F2F2"/>
-            <w:vAlign w:val="center"/>
-          </w:tcPr>
-          <w:p>
-            <w:r/>
-            <w:r>
-              <w:rPr>
-                <w:rFonts w:ascii="Arial" w:hAnsi="Arial"/>
-                <w:sz w:val="20"/>
-              </w:rPr>
-              <w:t>Next scheduled refresh cycle</w:t>
-            </w:r>
-          </w:p>
-        </w:tc>
-      </w:tr>
-      <w:tr>
-        <w:tc>
-          <w:tcPr>
-            <w:tcW w:type="dxa" w:w="2340"/>
-            <w:vAlign w:val="center"/>
-          </w:tcPr>
-          <w:p>
-            <w:r/>
-            <w:r>
-              <w:rPr>
-                <w:rFonts w:ascii="Arial" w:hAnsi="Arial"/>
-                <w:sz w:val="20"/>
-              </w:rPr>
-              <w:t>rba_table_e2_xls</w:t>
-            </w:r>
-          </w:p>
-        </w:tc>
-        <w:tc>
-          <w:tcPr>
-            <w:tcW w:type="dxa" w:w="2340"/>
-            <w:vAlign w:val="center"/>
-          </w:tcPr>
-          <w:p>
-            <w:r/>
-            <w:r>
-              <w:rPr>
-                <w:rFonts w:ascii="Arial" w:hAnsi="Arial"/>
-                <w:sz w:val="20"/>
-              </w:rPr>
-              <w:t>No successful manifest entry for this registry item</w:t>
-            </w:r>
-          </w:p>
-        </w:tc>
-        <w:tc>
-          <w:tcPr>
-            <w:tcW w:type="dxa" w:w="2340"/>
-            <w:vAlign w:val="center"/>
-          </w:tcPr>
-          <w:p>
-            <w:r/>
-            <w:r>
-              <w:rPr>
-                <w:rFonts w:ascii="Arial" w:hAnsi="Arial"/>
-                <w:sz w:val="20"/>
-              </w:rPr>
-              <w:t>Awaiting next release or implement downloader/scraper</w:t>
-            </w:r>
-          </w:p>
-        </w:tc>
-        <w:tc>
-          <w:tcPr>
-            <w:tcW w:type="dxa" w:w="2340"/>
-            <w:vAlign w:val="center"/>
-          </w:tcPr>
-          <w:p>
-            <w:r/>
-            <w:r>
-              <w:rPr>
-                <w:rFonts w:ascii="Arial" w:hAnsi="Arial"/>
-                <w:sz w:val="20"/>
-              </w:rPr>
-              <w:t>Next scheduled refresh cycle</w:t>
-            </w:r>
-          </w:p>
-        </w:tc>
-      </w:tr>
-      <w:tr>
-        <w:tc>
-          <w:tcPr>
-            <w:tcW w:type="dxa" w:w="2340"/>
-            <w:shd w:val="clear" w:color="auto" w:fill="F2F2F2"/>
-            <w:vAlign w:val="center"/>
-          </w:tcPr>
-          <w:p>
-            <w:r/>
-            <w:r>
-              <w:rPr>
-                <w:rFonts w:ascii="Arial" w:hAnsi="Arial"/>
-                <w:sz w:val="20"/>
-              </w:rPr>
-              <w:t>sqm_headline_page</w:t>
-            </w:r>
-          </w:p>
-        </w:tc>
-        <w:tc>
-          <w:tcPr>
-            <w:tcW w:type="dxa" w:w="2340"/>
-            <w:shd w:val="clear" w:color="auto" w:fill="F2F2F2"/>
-            <w:vAlign w:val="center"/>
-          </w:tcPr>
-          <w:p>
-            <w:r/>
-            <w:r>
-              <w:rPr>
-                <w:rFonts w:ascii="Arial" w:hAnsi="Arial"/>
-                <w:sz w:val="20"/>
-              </w:rPr>
-              <w:t>Paid, gated, or manually extracted source</w:t>
-            </w:r>
-          </w:p>
-        </w:tc>
-        <w:tc>
-          <w:tcPr>
-            <w:tcW w:type="dxa" w:w="2340"/>
-            <w:shd w:val="clear" w:color="auto" w:fill="F2F2F2"/>
-            <w:vAlign w:val="center"/>
-          </w:tcPr>
-          <w:p>
-            <w:r/>
-            <w:r>
-              <w:rPr>
-                <w:rFonts w:ascii="Arial" w:hAnsi="Arial"/>
-                <w:sz w:val="20"/>
-              </w:rPr>
-              <w:t>Manual staging required - see data/raw/manual or source-specific raw-public directory</w:t>
-            </w:r>
-          </w:p>
-        </w:tc>
-        <w:tc>
-          <w:tcPr>
-            <w:tcW w:type="dxa" w:w="2340"/>
-            <w:shd w:val="clear" w:color="auto" w:fill="F2F2F2"/>
-            <w:vAlign w:val="center"/>
-          </w:tcPr>
-          <w:p>
-            <w:r/>
-            <w:r>
-              <w:rPr>
-                <w:rFonts w:ascii="Arial" w:hAnsi="Arial"/>
-                <w:sz w:val="20"/>
-              </w:rPr>
-              <w:t>Next scheduled refresh cycle</w:t>
-            </w:r>
-          </w:p>
-        </w:tc>
-      </w:tr>
-      <w:tr>
-        <w:tc>
-          <w:tcPr>
-            <w:tcW w:type="dxa" w:w="2340"/>
-            <w:vAlign w:val="center"/>
-          </w:tcPr>
-          <w:p>
-            <w:r/>
-            <w:r>
-              <w:rPr>
-                <w:rFonts w:ascii="Arial" w:hAnsi="Arial"/>
-                <w:sz w:val="20"/>
-              </w:rPr>
-              <w:t>total_value_dwellings_xlsx</w:t>
-            </w:r>
-          </w:p>
-        </w:tc>
-        <w:tc>
-          <w:tcPr>
-            <w:tcW w:type="dxa" w:w="2340"/>
-            <w:vAlign w:val="center"/>
-          </w:tcPr>
-          <w:p>
-            <w:r/>
-            <w:r>
-              <w:rPr>
-                <w:rFonts w:ascii="Arial" w:hAnsi="Arial"/>
-                <w:sz w:val="20"/>
-              </w:rPr>
-              <w:t>No successful manifest entry for this registry item</w:t>
-            </w:r>
-          </w:p>
-        </w:tc>
-        <w:tc>
-          <w:tcPr>
-            <w:tcW w:type="dxa" w:w="2340"/>
-            <w:vAlign w:val="center"/>
-          </w:tcPr>
-          <w:p>
-            <w:r/>
-            <w:r>
-              <w:rPr>
-                <w:rFonts w:ascii="Arial" w:hAnsi="Arial"/>
-                <w:sz w:val="20"/>
-              </w:rPr>
-              <w:t>Awaiting next release or implement downloader/scraper</w:t>
-            </w:r>
-          </w:p>
-        </w:tc>
-        <w:tc>
-          <w:tcPr>
-            <w:tcW w:type="dxa" w:w="2340"/>
-            <w:vAlign w:val="center"/>
-          </w:tcPr>
-          <w:p>
-            <w:r/>
-            <w:r>
-              <w:rPr>
-                <w:rFonts w:ascii="Arial" w:hAnsi="Arial"/>
-                <w:sz w:val="20"/>
-              </w:rPr>
-              <w:t>Next scheduled refresh cycle</w:t>
-            </w:r>
-          </w:p>
-        </w:tc>
-      </w:tr>
-      <w:tr>
-        <w:tc>
-          <w:tcPr>
-            <w:tcW w:type="dxa" w:w="2340"/>
-            <w:shd w:val="clear" w:color="auto" w:fill="F2F2F2"/>
-            <w:vAlign w:val="center"/>
-          </w:tcPr>
-          <w:p>
-            <w:r/>
-            <w:r>
-              <w:rPr>
-                <w:rFonts w:ascii="Arial" w:hAnsi="Arial"/>
-                <w:sz w:val="20"/>
-              </w:rPr>
-              <w:t>vic_rental_report_page</w:t>
-            </w:r>
-          </w:p>
-        </w:tc>
-        <w:tc>
-          <w:tcPr>
-            <w:tcW w:type="dxa" w:w="2340"/>
-            <w:shd w:val="clear" w:color="auto" w:fill="F2F2F2"/>
-            <w:vAlign w:val="center"/>
-          </w:tcPr>
-          <w:p>
-            <w:r/>
-            <w:r>
-              <w:rPr>
-                <w:rFonts w:ascii="Arial" w:hAnsi="Arial"/>
-                <w:sz w:val="20"/>
-              </w:rPr>
-              <w:t>Paid, gated, or manually extracted source</w:t>
-            </w:r>
-          </w:p>
-        </w:tc>
-        <w:tc>
-          <w:tcPr>
-            <w:tcW w:type="dxa" w:w="2340"/>
-            <w:shd w:val="clear" w:color="auto" w:fill="F2F2F2"/>
-            <w:vAlign w:val="center"/>
-          </w:tcPr>
-          <w:p>
-            <w:r/>
-            <w:r>
-              <w:rPr>
-                <w:rFonts w:ascii="Arial" w:hAnsi="Arial"/>
-                <w:sz w:val="20"/>
-              </w:rPr>
-              <w:t>Manual staging required - see data/raw/manual or source-specific raw-public directory</w:t>
-            </w:r>
-          </w:p>
-        </w:tc>
-        <w:tc>
-          <w:tcPr>
-            <w:tcW w:type="dxa" w:w="2340"/>
-            <w:shd w:val="clear" w:color="auto" w:fill="F2F2F2"/>
             <w:vAlign w:val="center"/>
           </w:tcPr>
           <w:p>
@@ -31127,7 +29628,7 @@
                 <w:rFonts w:ascii="Arial" w:hAnsi="Arial"/>
                 <w:sz w:val="20"/>
               </w:rPr>
-              <w:t>37</w:t>
+              <w:t>30</w:t>
             </w:r>
           </w:p>
         </w:tc>
@@ -31333,7 +29834,7 @@
                 <w:rFonts w:ascii="Arial" w:hAnsi="Arial"/>
                 <w:sz w:val="20"/>
               </w:rPr>
-              <w:t>34</w:t>
+              <w:t>27</w:t>
             </w:r>
           </w:p>
         </w:tc>

</xml_diff>

<commit_message>
ST-IA-1/2/3: macro-path per scenario (CRE36.51 mild) + reverse-stress, no-diversification, stress->limits linkage, validation
- ST-IA-1: add a per-scenario macro_path note to the downturn overlay table so
  multipliers read as derived from a named macro path; define mild = Basel
  CRE36.51 two-quarters-zero-growth minimum. Keeps ABS/RBA anchoring and the
  'illustrative assumptions, not calibrated' labelling.
- ST-IA-2: state the no-diversification assumption (APG 113 para 92) on each
  published overlay row; add a reverse-stress view and the downstream
  stress -> limits / appetite linkage to docs/CONTRACT_FOR_DOWNSTREAM.md.
- ST-IA-3: independent-validation / governance note in the contract doc.

csv_io macro_path string column + contract_exports description updated;
pytest green (124); contracts and reports regenerated.
</commit_message>
<xml_diff>
--- a/outputs/reports/Industry_Analysis_Q1_2026_Board.docx
+++ b/outputs/reports/Industry_Analysis_Q1_2026_Board.docx
@@ -37,7 +37,7 @@
           <w:color w:val="7F7F7F"/>
           <w:sz w:val="20"/>
         </w:rPr>
-        <w:t>Generated 2026-06-12</w:t>
+        <w:t>Generated 2026-06-15</w:t>
       </w:r>
     </w:p>
     <w:p>
@@ -49,7 +49,7 @@
           <w:color w:val="7F7F7F"/>
           <w:sz w:val="20"/>
         </w:rPr>
-        <w:t>Macro and downturn overlays as of 2026-06-11. Property cycle data as of 2026-02-01.</w:t>
+        <w:t>Macro and downturn overlays as of 2026-06-12. Property cycle data as of 2026-02-01.</w:t>
       </w:r>
     </w:p>
     <w:tbl>
@@ -139,7 +139,7 @@
           <w:b w:val="0"/>
           <w:i w:val="0"/>
         </w:rPr>
-        <w:t>Macro and downturn overlays are dated 2026-06-11; property-cycle data is dated 2026-02-01. The headline numbers are in Section 2; every figure traces back to a named public source in Sections 3-5.</w:t>
+        <w:t>Macro and downturn overlays are dated 2026-06-12; property-cycle data is dated 2026-02-01. The headline numbers are in Section 2; every figure traces back to a named public source in Sections 3-5.</w:t>
       </w:r>
     </w:p>
     <w:p>
@@ -313,7 +313,7 @@
                 <w:rFonts w:ascii="Arial" w:hAnsi="Arial"/>
                 <w:sz w:val="20"/>
               </w:rPr>
-              <w:t>2026-06-11</w:t>
+              <w:t>2026-06-12</w:t>
             </w:r>
           </w:p>
         </w:tc>
@@ -449,7 +449,7 @@
                 <w:rFonts w:ascii="Arial" w:hAnsi="Arial"/>
                 <w:sz w:val="20"/>
               </w:rPr>
-              <w:t>2026-06-11</w:t>
+              <w:t>2026-06-12</w:t>
             </w:r>
           </w:p>
         </w:tc>
@@ -518,7 +518,7 @@
                 <w:rFonts w:ascii="Arial" w:hAnsi="Arial"/>
                 <w:sz w:val="20"/>
               </w:rPr>
-              <w:t>2026-06-11</w:t>
+              <w:t>2026-06-12</w:t>
             </w:r>
           </w:p>
         </w:tc>
@@ -585,7 +585,7 @@
                 <w:rFonts w:ascii="Arial" w:hAnsi="Arial"/>
                 <w:sz w:val="20"/>
               </w:rPr>
-              <w:t>2026-06-11</w:t>
+              <w:t>2026-06-12</w:t>
             </w:r>
           </w:p>
         </w:tc>
@@ -721,7 +721,7 @@
                 <w:rFonts w:ascii="Arial" w:hAnsi="Arial"/>
                 <w:sz w:val="20"/>
               </w:rPr>
-              <w:t>2026-06-11</w:t>
+              <w:t>2026-06-12</w:t>
             </w:r>
           </w:p>
         </w:tc>
@@ -790,7 +790,7 @@
                 <w:rFonts w:ascii="Arial" w:hAnsi="Arial"/>
                 <w:sz w:val="20"/>
               </w:rPr>
-              <w:t>2026-06-11</w:t>
+              <w:t>2026-06-12</w:t>
             </w:r>
           </w:p>
         </w:tc>
@@ -1049,7 +1049,7 @@
                 <w:rFonts w:ascii="Arial" w:hAnsi="Arial"/>
                 <w:sz w:val="20"/>
               </w:rPr>
-              <w:t>2026-06-12</w:t>
+              <w:t>2026-06-15</w:t>
             </w:r>
           </w:p>
         </w:tc>
@@ -1212,7 +1212,7 @@
                 <w:rFonts w:ascii="Arial" w:hAnsi="Arial"/>
                 <w:sz w:val="20"/>
               </w:rPr>
-              <w:t>2026-06-12</w:t>
+              <w:t>2026-06-15</w:t>
             </w:r>
           </w:p>
         </w:tc>
@@ -1383,7 +1383,7 @@
                 <w:rFonts w:ascii="Arial" w:hAnsi="Arial"/>
                 <w:sz w:val="20"/>
               </w:rPr>
-              <w:t>2026-06-12</w:t>
+              <w:t>2026-06-15</w:t>
             </w:r>
           </w:p>
         </w:tc>
@@ -1546,7 +1546,7 @@
                 <w:rFonts w:ascii="Arial" w:hAnsi="Arial"/>
                 <w:sz w:val="20"/>
               </w:rPr>
-              <w:t>2026-06-12</w:t>
+              <w:t>2026-06-15</w:t>
             </w:r>
           </w:p>
         </w:tc>
@@ -1717,7 +1717,7 @@
                 <w:rFonts w:ascii="Arial" w:hAnsi="Arial"/>
                 <w:sz w:val="20"/>
               </w:rPr>
-              <w:t>2026-06-12</w:t>
+              <w:t>2026-06-15</w:t>
             </w:r>
           </w:p>
         </w:tc>
@@ -1880,7 +1880,7 @@
                 <w:rFonts w:ascii="Arial" w:hAnsi="Arial"/>
                 <w:sz w:val="20"/>
               </w:rPr>
-              <w:t>2026-06-12</w:t>
+              <w:t>2026-06-15</w:t>
             </w:r>
           </w:p>
         </w:tc>
@@ -2051,7 +2051,7 @@
                 <w:rFonts w:ascii="Arial" w:hAnsi="Arial"/>
                 <w:sz w:val="20"/>
               </w:rPr>
-              <w:t>2026-06-12</w:t>
+              <w:t>2026-06-15</w:t>
             </w:r>
           </w:p>
         </w:tc>
@@ -2214,7 +2214,7 @@
                 <w:rFonts w:ascii="Arial" w:hAnsi="Arial"/>
                 <w:sz w:val="20"/>
               </w:rPr>
-              <w:t>2026-06-12</w:t>
+              <w:t>2026-06-15</w:t>
             </w:r>
           </w:p>
         </w:tc>
@@ -2385,7 +2385,7 @@
                 <w:rFonts w:ascii="Arial" w:hAnsi="Arial"/>
                 <w:sz w:val="20"/>
               </w:rPr>
-              <w:t>2026-06-12</w:t>
+              <w:t>2026-06-15</w:t>
             </w:r>
           </w:p>
         </w:tc>
@@ -2548,7 +2548,7 @@
                 <w:rFonts w:ascii="Arial" w:hAnsi="Arial"/>
                 <w:sz w:val="20"/>
               </w:rPr>
-              <w:t>2026-06-12</w:t>
+              <w:t>2026-06-15</w:t>
             </w:r>
           </w:p>
         </w:tc>
@@ -2719,7 +2719,7 @@
                 <w:rFonts w:ascii="Arial" w:hAnsi="Arial"/>
                 <w:sz w:val="20"/>
               </w:rPr>
-              <w:t>2026-06-12</w:t>
+              <w:t>2026-06-15</w:t>
             </w:r>
           </w:p>
         </w:tc>
@@ -2882,7 +2882,7 @@
                 <w:rFonts w:ascii="Arial" w:hAnsi="Arial"/>
                 <w:sz w:val="20"/>
               </w:rPr>
-              <w:t>2026-06-12</w:t>
+              <w:t>2026-06-15</w:t>
             </w:r>
           </w:p>
         </w:tc>
@@ -3053,7 +3053,7 @@
                 <w:rFonts w:ascii="Arial" w:hAnsi="Arial"/>
                 <w:sz w:val="20"/>
               </w:rPr>
-              <w:t>2026-06-12</w:t>
+              <w:t>2026-06-15</w:t>
             </w:r>
           </w:p>
         </w:tc>
@@ -3216,7 +3216,7 @@
                 <w:rFonts w:ascii="Arial" w:hAnsi="Arial"/>
                 <w:sz w:val="20"/>
               </w:rPr>
-              <w:t>2026-06-12</w:t>
+              <w:t>2026-06-15</w:t>
             </w:r>
           </w:p>
         </w:tc>
@@ -3387,7 +3387,7 @@
                 <w:rFonts w:ascii="Arial" w:hAnsi="Arial"/>
                 <w:sz w:val="20"/>
               </w:rPr>
-              <w:t>2026-06-12</w:t>
+              <w:t>2026-06-15</w:t>
             </w:r>
           </w:p>
         </w:tc>
@@ -3550,7 +3550,7 @@
                 <w:rFonts w:ascii="Arial" w:hAnsi="Arial"/>
                 <w:sz w:val="20"/>
               </w:rPr>
-              <w:t>2026-06-12</w:t>
+              <w:t>2026-06-15</w:t>
             </w:r>
           </w:p>
         </w:tc>
@@ -3721,7 +3721,7 @@
                 <w:rFonts w:ascii="Arial" w:hAnsi="Arial"/>
                 <w:sz w:val="20"/>
               </w:rPr>
-              <w:t>2026-06-12</w:t>
+              <w:t>2026-06-15</w:t>
             </w:r>
           </w:p>
         </w:tc>
@@ -3884,7 +3884,7 @@
                 <w:rFonts w:ascii="Arial" w:hAnsi="Arial"/>
                 <w:sz w:val="20"/>
               </w:rPr>
-              <w:t>2026-06-12</w:t>
+              <w:t>2026-06-15</w:t>
             </w:r>
           </w:p>
         </w:tc>
@@ -4063,18 +4063,19 @@
         <w:tblLook w:firstColumn="1" w:firstRow="1" w:lastColumn="0" w:lastRow="0" w:noHBand="0" w:noVBand="1" w:val="04A0"/>
       </w:tblPr>
       <w:tblGrid>
-        <w:gridCol w:w="1337"/>
-        <w:gridCol w:w="1337"/>
-        <w:gridCol w:w="1337"/>
-        <w:gridCol w:w="1337"/>
-        <w:gridCol w:w="1337"/>
-        <w:gridCol w:w="1337"/>
-        <w:gridCol w:w="1337"/>
+        <w:gridCol w:w="1170"/>
+        <w:gridCol w:w="1170"/>
+        <w:gridCol w:w="1170"/>
+        <w:gridCol w:w="1170"/>
+        <w:gridCol w:w="1170"/>
+        <w:gridCol w:w="1170"/>
+        <w:gridCol w:w="1170"/>
+        <w:gridCol w:w="1170"/>
       </w:tblGrid>
       <w:tr>
         <w:tc>
           <w:tcPr>
-            <w:tcW w:type="dxa" w:w="1337"/>
+            <w:tcW w:type="dxa" w:w="1170"/>
             <w:shd w:val="clear" w:color="auto" w:fill="1F4E79"/>
             <w:vAlign w:val="center"/>
           </w:tcPr>
@@ -4093,7 +4094,7 @@
         </w:tc>
         <w:tc>
           <w:tcPr>
-            <w:tcW w:type="dxa" w:w="1337"/>
+            <w:tcW w:type="dxa" w:w="1170"/>
             <w:shd w:val="clear" w:color="auto" w:fill="1F4E79"/>
             <w:vAlign w:val="center"/>
           </w:tcPr>
@@ -4112,7 +4113,7 @@
         </w:tc>
         <w:tc>
           <w:tcPr>
-            <w:tcW w:type="dxa" w:w="1337"/>
+            <w:tcW w:type="dxa" w:w="1170"/>
             <w:shd w:val="clear" w:color="auto" w:fill="1F4E79"/>
             <w:vAlign w:val="center"/>
           </w:tcPr>
@@ -4131,7 +4132,7 @@
         </w:tc>
         <w:tc>
           <w:tcPr>
-            <w:tcW w:type="dxa" w:w="1337"/>
+            <w:tcW w:type="dxa" w:w="1170"/>
             <w:shd w:val="clear" w:color="auto" w:fill="1F4E79"/>
             <w:vAlign w:val="center"/>
           </w:tcPr>
@@ -4150,7 +4151,7 @@
         </w:tc>
         <w:tc>
           <w:tcPr>
-            <w:tcW w:type="dxa" w:w="1337"/>
+            <w:tcW w:type="dxa" w:w="1170"/>
             <w:shd w:val="clear" w:color="auto" w:fill="1F4E79"/>
             <w:vAlign w:val="center"/>
           </w:tcPr>
@@ -4169,7 +4170,7 @@
         </w:tc>
         <w:tc>
           <w:tcPr>
-            <w:tcW w:type="dxa" w:w="1337"/>
+            <w:tcW w:type="dxa" w:w="1170"/>
             <w:shd w:val="clear" w:color="auto" w:fill="1F4E79"/>
             <w:vAlign w:val="center"/>
           </w:tcPr>
@@ -4182,13 +4183,13 @@
                 <w:color w:val="FFFFFF"/>
                 <w:sz w:val="20"/>
               </w:rPr>
-              <w:t>notes</w:t>
-            </w:r>
-          </w:p>
-        </w:tc>
-        <w:tc>
-          <w:tcPr>
-            <w:tcW w:type="dxa" w:w="1337"/>
+              <w:t>macro_path</w:t>
+            </w:r>
+          </w:p>
+        </w:tc>
+        <w:tc>
+          <w:tcPr>
+            <w:tcW w:type="dxa" w:w="1170"/>
             <w:shd w:val="clear" w:color="auto" w:fill="1F4E79"/>
             <w:vAlign w:val="center"/>
           </w:tcPr>
@@ -4201,6 +4202,25 @@
                 <w:color w:val="FFFFFF"/>
                 <w:sz w:val="20"/>
               </w:rPr>
+              <w:t>notes</w:t>
+            </w:r>
+          </w:p>
+        </w:tc>
+        <w:tc>
+          <w:tcPr>
+            <w:tcW w:type="dxa" w:w="1170"/>
+            <w:shd w:val="clear" w:color="auto" w:fill="1F4E79"/>
+            <w:vAlign w:val="center"/>
+          </w:tcPr>
+          <w:p>
+            <w:r/>
+            <w:r>
+              <w:rPr>
+                <w:rFonts w:ascii="Arial" w:hAnsi="Arial"/>
+                <w:b/>
+                <w:color w:val="FFFFFF"/>
+                <w:sz w:val="20"/>
+              </w:rPr>
               <w:t>as_of_date</w:t>
             </w:r>
           </w:p>
@@ -4209,7 +4229,7 @@
       <w:tr>
         <w:tc>
           <w:tcPr>
-            <w:tcW w:type="dxa" w:w="1337"/>
+            <w:tcW w:type="dxa" w:w="1170"/>
             <w:vAlign w:val="center"/>
           </w:tcPr>
           <w:p>
@@ -4225,7 +4245,7 @@
         </w:tc>
         <w:tc>
           <w:tcPr>
-            <w:tcW w:type="dxa" w:w="1337"/>
+            <w:tcW w:type="dxa" w:w="1170"/>
             <w:vAlign w:val="center"/>
           </w:tcPr>
           <w:p>
@@ -4241,7 +4261,7 @@
         </w:tc>
         <w:tc>
           <w:tcPr>
-            <w:tcW w:type="dxa" w:w="1337"/>
+            <w:tcW w:type="dxa" w:w="1170"/>
             <w:vAlign w:val="center"/>
           </w:tcPr>
           <w:p>
@@ -4257,7 +4277,7 @@
         </w:tc>
         <w:tc>
           <w:tcPr>
-            <w:tcW w:type="dxa" w:w="1337"/>
+            <w:tcW w:type="dxa" w:w="1170"/>
             <w:vAlign w:val="center"/>
           </w:tcPr>
           <w:p>
@@ -4273,7 +4293,7 @@
         </w:tc>
         <w:tc>
           <w:tcPr>
-            <w:tcW w:type="dxa" w:w="1337"/>
+            <w:tcW w:type="dxa" w:w="1170"/>
             <w:vAlign w:val="center"/>
           </w:tcPr>
           <w:p>
@@ -4289,33 +4309,49 @@
         </w:tc>
         <w:tc>
           <w:tcPr>
-            <w:tcW w:type="dxa" w:w="1337"/>
-            <w:vAlign w:val="center"/>
-          </w:tcPr>
-          <w:p>
-            <w:r/>
-            <w:r>
-              <w:rPr>
-                <w:rFonts w:ascii="Arial" w:hAnsi="Arial"/>
-                <w:sz w:val="20"/>
-              </w:rPr>
-              <w:t>Current environment (base scenario). Anchored to a low / improving arrears backdrop (qualitative assumption from RBA FSR) and an average property-cycle softness score of 2.73 (real, ABS building approvals).</w:t>
-            </w:r>
-          </w:p>
-        </w:tc>
-        <w:tc>
-          <w:tcPr>
-            <w:tcW w:type="dxa" w:w="1337"/>
-            <w:vAlign w:val="center"/>
-          </w:tcPr>
-          <w:p>
-            <w:r/>
-            <w:r>
-              <w:rPr>
-                <w:rFonts w:ascii="Arial" w:hAnsi="Arial"/>
-                <w:sz w:val="20"/>
-              </w:rPr>
-              <w:t>2026-06-11</w:t>
+            <w:tcW w:type="dxa" w:w="1170"/>
+            <w:vAlign w:val="center"/>
+          </w:tcPr>
+          <w:p>
+            <w:r/>
+            <w:r>
+              <w:rPr>
+                <w:rFonts w:ascii="Arial" w:hAnsi="Arial"/>
+                <w:sz w:val="20"/>
+              </w:rPr>
+              <w:t>Current environment, no recession overlay: GDP growth around trend, unemployment broadly stable, house prices at latest observed levels.</w:t>
+            </w:r>
+          </w:p>
+        </w:tc>
+        <w:tc>
+          <w:tcPr>
+            <w:tcW w:type="dxa" w:w="1170"/>
+            <w:vAlign w:val="center"/>
+          </w:tcPr>
+          <w:p>
+            <w:r/>
+            <w:r>
+              <w:rPr>
+                <w:rFonts w:ascii="Arial" w:hAnsi="Arial"/>
+                <w:sz w:val="20"/>
+              </w:rPr>
+              <w:t>Current environment (base scenario). Anchored to a low / improving arrears backdrop (qualitative assumption from RBA FSR) and an average property-cycle softness score of 2.73 (real, ABS building approvals). No diversification benefit assumed (APG 113 para 92).</w:t>
+            </w:r>
+          </w:p>
+        </w:tc>
+        <w:tc>
+          <w:tcPr>
+            <w:tcW w:type="dxa" w:w="1170"/>
+            <w:vAlign w:val="center"/>
+          </w:tcPr>
+          <w:p>
+            <w:r/>
+            <w:r>
+              <w:rPr>
+                <w:rFonts w:ascii="Arial" w:hAnsi="Arial"/>
+                <w:sz w:val="20"/>
+              </w:rPr>
+              <w:t>2026-06-12</w:t>
             </w:r>
           </w:p>
         </w:tc>
@@ -4323,7 +4359,7 @@
       <w:tr>
         <w:tc>
           <w:tcPr>
-            <w:tcW w:type="dxa" w:w="1337"/>
+            <w:tcW w:type="dxa" w:w="1170"/>
             <w:shd w:val="clear" w:color="auto" w:fill="F2F2F2"/>
             <w:vAlign w:val="center"/>
           </w:tcPr>
@@ -4340,7 +4376,7 @@
         </w:tc>
         <w:tc>
           <w:tcPr>
-            <w:tcW w:type="dxa" w:w="1337"/>
+            <w:tcW w:type="dxa" w:w="1170"/>
             <w:shd w:val="clear" w:color="auto" w:fill="F2F2F2"/>
             <w:vAlign w:val="center"/>
           </w:tcPr>
@@ -4357,7 +4393,7 @@
         </w:tc>
         <w:tc>
           <w:tcPr>
-            <w:tcW w:type="dxa" w:w="1337"/>
+            <w:tcW w:type="dxa" w:w="1170"/>
             <w:shd w:val="clear" w:color="auto" w:fill="F2F2F2"/>
             <w:vAlign w:val="center"/>
           </w:tcPr>
@@ -4374,7 +4410,7 @@
         </w:tc>
         <w:tc>
           <w:tcPr>
-            <w:tcW w:type="dxa" w:w="1337"/>
+            <w:tcW w:type="dxa" w:w="1170"/>
             <w:shd w:val="clear" w:color="auto" w:fill="F2F2F2"/>
             <w:vAlign w:val="center"/>
           </w:tcPr>
@@ -4391,7 +4427,7 @@
         </w:tc>
         <w:tc>
           <w:tcPr>
-            <w:tcW w:type="dxa" w:w="1337"/>
+            <w:tcW w:type="dxa" w:w="1170"/>
             <w:shd w:val="clear" w:color="auto" w:fill="F2F2F2"/>
             <w:vAlign w:val="center"/>
           </w:tcPr>
@@ -4408,35 +4444,52 @@
         </w:tc>
         <w:tc>
           <w:tcPr>
-            <w:tcW w:type="dxa" w:w="1337"/>
-            <w:shd w:val="clear" w:color="auto" w:fill="F2F2F2"/>
-            <w:vAlign w:val="center"/>
-          </w:tcPr>
-          <w:p>
-            <w:r/>
-            <w:r>
-              <w:rPr>
-                <w:rFonts w:ascii="Arial" w:hAnsi="Arial"/>
-                <w:sz w:val="20"/>
-              </w:rPr>
-              <w:t>ASSUMPTION (scenario parameter) — illustrative mild downturn for conservative portfolio calibration.</w:t>
-            </w:r>
-          </w:p>
-        </w:tc>
-        <w:tc>
-          <w:tcPr>
-            <w:tcW w:type="dxa" w:w="1337"/>
-            <w:shd w:val="clear" w:color="auto" w:fill="F2F2F2"/>
-            <w:vAlign w:val="center"/>
-          </w:tcPr>
-          <w:p>
-            <w:r/>
-            <w:r>
-              <w:rPr>
-                <w:rFonts w:ascii="Arial" w:hAnsi="Arial"/>
-                <w:sz w:val="20"/>
-              </w:rPr>
-              <w:t>2026-06-11</w:t>
+            <w:tcW w:type="dxa" w:w="1170"/>
+            <w:shd w:val="clear" w:color="auto" w:fill="F2F2F2"/>
+            <w:vAlign w:val="center"/>
+          </w:tcPr>
+          <w:p>
+            <w:r/>
+            <w:r>
+              <w:rPr>
+                <w:rFonts w:ascii="Arial" w:hAnsi="Arial"/>
+                <w:sz w:val="20"/>
+              </w:rPr>
+              <w:t>Basel CRE36.51 mandatory minimum — two consecutive quarters of zero GDP growth; unemployment +~1.0-1.5pp; house prices ~-5 to -10%.</w:t>
+            </w:r>
+          </w:p>
+        </w:tc>
+        <w:tc>
+          <w:tcPr>
+            <w:tcW w:type="dxa" w:w="1170"/>
+            <w:shd w:val="clear" w:color="auto" w:fill="F2F2F2"/>
+            <w:vAlign w:val="center"/>
+          </w:tcPr>
+          <w:p>
+            <w:r/>
+            <w:r>
+              <w:rPr>
+                <w:rFonts w:ascii="Arial" w:hAnsi="Arial"/>
+                <w:sz w:val="20"/>
+              </w:rPr>
+              <w:t>ASSUMPTION (scenario parameter) — mild recession = Basel CRE36.51 two-quarters-zero-growth minimum, for conservative portfolio calibration. No diversification benefit assumed (APG 113 para 92).</w:t>
+            </w:r>
+          </w:p>
+        </w:tc>
+        <w:tc>
+          <w:tcPr>
+            <w:tcW w:type="dxa" w:w="1170"/>
+            <w:shd w:val="clear" w:color="auto" w:fill="F2F2F2"/>
+            <w:vAlign w:val="center"/>
+          </w:tcPr>
+          <w:p>
+            <w:r/>
+            <w:r>
+              <w:rPr>
+                <w:rFonts w:ascii="Arial" w:hAnsi="Arial"/>
+                <w:sz w:val="20"/>
+              </w:rPr>
+              <w:t>2026-06-12</w:t>
             </w:r>
           </w:p>
         </w:tc>
@@ -4444,7 +4497,7 @@
       <w:tr>
         <w:tc>
           <w:tcPr>
-            <w:tcW w:type="dxa" w:w="1337"/>
+            <w:tcW w:type="dxa" w:w="1170"/>
             <w:vAlign w:val="center"/>
           </w:tcPr>
           <w:p>
@@ -4460,7 +4513,7 @@
         </w:tc>
         <w:tc>
           <w:tcPr>
-            <w:tcW w:type="dxa" w:w="1337"/>
+            <w:tcW w:type="dxa" w:w="1170"/>
             <w:vAlign w:val="center"/>
           </w:tcPr>
           <w:p>
@@ -4476,7 +4529,7 @@
         </w:tc>
         <w:tc>
           <w:tcPr>
-            <w:tcW w:type="dxa" w:w="1337"/>
+            <w:tcW w:type="dxa" w:w="1170"/>
             <w:vAlign w:val="center"/>
           </w:tcPr>
           <w:p>
@@ -4492,7 +4545,7 @@
         </w:tc>
         <w:tc>
           <w:tcPr>
-            <w:tcW w:type="dxa" w:w="1337"/>
+            <w:tcW w:type="dxa" w:w="1170"/>
             <w:vAlign w:val="center"/>
           </w:tcPr>
           <w:p>
@@ -4508,7 +4561,7 @@
         </w:tc>
         <w:tc>
           <w:tcPr>
-            <w:tcW w:type="dxa" w:w="1337"/>
+            <w:tcW w:type="dxa" w:w="1170"/>
             <w:vAlign w:val="center"/>
           </w:tcPr>
           <w:p>
@@ -4524,33 +4577,49 @@
         </w:tc>
         <w:tc>
           <w:tcPr>
-            <w:tcW w:type="dxa" w:w="1337"/>
-            <w:vAlign w:val="center"/>
-          </w:tcPr>
-          <w:p>
-            <w:r/>
-            <w:r>
-              <w:rPr>
-                <w:rFonts w:ascii="Arial" w:hAnsi="Arial"/>
-                <w:sz w:val="20"/>
-              </w:rPr>
-              <w:t>ASSUMPTION (scenario parameter) — illustrative moderate downturn for stressed pricing and EL scenario analysis.</w:t>
-            </w:r>
-          </w:p>
-        </w:tc>
-        <w:tc>
-          <w:tcPr>
-            <w:tcW w:type="dxa" w:w="1337"/>
-            <w:vAlign w:val="center"/>
-          </w:tcPr>
-          <w:p>
-            <w:r/>
-            <w:r>
-              <w:rPr>
-                <w:rFonts w:ascii="Arial" w:hAnsi="Arial"/>
-                <w:sz w:val="20"/>
-              </w:rPr>
-              <w:t>2026-06-11</w:t>
+            <w:tcW w:type="dxa" w:w="1170"/>
+            <w:vAlign w:val="center"/>
+          </w:tcPr>
+          <w:p>
+            <w:r/>
+            <w:r>
+              <w:rPr>
+                <w:rFonts w:ascii="Arial" w:hAnsi="Arial"/>
+                <w:sz w:val="20"/>
+              </w:rPr>
+              <w:t>Deeper recession: multi-quarter contraction; unemployment +~2-3pp; house prices ~-10 to -15%.</w:t>
+            </w:r>
+          </w:p>
+        </w:tc>
+        <w:tc>
+          <w:tcPr>
+            <w:tcW w:type="dxa" w:w="1170"/>
+            <w:vAlign w:val="center"/>
+          </w:tcPr>
+          <w:p>
+            <w:r/>
+            <w:r>
+              <w:rPr>
+                <w:rFonts w:ascii="Arial" w:hAnsi="Arial"/>
+                <w:sz w:val="20"/>
+              </w:rPr>
+              <w:t>ASSUMPTION (scenario parameter) — illustrative moderate downturn for stressed pricing and EL scenario analysis. No diversification benefit assumed (APG 113 para 92).</w:t>
+            </w:r>
+          </w:p>
+        </w:tc>
+        <w:tc>
+          <w:tcPr>
+            <w:tcW w:type="dxa" w:w="1170"/>
+            <w:vAlign w:val="center"/>
+          </w:tcPr>
+          <w:p>
+            <w:r/>
+            <w:r>
+              <w:rPr>
+                <w:rFonts w:ascii="Arial" w:hAnsi="Arial"/>
+                <w:sz w:val="20"/>
+              </w:rPr>
+              <w:t>2026-06-12</w:t>
             </w:r>
           </w:p>
         </w:tc>
@@ -4558,7 +4627,7 @@
       <w:tr>
         <w:tc>
           <w:tcPr>
-            <w:tcW w:type="dxa" w:w="1337"/>
+            <w:tcW w:type="dxa" w:w="1170"/>
             <w:shd w:val="clear" w:color="auto" w:fill="F2F2F2"/>
             <w:vAlign w:val="center"/>
           </w:tcPr>
@@ -4575,7 +4644,7 @@
         </w:tc>
         <w:tc>
           <w:tcPr>
-            <w:tcW w:type="dxa" w:w="1337"/>
+            <w:tcW w:type="dxa" w:w="1170"/>
             <w:shd w:val="clear" w:color="auto" w:fill="F2F2F2"/>
             <w:vAlign w:val="center"/>
           </w:tcPr>
@@ -4592,7 +4661,7 @@
         </w:tc>
         <w:tc>
           <w:tcPr>
-            <w:tcW w:type="dxa" w:w="1337"/>
+            <w:tcW w:type="dxa" w:w="1170"/>
             <w:shd w:val="clear" w:color="auto" w:fill="F2F2F2"/>
             <w:vAlign w:val="center"/>
           </w:tcPr>
@@ -4609,7 +4678,7 @@
         </w:tc>
         <w:tc>
           <w:tcPr>
-            <w:tcW w:type="dxa" w:w="1337"/>
+            <w:tcW w:type="dxa" w:w="1170"/>
             <w:shd w:val="clear" w:color="auto" w:fill="F2F2F2"/>
             <w:vAlign w:val="center"/>
           </w:tcPr>
@@ -4626,7 +4695,7 @@
         </w:tc>
         <w:tc>
           <w:tcPr>
-            <w:tcW w:type="dxa" w:w="1337"/>
+            <w:tcW w:type="dxa" w:w="1170"/>
             <w:shd w:val="clear" w:color="auto" w:fill="F2F2F2"/>
             <w:vAlign w:val="center"/>
           </w:tcPr>
@@ -4643,35 +4712,52 @@
         </w:tc>
         <w:tc>
           <w:tcPr>
-            <w:tcW w:type="dxa" w:w="1337"/>
-            <w:shd w:val="clear" w:color="auto" w:fill="F2F2F2"/>
-            <w:vAlign w:val="center"/>
-          </w:tcPr>
-          <w:p>
-            <w:r/>
-            <w:r>
-              <w:rPr>
-                <w:rFonts w:ascii="Arial" w:hAnsi="Arial"/>
-                <w:sz w:val="20"/>
-              </w:rPr>
-              <w:t>ASSUMPTION (scenario parameter) — illustrative severe downturn; not a calibrated regulatory stress parameter.</w:t>
-            </w:r>
-          </w:p>
-        </w:tc>
-        <w:tc>
-          <w:tcPr>
-            <w:tcW w:type="dxa" w:w="1337"/>
-            <w:shd w:val="clear" w:color="auto" w:fill="F2F2F2"/>
-            <w:vAlign w:val="center"/>
-          </w:tcPr>
-          <w:p>
-            <w:r/>
-            <w:r>
-              <w:rPr>
-                <w:rFonts w:ascii="Arial" w:hAnsi="Arial"/>
-                <w:sz w:val="20"/>
-              </w:rPr>
-              <w:t>2026-06-11</w:t>
+            <w:tcW w:type="dxa" w:w="1170"/>
+            <w:shd w:val="clear" w:color="auto" w:fill="F2F2F2"/>
+            <w:vAlign w:val="center"/>
+          </w:tcPr>
+          <w:p>
+            <w:r/>
+            <w:r>
+              <w:rPr>
+                <w:rFonts w:ascii="Arial" w:hAnsi="Arial"/>
+                <w:sz w:val="20"/>
+              </w:rPr>
+              <w:t>GFC-like severe-but-plausible path: deep multi-quarter contraction; unemployment +~3-4pp; house prices ~-20 to -30%.</w:t>
+            </w:r>
+          </w:p>
+        </w:tc>
+        <w:tc>
+          <w:tcPr>
+            <w:tcW w:type="dxa" w:w="1170"/>
+            <w:shd w:val="clear" w:color="auto" w:fill="F2F2F2"/>
+            <w:vAlign w:val="center"/>
+          </w:tcPr>
+          <w:p>
+            <w:r/>
+            <w:r>
+              <w:rPr>
+                <w:rFonts w:ascii="Arial" w:hAnsi="Arial"/>
+                <w:sz w:val="20"/>
+              </w:rPr>
+              <w:t>ASSUMPTION (scenario parameter) — illustrative severe downturn; not a calibrated regulatory stress parameter. No diversification benefit assumed (APG 113 para 92).</w:t>
+            </w:r>
+          </w:p>
+        </w:tc>
+        <w:tc>
+          <w:tcPr>
+            <w:tcW w:type="dxa" w:w="1170"/>
+            <w:shd w:val="clear" w:color="auto" w:fill="F2F2F2"/>
+            <w:vAlign w:val="center"/>
+          </w:tcPr>
+          <w:p>
+            <w:r/>
+            <w:r>
+              <w:rPr>
+                <w:rFonts w:ascii="Arial" w:hAnsi="Arial"/>
+                <w:sz w:val="20"/>
+              </w:rPr>
+              <w:t>2026-06-12</w:t>
             </w:r>
           </w:p>
         </w:tc>
@@ -5437,7 +5523,7 @@
                 <w:rFonts w:ascii="Arial" w:hAnsi="Arial"/>
                 <w:sz w:val="20"/>
               </w:rPr>
-              <w:t>2026-06-11T23:56:03+00:00</w:t>
+              <w:t>2026-06-15T04:40:20+00:00</w:t>
             </w:r>
           </w:p>
         </w:tc>
@@ -5584,7 +5670,7 @@
                 <w:rFonts w:ascii="Arial" w:hAnsi="Arial"/>
                 <w:sz w:val="20"/>
               </w:rPr>
-              <w:t>2026-06-11T23:56:06+00:00</w:t>
+              <w:t>2026-06-15T04:40:23+00:00</w:t>
             </w:r>
           </w:p>
         </w:tc>
@@ -5879,7 +5965,7 @@
                 <w:rFonts w:ascii="Arial" w:hAnsi="Arial"/>
                 <w:sz w:val="20"/>
               </w:rPr>
-              <w:t>2026-06-11T23:56:05+00:00</w:t>
+              <w:t>2026-06-15T04:40:21+00:00</w:t>
             </w:r>
           </w:p>
         </w:tc>
@@ -6029,7 +6115,7 @@
                 <w:rFonts w:ascii="Arial" w:hAnsi="Arial"/>
                 <w:sz w:val="20"/>
               </w:rPr>
-              <w:t>2026-06-11T23:56:04+00:00</w:t>
+              <w:t>2026-06-15T04:40:21+00:00</w:t>
             </w:r>
           </w:p>
         </w:tc>
@@ -6762,7 +6848,7 @@
                 <w:rFonts w:ascii="Arial" w:hAnsi="Arial"/>
                 <w:sz w:val="20"/>
               </w:rPr>
-              <w:t>2026-06-11T23:56:06+00:00</w:t>
+              <w:t>2026-06-15T04:40:22+00:00</w:t>
             </w:r>
           </w:p>
         </w:tc>
@@ -7643,7 +7729,7 @@
                 <w:rFonts w:ascii="Arial" w:hAnsi="Arial"/>
                 <w:sz w:val="20"/>
               </w:rPr>
-              <w:t>2026-06-11T23:56:07+00:00</w:t>
+              <w:t>2026-06-15T04:40:25+00:00</w:t>
             </w:r>
           </w:p>
         </w:tc>
@@ -7793,7 +7879,7 @@
                 <w:rFonts w:ascii="Arial" w:hAnsi="Arial"/>
                 <w:sz w:val="20"/>
               </w:rPr>
-              <w:t>2026-06-11T23:56:08+00:00</w:t>
+              <w:t>2026-06-15T04:40:25+00:00</w:t>
             </w:r>
           </w:p>
         </w:tc>
@@ -7940,7 +8026,7 @@
                 <w:rFonts w:ascii="Arial" w:hAnsi="Arial"/>
                 <w:sz w:val="20"/>
               </w:rPr>
-              <w:t>2026-06-11T23:56:09+00:00</w:t>
+              <w:t>2026-06-15T04:40:26+00:00</w:t>
             </w:r>
           </w:p>
         </w:tc>
@@ -8090,7 +8176,7 @@
                 <w:rFonts w:ascii="Arial" w:hAnsi="Arial"/>
                 <w:sz w:val="20"/>
               </w:rPr>
-              <w:t>2026-06-11T23:56:07+00:00</w:t>
+              <w:t>2026-06-15T04:40:24+00:00</w:t>
             </w:r>
           </w:p>
         </w:tc>
@@ -8107,7 +8193,7 @@
                 <w:rFonts w:ascii="Arial" w:hAnsi="Arial"/>
                 <w:sz w:val="20"/>
               </w:rPr>
-              <w:t>302081</w:t>
+              <w:t>302148</w:t>
             </w:r>
           </w:p>
         </w:tc>
@@ -9574,7 +9660,7 @@
                 <w:rFonts w:ascii="Arial" w:hAnsi="Arial"/>
                 <w:sz w:val="20"/>
               </w:rPr>
-              <w:t>2026-06-12T09:56:11</w:t>
+              <w:t>2026-06-15T14:40:29</w:t>
             </w:r>
           </w:p>
         </w:tc>
@@ -9677,7 +9763,7 @@
                 <w:rFonts w:ascii="Arial" w:hAnsi="Arial"/>
                 <w:sz w:val="20"/>
               </w:rPr>
-              <w:t>2026-06-12T09:56:11</w:t>
+              <w:t>2026-06-15T14:40:29</w:t>
             </w:r>
           </w:p>
         </w:tc>
@@ -9776,7 +9862,7 @@
                 <w:rFonts w:ascii="Arial" w:hAnsi="Arial"/>
                 <w:sz w:val="20"/>
               </w:rPr>
-              <w:t>2026-06-12T09:56:11</w:t>
+              <w:t>2026-06-15T14:40:29</w:t>
             </w:r>
           </w:p>
         </w:tc>
@@ -9879,7 +9965,7 @@
                 <w:rFonts w:ascii="Arial" w:hAnsi="Arial"/>
                 <w:sz w:val="20"/>
               </w:rPr>
-              <w:t>2026-06-12T09:56:11</w:t>
+              <w:t>2026-06-15T14:40:29</w:t>
             </w:r>
           </w:p>
         </w:tc>
@@ -9978,7 +10064,7 @@
                 <w:rFonts w:ascii="Arial" w:hAnsi="Arial"/>
                 <w:sz w:val="20"/>
               </w:rPr>
-              <w:t>2026-06-12T09:56:11</w:t>
+              <w:t>2026-06-15T14:40:29</w:t>
             </w:r>
           </w:p>
         </w:tc>
@@ -10081,7 +10167,7 @@
                 <w:rFonts w:ascii="Arial" w:hAnsi="Arial"/>
                 <w:sz w:val="20"/>
               </w:rPr>
-              <w:t>2026-06-12T09:56:11</w:t>
+              <w:t>2026-06-15T14:40:29</w:t>
             </w:r>
           </w:p>
         </w:tc>
@@ -10180,7 +10266,7 @@
                 <w:rFonts w:ascii="Arial" w:hAnsi="Arial"/>
                 <w:sz w:val="20"/>
               </w:rPr>
-              <w:t>2026-06-12T09:56:11</w:t>
+              <w:t>2026-06-15T14:40:29</w:t>
             </w:r>
           </w:p>
         </w:tc>
@@ -10283,7 +10369,7 @@
                 <w:rFonts w:ascii="Arial" w:hAnsi="Arial"/>
                 <w:sz w:val="20"/>
               </w:rPr>
-              <w:t>2026-06-12T09:56:11</w:t>
+              <w:t>2026-06-15T14:40:29</w:t>
             </w:r>
           </w:p>
         </w:tc>
@@ -10545,7 +10631,7 @@
                 <w:rFonts w:ascii="Arial" w:hAnsi="Arial"/>
                 <w:sz w:val="20"/>
               </w:rPr>
-              <w:t>Scenario multipliers for PD, LGD, and CCF plus property haircuts and scenario notes.</w:t>
+              <w:t>Scenario multipliers for PD, LGD, and CCF plus property haircuts, a per-scenario macro-path note (mild = Basel CRE36.51), and scenario notes (incl. the no-diversification assumption).</w:t>
             </w:r>
           </w:p>
         </w:tc>
@@ -11062,7 +11148,7 @@
                 <w:rFonts w:ascii="Arial" w:hAnsi="Arial"/>
                 <w:sz w:val="20"/>
               </w:rPr>
-              <w:t>2026-06-12</w:t>
+              <w:t>2026-06-15</w:t>
             </w:r>
           </w:p>
         </w:tc>
@@ -11225,7 +11311,7 @@
                 <w:rFonts w:ascii="Arial" w:hAnsi="Arial"/>
                 <w:sz w:val="20"/>
               </w:rPr>
-              <w:t>2026-06-12</w:t>
+              <w:t>2026-06-15</w:t>
             </w:r>
           </w:p>
         </w:tc>
@@ -11396,7 +11482,7 @@
                 <w:rFonts w:ascii="Arial" w:hAnsi="Arial"/>
                 <w:sz w:val="20"/>
               </w:rPr>
-              <w:t>2026-06-12</w:t>
+              <w:t>2026-06-15</w:t>
             </w:r>
           </w:p>
         </w:tc>
@@ -11559,7 +11645,7 @@
                 <w:rFonts w:ascii="Arial" w:hAnsi="Arial"/>
                 <w:sz w:val="20"/>
               </w:rPr>
-              <w:t>2026-06-12</w:t>
+              <w:t>2026-06-15</w:t>
             </w:r>
           </w:p>
         </w:tc>
@@ -11730,7 +11816,7 @@
                 <w:rFonts w:ascii="Arial" w:hAnsi="Arial"/>
                 <w:sz w:val="20"/>
               </w:rPr>
-              <w:t>2026-06-12</w:t>
+              <w:t>2026-06-15</w:t>
             </w:r>
           </w:p>
         </w:tc>
@@ -11893,7 +11979,7 @@
                 <w:rFonts w:ascii="Arial" w:hAnsi="Arial"/>
                 <w:sz w:val="20"/>
               </w:rPr>
-              <w:t>2026-06-12</w:t>
+              <w:t>2026-06-15</w:t>
             </w:r>
           </w:p>
         </w:tc>
@@ -12064,7 +12150,7 @@
                 <w:rFonts w:ascii="Arial" w:hAnsi="Arial"/>
                 <w:sz w:val="20"/>
               </w:rPr>
-              <w:t>2026-06-12</w:t>
+              <w:t>2026-06-15</w:t>
             </w:r>
           </w:p>
         </w:tc>
@@ -12227,7 +12313,7 @@
                 <w:rFonts w:ascii="Arial" w:hAnsi="Arial"/>
                 <w:sz w:val="20"/>
               </w:rPr>
-              <w:t>2026-06-12</w:t>
+              <w:t>2026-06-15</w:t>
             </w:r>
           </w:p>
         </w:tc>
@@ -12398,7 +12484,7 @@
                 <w:rFonts w:ascii="Arial" w:hAnsi="Arial"/>
                 <w:sz w:val="20"/>
               </w:rPr>
-              <w:t>2026-06-12</w:t>
+              <w:t>2026-06-15</w:t>
             </w:r>
           </w:p>
         </w:tc>
@@ -12561,7 +12647,7 @@
                 <w:rFonts w:ascii="Arial" w:hAnsi="Arial"/>
                 <w:sz w:val="20"/>
               </w:rPr>
-              <w:t>2026-06-12</w:t>
+              <w:t>2026-06-15</w:t>
             </w:r>
           </w:p>
         </w:tc>
@@ -12732,7 +12818,7 @@
                 <w:rFonts w:ascii="Arial" w:hAnsi="Arial"/>
                 <w:sz w:val="20"/>
               </w:rPr>
-              <w:t>2026-06-12</w:t>
+              <w:t>2026-06-15</w:t>
             </w:r>
           </w:p>
         </w:tc>
@@ -12895,7 +12981,7 @@
                 <w:rFonts w:ascii="Arial" w:hAnsi="Arial"/>
                 <w:sz w:val="20"/>
               </w:rPr>
-              <w:t>2026-06-12</w:t>
+              <w:t>2026-06-15</w:t>
             </w:r>
           </w:p>
         </w:tc>
@@ -13066,7 +13152,7 @@
                 <w:rFonts w:ascii="Arial" w:hAnsi="Arial"/>
                 <w:sz w:val="20"/>
               </w:rPr>
-              <w:t>2026-06-12</w:t>
+              <w:t>2026-06-15</w:t>
             </w:r>
           </w:p>
         </w:tc>
@@ -13229,7 +13315,7 @@
                 <w:rFonts w:ascii="Arial" w:hAnsi="Arial"/>
                 <w:sz w:val="20"/>
               </w:rPr>
-              <w:t>2026-06-12</w:t>
+              <w:t>2026-06-15</w:t>
             </w:r>
           </w:p>
         </w:tc>
@@ -13400,7 +13486,7 @@
                 <w:rFonts w:ascii="Arial" w:hAnsi="Arial"/>
                 <w:sz w:val="20"/>
               </w:rPr>
-              <w:t>2026-06-12</w:t>
+              <w:t>2026-06-15</w:t>
             </w:r>
           </w:p>
         </w:tc>
@@ -13563,7 +13649,7 @@
                 <w:rFonts w:ascii="Arial" w:hAnsi="Arial"/>
                 <w:sz w:val="20"/>
               </w:rPr>
-              <w:t>2026-06-12</w:t>
+              <w:t>2026-06-15</w:t>
             </w:r>
           </w:p>
         </w:tc>
@@ -13734,7 +13820,7 @@
                 <w:rFonts w:ascii="Arial" w:hAnsi="Arial"/>
                 <w:sz w:val="20"/>
               </w:rPr>
-              <w:t>2026-06-12</w:t>
+              <w:t>2026-06-15</w:t>
             </w:r>
           </w:p>
         </w:tc>
@@ -13897,7 +13983,7 @@
                 <w:rFonts w:ascii="Arial" w:hAnsi="Arial"/>
                 <w:sz w:val="20"/>
               </w:rPr>
-              <w:t>2026-06-12</w:t>
+              <w:t>2026-06-15</w:t>
             </w:r>
           </w:p>
         </w:tc>
@@ -14292,7 +14378,7 @@
                 <w:rFonts w:ascii="Arial" w:hAnsi="Arial"/>
                 <w:sz w:val="20"/>
               </w:rPr>
-              <w:t>2026-06-12</w:t>
+              <w:t>2026-06-15</w:t>
             </w:r>
           </w:p>
         </w:tc>
@@ -14455,7 +14541,7 @@
                 <w:rFonts w:ascii="Arial" w:hAnsi="Arial"/>
                 <w:sz w:val="20"/>
               </w:rPr>
-              <w:t>2026-06-12</w:t>
+              <w:t>2026-06-15</w:t>
             </w:r>
           </w:p>
         </w:tc>
@@ -14626,7 +14712,7 @@
                 <w:rFonts w:ascii="Arial" w:hAnsi="Arial"/>
                 <w:sz w:val="20"/>
               </w:rPr>
-              <w:t>2026-06-12</w:t>
+              <w:t>2026-06-15</w:t>
             </w:r>
           </w:p>
         </w:tc>
@@ -14789,7 +14875,7 @@
                 <w:rFonts w:ascii="Arial" w:hAnsi="Arial"/>
                 <w:sz w:val="20"/>
               </w:rPr>
-              <w:t>2026-06-12</w:t>
+              <w:t>2026-06-15</w:t>
             </w:r>
           </w:p>
         </w:tc>
@@ -14960,7 +15046,7 @@
                 <w:rFonts w:ascii="Arial" w:hAnsi="Arial"/>
                 <w:sz w:val="20"/>
               </w:rPr>
-              <w:t>2026-06-12</w:t>
+              <w:t>2026-06-15</w:t>
             </w:r>
           </w:p>
         </w:tc>
@@ -15130,18 +15216,19 @@
         <w:tblLook w:firstColumn="1" w:firstRow="1" w:lastColumn="0" w:lastRow="0" w:noHBand="0" w:noVBand="1" w:val="04A0"/>
       </w:tblPr>
       <w:tblGrid>
-        <w:gridCol w:w="1337"/>
-        <w:gridCol w:w="1337"/>
-        <w:gridCol w:w="1337"/>
-        <w:gridCol w:w="1337"/>
-        <w:gridCol w:w="1337"/>
-        <w:gridCol w:w="1337"/>
-        <w:gridCol w:w="1337"/>
+        <w:gridCol w:w="1170"/>
+        <w:gridCol w:w="1170"/>
+        <w:gridCol w:w="1170"/>
+        <w:gridCol w:w="1170"/>
+        <w:gridCol w:w="1170"/>
+        <w:gridCol w:w="1170"/>
+        <w:gridCol w:w="1170"/>
+        <w:gridCol w:w="1170"/>
       </w:tblGrid>
       <w:tr>
         <w:tc>
           <w:tcPr>
-            <w:tcW w:type="dxa" w:w="1337"/>
+            <w:tcW w:type="dxa" w:w="1170"/>
             <w:shd w:val="clear" w:color="auto" w:fill="1F4E79"/>
             <w:vAlign w:val="center"/>
           </w:tcPr>
@@ -15160,7 +15247,7 @@
         </w:tc>
         <w:tc>
           <w:tcPr>
-            <w:tcW w:type="dxa" w:w="1337"/>
+            <w:tcW w:type="dxa" w:w="1170"/>
             <w:shd w:val="clear" w:color="auto" w:fill="1F4E79"/>
             <w:vAlign w:val="center"/>
           </w:tcPr>
@@ -15179,7 +15266,7 @@
         </w:tc>
         <w:tc>
           <w:tcPr>
-            <w:tcW w:type="dxa" w:w="1337"/>
+            <w:tcW w:type="dxa" w:w="1170"/>
             <w:shd w:val="clear" w:color="auto" w:fill="1F4E79"/>
             <w:vAlign w:val="center"/>
           </w:tcPr>
@@ -15198,7 +15285,7 @@
         </w:tc>
         <w:tc>
           <w:tcPr>
-            <w:tcW w:type="dxa" w:w="1337"/>
+            <w:tcW w:type="dxa" w:w="1170"/>
             <w:shd w:val="clear" w:color="auto" w:fill="1F4E79"/>
             <w:vAlign w:val="center"/>
           </w:tcPr>
@@ -15217,7 +15304,7 @@
         </w:tc>
         <w:tc>
           <w:tcPr>
-            <w:tcW w:type="dxa" w:w="1337"/>
+            <w:tcW w:type="dxa" w:w="1170"/>
             <w:shd w:val="clear" w:color="auto" w:fill="1F4E79"/>
             <w:vAlign w:val="center"/>
           </w:tcPr>
@@ -15236,7 +15323,7 @@
         </w:tc>
         <w:tc>
           <w:tcPr>
-            <w:tcW w:type="dxa" w:w="1337"/>
+            <w:tcW w:type="dxa" w:w="1170"/>
             <w:shd w:val="clear" w:color="auto" w:fill="1F4E79"/>
             <w:vAlign w:val="center"/>
           </w:tcPr>
@@ -15255,7 +15342,7 @@
         </w:tc>
         <w:tc>
           <w:tcPr>
-            <w:tcW w:type="dxa" w:w="1337"/>
+            <w:tcW w:type="dxa" w:w="1170"/>
             <w:shd w:val="clear" w:color="auto" w:fill="1F4E79"/>
             <w:vAlign w:val="center"/>
           </w:tcPr>
@@ -15268,6 +15355,25 @@
                 <w:color w:val="FFFFFF"/>
                 <w:sz w:val="20"/>
               </w:rPr>
+              <w:t>macro_path</w:t>
+            </w:r>
+          </w:p>
+        </w:tc>
+        <w:tc>
+          <w:tcPr>
+            <w:tcW w:type="dxa" w:w="1170"/>
+            <w:shd w:val="clear" w:color="auto" w:fill="1F4E79"/>
+            <w:vAlign w:val="center"/>
+          </w:tcPr>
+          <w:p>
+            <w:r/>
+            <w:r>
+              <w:rPr>
+                <w:rFonts w:ascii="Arial" w:hAnsi="Arial"/>
+                <w:b/>
+                <w:color w:val="FFFFFF"/>
+                <w:sz w:val="20"/>
+              </w:rPr>
               <w:t>notes</w:t>
             </w:r>
           </w:p>
@@ -15276,23 +15382,23 @@
       <w:tr>
         <w:tc>
           <w:tcPr>
-            <w:tcW w:type="dxa" w:w="1337"/>
-            <w:vAlign w:val="center"/>
-          </w:tcPr>
-          <w:p>
-            <w:r/>
-            <w:r>
-              <w:rPr>
-                <w:rFonts w:ascii="Arial" w:hAnsi="Arial"/>
-                <w:sz w:val="20"/>
-              </w:rPr>
-              <w:t>2026-06-11</w:t>
-            </w:r>
-          </w:p>
-        </w:tc>
-        <w:tc>
-          <w:tcPr>
-            <w:tcW w:type="dxa" w:w="1337"/>
+            <w:tcW w:type="dxa" w:w="1170"/>
+            <w:vAlign w:val="center"/>
+          </w:tcPr>
+          <w:p>
+            <w:r/>
+            <w:r>
+              <w:rPr>
+                <w:rFonts w:ascii="Arial" w:hAnsi="Arial"/>
+                <w:sz w:val="20"/>
+              </w:rPr>
+              <w:t>2026-06-12</w:t>
+            </w:r>
+          </w:p>
+        </w:tc>
+        <w:tc>
+          <w:tcPr>
+            <w:tcW w:type="dxa" w:w="1170"/>
             <w:vAlign w:val="center"/>
           </w:tcPr>
           <w:p>
@@ -15308,7 +15414,7 @@
         </w:tc>
         <w:tc>
           <w:tcPr>
-            <w:tcW w:type="dxa" w:w="1337"/>
+            <w:tcW w:type="dxa" w:w="1170"/>
             <w:vAlign w:val="center"/>
           </w:tcPr>
           <w:p>
@@ -15324,7 +15430,7 @@
         </w:tc>
         <w:tc>
           <w:tcPr>
-            <w:tcW w:type="dxa" w:w="1337"/>
+            <w:tcW w:type="dxa" w:w="1170"/>
             <w:vAlign w:val="center"/>
           </w:tcPr>
           <w:p>
@@ -15340,7 +15446,7 @@
         </w:tc>
         <w:tc>
           <w:tcPr>
-            <w:tcW w:type="dxa" w:w="1337"/>
+            <w:tcW w:type="dxa" w:w="1170"/>
             <w:vAlign w:val="center"/>
           </w:tcPr>
           <w:p>
@@ -15356,7 +15462,7 @@
         </w:tc>
         <w:tc>
           <w:tcPr>
-            <w:tcW w:type="dxa" w:w="1337"/>
+            <w:tcW w:type="dxa" w:w="1170"/>
             <w:vAlign w:val="center"/>
           </w:tcPr>
           <w:p>
@@ -15372,17 +15478,33 @@
         </w:tc>
         <w:tc>
           <w:tcPr>
-            <w:tcW w:type="dxa" w:w="1337"/>
-            <w:vAlign w:val="center"/>
-          </w:tcPr>
-          <w:p>
-            <w:r/>
-            <w:r>
-              <w:rPr>
-                <w:rFonts w:ascii="Arial" w:hAnsi="Arial"/>
-                <w:sz w:val="20"/>
-              </w:rPr>
-              <w:t>Current environment (base scenario). Anchored to a low / improving arrears backdrop (qualitative assumption from RBA FSR) and an average property-cycle softness score of 2.73 (real, ABS building approvals).</w:t>
+            <w:tcW w:type="dxa" w:w="1170"/>
+            <w:vAlign w:val="center"/>
+          </w:tcPr>
+          <w:p>
+            <w:r/>
+            <w:r>
+              <w:rPr>
+                <w:rFonts w:ascii="Arial" w:hAnsi="Arial"/>
+                <w:sz w:val="20"/>
+              </w:rPr>
+              <w:t>Current environment, no recession overlay: GDP growth around trend, unemployment broadly stable, house prices at latest observed levels.</w:t>
+            </w:r>
+          </w:p>
+        </w:tc>
+        <w:tc>
+          <w:tcPr>
+            <w:tcW w:type="dxa" w:w="1170"/>
+            <w:vAlign w:val="center"/>
+          </w:tcPr>
+          <w:p>
+            <w:r/>
+            <w:r>
+              <w:rPr>
+                <w:rFonts w:ascii="Arial" w:hAnsi="Arial"/>
+                <w:sz w:val="20"/>
+              </w:rPr>
+              <w:t>Current environment (base scenario). Anchored to a low / improving arrears backdrop (qualitative assumption from RBA FSR) and an average property-cycle softness score of 2.73 (real, ABS building approvals). No diversification benefit assumed (APG 113 para 92).</w:t>
             </w:r>
           </w:p>
         </w:tc>
@@ -15390,24 +15512,24 @@
       <w:tr>
         <w:tc>
           <w:tcPr>
-            <w:tcW w:type="dxa" w:w="1337"/>
-            <w:shd w:val="clear" w:color="auto" w:fill="F2F2F2"/>
-            <w:vAlign w:val="center"/>
-          </w:tcPr>
-          <w:p>
-            <w:r/>
-            <w:r>
-              <w:rPr>
-                <w:rFonts w:ascii="Arial" w:hAnsi="Arial"/>
-                <w:sz w:val="20"/>
-              </w:rPr>
-              <w:t>2026-06-11</w:t>
-            </w:r>
-          </w:p>
-        </w:tc>
-        <w:tc>
-          <w:tcPr>
-            <w:tcW w:type="dxa" w:w="1337"/>
+            <w:tcW w:type="dxa" w:w="1170"/>
+            <w:shd w:val="clear" w:color="auto" w:fill="F2F2F2"/>
+            <w:vAlign w:val="center"/>
+          </w:tcPr>
+          <w:p>
+            <w:r/>
+            <w:r>
+              <w:rPr>
+                <w:rFonts w:ascii="Arial" w:hAnsi="Arial"/>
+                <w:sz w:val="20"/>
+              </w:rPr>
+              <w:t>2026-06-12</w:t>
+            </w:r>
+          </w:p>
+        </w:tc>
+        <w:tc>
+          <w:tcPr>
+            <w:tcW w:type="dxa" w:w="1170"/>
             <w:shd w:val="clear" w:color="auto" w:fill="F2F2F2"/>
             <w:vAlign w:val="center"/>
           </w:tcPr>
@@ -15424,7 +15546,7 @@
         </w:tc>
         <w:tc>
           <w:tcPr>
-            <w:tcW w:type="dxa" w:w="1337"/>
+            <w:tcW w:type="dxa" w:w="1170"/>
             <w:shd w:val="clear" w:color="auto" w:fill="F2F2F2"/>
             <w:vAlign w:val="center"/>
           </w:tcPr>
@@ -15441,7 +15563,7 @@
         </w:tc>
         <w:tc>
           <w:tcPr>
-            <w:tcW w:type="dxa" w:w="1337"/>
+            <w:tcW w:type="dxa" w:w="1170"/>
             <w:shd w:val="clear" w:color="auto" w:fill="F2F2F2"/>
             <w:vAlign w:val="center"/>
           </w:tcPr>
@@ -15458,7 +15580,7 @@
         </w:tc>
         <w:tc>
           <w:tcPr>
-            <w:tcW w:type="dxa" w:w="1337"/>
+            <w:tcW w:type="dxa" w:w="1170"/>
             <w:shd w:val="clear" w:color="auto" w:fill="F2F2F2"/>
             <w:vAlign w:val="center"/>
           </w:tcPr>
@@ -15475,7 +15597,7 @@
         </w:tc>
         <w:tc>
           <w:tcPr>
-            <w:tcW w:type="dxa" w:w="1337"/>
+            <w:tcW w:type="dxa" w:w="1170"/>
             <w:shd w:val="clear" w:color="auto" w:fill="F2F2F2"/>
             <w:vAlign w:val="center"/>
           </w:tcPr>
@@ -15492,18 +15614,35 @@
         </w:tc>
         <w:tc>
           <w:tcPr>
-            <w:tcW w:type="dxa" w:w="1337"/>
-            <w:shd w:val="clear" w:color="auto" w:fill="F2F2F2"/>
-            <w:vAlign w:val="center"/>
-          </w:tcPr>
-          <w:p>
-            <w:r/>
-            <w:r>
-              <w:rPr>
-                <w:rFonts w:ascii="Arial" w:hAnsi="Arial"/>
-                <w:sz w:val="20"/>
-              </w:rPr>
-              <w:t>ASSUMPTION (scenario parameter) — illustrative mild downturn for conservative portfolio calibration.</w:t>
+            <w:tcW w:type="dxa" w:w="1170"/>
+            <w:shd w:val="clear" w:color="auto" w:fill="F2F2F2"/>
+            <w:vAlign w:val="center"/>
+          </w:tcPr>
+          <w:p>
+            <w:r/>
+            <w:r>
+              <w:rPr>
+                <w:rFonts w:ascii="Arial" w:hAnsi="Arial"/>
+                <w:sz w:val="20"/>
+              </w:rPr>
+              <w:t>Basel CRE36.51 mandatory minimum — two consecutive quarters of zero GDP growth; unemployment +~1.0-1.5pp; house prices ~-5 to -10%.</w:t>
+            </w:r>
+          </w:p>
+        </w:tc>
+        <w:tc>
+          <w:tcPr>
+            <w:tcW w:type="dxa" w:w="1170"/>
+            <w:shd w:val="clear" w:color="auto" w:fill="F2F2F2"/>
+            <w:vAlign w:val="center"/>
+          </w:tcPr>
+          <w:p>
+            <w:r/>
+            <w:r>
+              <w:rPr>
+                <w:rFonts w:ascii="Arial" w:hAnsi="Arial"/>
+                <w:sz w:val="20"/>
+              </w:rPr>
+              <w:t>ASSUMPTION (scenario parameter) — mild recession = Basel CRE36.51 two-quarters-zero-growth minimum, for conservative portfolio calibration. No diversification benefit assumed (APG 113 para 92).</w:t>
             </w:r>
           </w:p>
         </w:tc>
@@ -15511,23 +15650,23 @@
       <w:tr>
         <w:tc>
           <w:tcPr>
-            <w:tcW w:type="dxa" w:w="1337"/>
-            <w:vAlign w:val="center"/>
-          </w:tcPr>
-          <w:p>
-            <w:r/>
-            <w:r>
-              <w:rPr>
-                <w:rFonts w:ascii="Arial" w:hAnsi="Arial"/>
-                <w:sz w:val="20"/>
-              </w:rPr>
-              <w:t>2026-06-11</w:t>
-            </w:r>
-          </w:p>
-        </w:tc>
-        <w:tc>
-          <w:tcPr>
-            <w:tcW w:type="dxa" w:w="1337"/>
+            <w:tcW w:type="dxa" w:w="1170"/>
+            <w:vAlign w:val="center"/>
+          </w:tcPr>
+          <w:p>
+            <w:r/>
+            <w:r>
+              <w:rPr>
+                <w:rFonts w:ascii="Arial" w:hAnsi="Arial"/>
+                <w:sz w:val="20"/>
+              </w:rPr>
+              <w:t>2026-06-12</w:t>
+            </w:r>
+          </w:p>
+        </w:tc>
+        <w:tc>
+          <w:tcPr>
+            <w:tcW w:type="dxa" w:w="1170"/>
             <w:vAlign w:val="center"/>
           </w:tcPr>
           <w:p>
@@ -15543,7 +15682,7 @@
         </w:tc>
         <w:tc>
           <w:tcPr>
-            <w:tcW w:type="dxa" w:w="1337"/>
+            <w:tcW w:type="dxa" w:w="1170"/>
             <w:vAlign w:val="center"/>
           </w:tcPr>
           <w:p>
@@ -15559,7 +15698,7 @@
         </w:tc>
         <w:tc>
           <w:tcPr>
-            <w:tcW w:type="dxa" w:w="1337"/>
+            <w:tcW w:type="dxa" w:w="1170"/>
             <w:vAlign w:val="center"/>
           </w:tcPr>
           <w:p>
@@ -15575,7 +15714,7 @@
         </w:tc>
         <w:tc>
           <w:tcPr>
-            <w:tcW w:type="dxa" w:w="1337"/>
+            <w:tcW w:type="dxa" w:w="1170"/>
             <w:vAlign w:val="center"/>
           </w:tcPr>
           <w:p>
@@ -15591,7 +15730,7 @@
         </w:tc>
         <w:tc>
           <w:tcPr>
-            <w:tcW w:type="dxa" w:w="1337"/>
+            <w:tcW w:type="dxa" w:w="1170"/>
             <w:vAlign w:val="center"/>
           </w:tcPr>
           <w:p>
@@ -15607,17 +15746,33 @@
         </w:tc>
         <w:tc>
           <w:tcPr>
-            <w:tcW w:type="dxa" w:w="1337"/>
-            <w:vAlign w:val="center"/>
-          </w:tcPr>
-          <w:p>
-            <w:r/>
-            <w:r>
-              <w:rPr>
-                <w:rFonts w:ascii="Arial" w:hAnsi="Arial"/>
-                <w:sz w:val="20"/>
-              </w:rPr>
-              <w:t>ASSUMPTION (scenario parameter) — illustrative moderate downturn for stressed pricing and EL scenario analysis.</w:t>
+            <w:tcW w:type="dxa" w:w="1170"/>
+            <w:vAlign w:val="center"/>
+          </w:tcPr>
+          <w:p>
+            <w:r/>
+            <w:r>
+              <w:rPr>
+                <w:rFonts w:ascii="Arial" w:hAnsi="Arial"/>
+                <w:sz w:val="20"/>
+              </w:rPr>
+              <w:t>Deeper recession: multi-quarter contraction; unemployment +~2-3pp; house prices ~-10 to -15%.</w:t>
+            </w:r>
+          </w:p>
+        </w:tc>
+        <w:tc>
+          <w:tcPr>
+            <w:tcW w:type="dxa" w:w="1170"/>
+            <w:vAlign w:val="center"/>
+          </w:tcPr>
+          <w:p>
+            <w:r/>
+            <w:r>
+              <w:rPr>
+                <w:rFonts w:ascii="Arial" w:hAnsi="Arial"/>
+                <w:sz w:val="20"/>
+              </w:rPr>
+              <w:t>ASSUMPTION (scenario parameter) — illustrative moderate downturn for stressed pricing and EL scenario analysis. No diversification benefit assumed (APG 113 para 92).</w:t>
             </w:r>
           </w:p>
         </w:tc>
@@ -15625,24 +15780,24 @@
       <w:tr>
         <w:tc>
           <w:tcPr>
-            <w:tcW w:type="dxa" w:w="1337"/>
-            <w:shd w:val="clear" w:color="auto" w:fill="F2F2F2"/>
-            <w:vAlign w:val="center"/>
-          </w:tcPr>
-          <w:p>
-            <w:r/>
-            <w:r>
-              <w:rPr>
-                <w:rFonts w:ascii="Arial" w:hAnsi="Arial"/>
-                <w:sz w:val="20"/>
-              </w:rPr>
-              <w:t>2026-06-11</w:t>
-            </w:r>
-          </w:p>
-        </w:tc>
-        <w:tc>
-          <w:tcPr>
-            <w:tcW w:type="dxa" w:w="1337"/>
+            <w:tcW w:type="dxa" w:w="1170"/>
+            <w:shd w:val="clear" w:color="auto" w:fill="F2F2F2"/>
+            <w:vAlign w:val="center"/>
+          </w:tcPr>
+          <w:p>
+            <w:r/>
+            <w:r>
+              <w:rPr>
+                <w:rFonts w:ascii="Arial" w:hAnsi="Arial"/>
+                <w:sz w:val="20"/>
+              </w:rPr>
+              <w:t>2026-06-12</w:t>
+            </w:r>
+          </w:p>
+        </w:tc>
+        <w:tc>
+          <w:tcPr>
+            <w:tcW w:type="dxa" w:w="1170"/>
             <w:shd w:val="clear" w:color="auto" w:fill="F2F2F2"/>
             <w:vAlign w:val="center"/>
           </w:tcPr>
@@ -15659,7 +15814,7 @@
         </w:tc>
         <w:tc>
           <w:tcPr>
-            <w:tcW w:type="dxa" w:w="1337"/>
+            <w:tcW w:type="dxa" w:w="1170"/>
             <w:shd w:val="clear" w:color="auto" w:fill="F2F2F2"/>
             <w:vAlign w:val="center"/>
           </w:tcPr>
@@ -15676,7 +15831,7 @@
         </w:tc>
         <w:tc>
           <w:tcPr>
-            <w:tcW w:type="dxa" w:w="1337"/>
+            <w:tcW w:type="dxa" w:w="1170"/>
             <w:shd w:val="clear" w:color="auto" w:fill="F2F2F2"/>
             <w:vAlign w:val="center"/>
           </w:tcPr>
@@ -15693,7 +15848,7 @@
         </w:tc>
         <w:tc>
           <w:tcPr>
-            <w:tcW w:type="dxa" w:w="1337"/>
+            <w:tcW w:type="dxa" w:w="1170"/>
             <w:shd w:val="clear" w:color="auto" w:fill="F2F2F2"/>
             <w:vAlign w:val="center"/>
           </w:tcPr>
@@ -15710,7 +15865,7 @@
         </w:tc>
         <w:tc>
           <w:tcPr>
-            <w:tcW w:type="dxa" w:w="1337"/>
+            <w:tcW w:type="dxa" w:w="1170"/>
             <w:shd w:val="clear" w:color="auto" w:fill="F2F2F2"/>
             <w:vAlign w:val="center"/>
           </w:tcPr>
@@ -15727,18 +15882,35 @@
         </w:tc>
         <w:tc>
           <w:tcPr>
-            <w:tcW w:type="dxa" w:w="1337"/>
-            <w:shd w:val="clear" w:color="auto" w:fill="F2F2F2"/>
-            <w:vAlign w:val="center"/>
-          </w:tcPr>
-          <w:p>
-            <w:r/>
-            <w:r>
-              <w:rPr>
-                <w:rFonts w:ascii="Arial" w:hAnsi="Arial"/>
-                <w:sz w:val="20"/>
-              </w:rPr>
-              <w:t>ASSUMPTION (scenario parameter) — illustrative severe downturn; not a calibrated regulatory stress parameter.</w:t>
+            <w:tcW w:type="dxa" w:w="1170"/>
+            <w:shd w:val="clear" w:color="auto" w:fill="F2F2F2"/>
+            <w:vAlign w:val="center"/>
+          </w:tcPr>
+          <w:p>
+            <w:r/>
+            <w:r>
+              <w:rPr>
+                <w:rFonts w:ascii="Arial" w:hAnsi="Arial"/>
+                <w:sz w:val="20"/>
+              </w:rPr>
+              <w:t>GFC-like severe-but-plausible path: deep multi-quarter contraction; unemployment +~3-4pp; house prices ~-20 to -30%.</w:t>
+            </w:r>
+          </w:p>
+        </w:tc>
+        <w:tc>
+          <w:tcPr>
+            <w:tcW w:type="dxa" w:w="1170"/>
+            <w:shd w:val="clear" w:color="auto" w:fill="F2F2F2"/>
+            <w:vAlign w:val="center"/>
+          </w:tcPr>
+          <w:p>
+            <w:r/>
+            <w:r>
+              <w:rPr>
+                <w:rFonts w:ascii="Arial" w:hAnsi="Arial"/>
+                <w:sz w:val="20"/>
+              </w:rPr>
+              <w:t>ASSUMPTION (scenario parameter) — illustrative severe downturn; not a calibrated regulatory stress parameter. No diversification benefit assumed (APG 113 para 92).</w:t>
             </w:r>
           </w:p>
         </w:tc>
@@ -15900,7 +16072,7 @@
                 <w:rFonts w:ascii="Arial" w:hAnsi="Arial"/>
                 <w:sz w:val="20"/>
               </w:rPr>
-              <w:t>2026-06-11</w:t>
+              <w:t>2026-06-12</w:t>
             </w:r>
           </w:p>
         </w:tc>
@@ -16222,7 +16394,7 @@
                 <w:rFonts w:ascii="Arial" w:hAnsi="Arial"/>
                 <w:sz w:val="20"/>
               </w:rPr>
-              <w:t>2026-06-12</w:t>
+              <w:t>2026-06-15</w:t>
             </w:r>
           </w:p>
         </w:tc>
@@ -16384,7 +16556,7 @@
                 <w:rFonts w:ascii="Arial" w:hAnsi="Arial"/>
                 <w:sz w:val="20"/>
               </w:rPr>
-              <w:t>2026-06-12</w:t>
+              <w:t>2026-06-15</w:t>
             </w:r>
           </w:p>
         </w:tc>
@@ -16555,7 +16727,7 @@
                 <w:rFonts w:ascii="Arial" w:hAnsi="Arial"/>
                 <w:sz w:val="20"/>
               </w:rPr>
-              <w:t>2026-06-12</w:t>
+              <w:t>2026-06-15</w:t>
             </w:r>
           </w:p>
         </w:tc>
@@ -16718,7 +16890,7 @@
                 <w:rFonts w:ascii="Arial" w:hAnsi="Arial"/>
                 <w:sz w:val="20"/>
               </w:rPr>
-              <w:t>2026-06-12</w:t>
+              <w:t>2026-06-15</w:t>
             </w:r>
           </w:p>
         </w:tc>
@@ -16889,7 +17061,7 @@
                 <w:rFonts w:ascii="Arial" w:hAnsi="Arial"/>
                 <w:sz w:val="20"/>
               </w:rPr>
-              <w:t>2026-06-12</w:t>
+              <w:t>2026-06-15</w:t>
             </w:r>
           </w:p>
         </w:tc>
@@ -17052,7 +17224,7 @@
                 <w:rFonts w:ascii="Arial" w:hAnsi="Arial"/>
                 <w:sz w:val="20"/>
               </w:rPr>
-              <w:t>2026-06-12</w:t>
+              <w:t>2026-06-15</w:t>
             </w:r>
           </w:p>
         </w:tc>
@@ -17223,7 +17395,7 @@
                 <w:rFonts w:ascii="Arial" w:hAnsi="Arial"/>
                 <w:sz w:val="20"/>
               </w:rPr>
-              <w:t>2026-06-12</w:t>
+              <w:t>2026-06-15</w:t>
             </w:r>
           </w:p>
         </w:tc>
@@ -17386,7 +17558,7 @@
                 <w:rFonts w:ascii="Arial" w:hAnsi="Arial"/>
                 <w:sz w:val="20"/>
               </w:rPr>
-              <w:t>2026-06-12</w:t>
+              <w:t>2026-06-15</w:t>
             </w:r>
           </w:p>
         </w:tc>
@@ -17557,7 +17729,7 @@
                 <w:rFonts w:ascii="Arial" w:hAnsi="Arial"/>
                 <w:sz w:val="20"/>
               </w:rPr>
-              <w:t>2026-06-12</w:t>
+              <w:t>2026-06-15</w:t>
             </w:r>
           </w:p>
         </w:tc>
@@ -17720,7 +17892,7 @@
                 <w:rFonts w:ascii="Arial" w:hAnsi="Arial"/>
                 <w:sz w:val="20"/>
               </w:rPr>
-              <w:t>2026-06-12</w:t>
+              <w:t>2026-06-15</w:t>
             </w:r>
           </w:p>
         </w:tc>
@@ -17891,7 +18063,7 @@
                 <w:rFonts w:ascii="Arial" w:hAnsi="Arial"/>
                 <w:sz w:val="20"/>
               </w:rPr>
-              <w:t>2026-06-12</w:t>
+              <w:t>2026-06-15</w:t>
             </w:r>
           </w:p>
         </w:tc>
@@ -18054,7 +18226,7 @@
                 <w:rFonts w:ascii="Arial" w:hAnsi="Arial"/>
                 <w:sz w:val="20"/>
               </w:rPr>
-              <w:t>2026-06-12</w:t>
+              <w:t>2026-06-15</w:t>
             </w:r>
           </w:p>
         </w:tc>
@@ -18225,7 +18397,7 @@
                 <w:rFonts w:ascii="Arial" w:hAnsi="Arial"/>
                 <w:sz w:val="20"/>
               </w:rPr>
-              <w:t>2026-06-12</w:t>
+              <w:t>2026-06-15</w:t>
             </w:r>
           </w:p>
         </w:tc>
@@ -18388,7 +18560,7 @@
                 <w:rFonts w:ascii="Arial" w:hAnsi="Arial"/>
                 <w:sz w:val="20"/>
               </w:rPr>
-              <w:t>2026-06-12</w:t>
+              <w:t>2026-06-15</w:t>
             </w:r>
           </w:p>
         </w:tc>
@@ -18558,7 +18730,7 @@
                 <w:rFonts w:ascii="Arial" w:hAnsi="Arial"/>
                 <w:sz w:val="20"/>
               </w:rPr>
-              <w:t>2026-06-12</w:t>
+              <w:t>2026-06-15</w:t>
             </w:r>
           </w:p>
         </w:tc>
@@ -18720,7 +18892,7 @@
                 <w:rFonts w:ascii="Arial" w:hAnsi="Arial"/>
                 <w:sz w:val="20"/>
               </w:rPr>
-              <w:t>2026-06-12</w:t>
+              <w:t>2026-06-15</w:t>
             </w:r>
           </w:p>
         </w:tc>
@@ -18890,7 +19062,7 @@
                 <w:rFonts w:ascii="Arial" w:hAnsi="Arial"/>
                 <w:sz w:val="20"/>
               </w:rPr>
-              <w:t>2026-06-12</w:t>
+              <w:t>2026-06-15</w:t>
             </w:r>
           </w:p>
         </w:tc>
@@ -19053,7 +19225,7 @@
                 <w:rFonts w:ascii="Arial" w:hAnsi="Arial"/>
                 <w:sz w:val="20"/>
               </w:rPr>
-              <w:t>2026-06-12</w:t>
+              <w:t>2026-06-15</w:t>
             </w:r>
           </w:p>
         </w:tc>
@@ -24734,7 +24906,7 @@
                 <w:rFonts w:ascii="Arial" w:hAnsi="Arial"/>
                 <w:sz w:val="20"/>
               </w:rPr>
-              <w:t>2026-06-12</w:t>
+              <w:t>2026-06-15</w:t>
             </w:r>
           </w:p>
         </w:tc>
@@ -24897,7 +25069,7 @@
                 <w:rFonts w:ascii="Arial" w:hAnsi="Arial"/>
                 <w:sz w:val="20"/>
               </w:rPr>
-              <w:t>2026-06-12</w:t>
+              <w:t>2026-06-15</w:t>
             </w:r>
           </w:p>
         </w:tc>
@@ -25068,7 +25240,7 @@
                 <w:rFonts w:ascii="Arial" w:hAnsi="Arial"/>
                 <w:sz w:val="20"/>
               </w:rPr>
-              <w:t>2026-06-12</w:t>
+              <w:t>2026-06-15</w:t>
             </w:r>
           </w:p>
         </w:tc>
@@ -25231,7 +25403,7 @@
                 <w:rFonts w:ascii="Arial" w:hAnsi="Arial"/>
                 <w:sz w:val="20"/>
               </w:rPr>
-              <w:t>2026-06-12</w:t>
+              <w:t>2026-06-15</w:t>
             </w:r>
           </w:p>
         </w:tc>
@@ -25402,7 +25574,7 @@
                 <w:rFonts w:ascii="Arial" w:hAnsi="Arial"/>
                 <w:sz w:val="20"/>
               </w:rPr>
-              <w:t>2026-06-12</w:t>
+              <w:t>2026-06-15</w:t>
             </w:r>
           </w:p>
         </w:tc>
@@ -25565,7 +25737,7 @@
                 <w:rFonts w:ascii="Arial" w:hAnsi="Arial"/>
                 <w:sz w:val="20"/>
               </w:rPr>
-              <w:t>2026-06-12</w:t>
+              <w:t>2026-06-15</w:t>
             </w:r>
           </w:p>
         </w:tc>
@@ -25736,7 +25908,7 @@
                 <w:rFonts w:ascii="Arial" w:hAnsi="Arial"/>
                 <w:sz w:val="20"/>
               </w:rPr>
-              <w:t>2026-06-12</w:t>
+              <w:t>2026-06-15</w:t>
             </w:r>
           </w:p>
         </w:tc>
@@ -25899,7 +26071,7 @@
                 <w:rFonts w:ascii="Arial" w:hAnsi="Arial"/>
                 <w:sz w:val="20"/>
               </w:rPr>
-              <w:t>2026-06-12</w:t>
+              <w:t>2026-06-15</w:t>
             </w:r>
           </w:p>
         </w:tc>
@@ -26070,7 +26242,7 @@
                 <w:rFonts w:ascii="Arial" w:hAnsi="Arial"/>
                 <w:sz w:val="20"/>
               </w:rPr>
-              <w:t>2026-06-12</w:t>
+              <w:t>2026-06-15</w:t>
             </w:r>
           </w:p>
         </w:tc>
@@ -26233,7 +26405,7 @@
                 <w:rFonts w:ascii="Arial" w:hAnsi="Arial"/>
                 <w:sz w:val="20"/>
               </w:rPr>
-              <w:t>2026-06-12</w:t>
+              <w:t>2026-06-15</w:t>
             </w:r>
           </w:p>
         </w:tc>
@@ -26404,7 +26576,7 @@
                 <w:rFonts w:ascii="Arial" w:hAnsi="Arial"/>
                 <w:sz w:val="20"/>
               </w:rPr>
-              <w:t>2026-06-12</w:t>
+              <w:t>2026-06-15</w:t>
             </w:r>
           </w:p>
         </w:tc>

</xml_diff>

<commit_message>
MS-8: fix cash rate to current 4.35% + real macro_context.csv (drop broken orphan)
Cash rate: RBA F1 is at 4.35% (RBA hiked from 3.85% since March); the committed
cache F1 and config/README still showed 3.85%. Refresh the committed cache to the
current live series, set config cash_rate base 4.35, and update the README reading
to 4.35% (+0.5pp YoY) so every output reconciles to the current rate.

macro_context: the documented macro_context.csv was never built — the only file
was an orphaned, broken macro_context_panel.csv (garbage unemployment from a
removed parser). Delete it and build a real macro_context.csv contract from the
current readings: live RBA F1 cash rate + cited current levels, each tagged
reading_type live/stated/assumption (no fabricated unemployment series). Reader +
test added; excluded from the upstream completeness check (separate builder).
pytest 134 green.
</commit_message>
<xml_diff>
--- a/outputs/reports/Industry_Analysis_Q1_2026_Board.docx
+++ b/outputs/reports/Industry_Analysis_Q1_2026_Board.docx
@@ -49,7 +49,7 @@
           <w:color w:val="7F7F7F"/>
           <w:sz w:val="20"/>
         </w:rPr>
-        <w:t>Macro and downturn overlays as of 2026-06-12. Property cycle data as of 2026-02-01.</w:t>
+        <w:t>Macro and downturn overlays as of 2026-06-15. Property cycle data as of 2026-02-01.</w:t>
       </w:r>
     </w:p>
     <w:tbl>
@@ -139,7 +139,7 @@
           <w:b w:val="0"/>
           <w:i w:val="0"/>
         </w:rPr>
-        <w:t>Macro and downturn overlays are dated 2026-06-12; property-cycle data is dated 2026-02-01. The headline numbers are in Section 2; every figure traces back to a named public source in Sections 3-5.</w:t>
+        <w:t>Macro and downturn overlays are dated 2026-06-15; property-cycle data is dated 2026-02-01. The headline numbers are in Section 2; every figure traces back to a named public source in Sections 3-5.</w:t>
       </w:r>
     </w:p>
     <w:p>
@@ -313,7 +313,7 @@
                 <w:rFonts w:ascii="Arial" w:hAnsi="Arial"/>
                 <w:sz w:val="20"/>
               </w:rPr>
-              <w:t>2026-06-12</w:t>
+              <w:t>2026-06-15</w:t>
             </w:r>
           </w:p>
         </w:tc>
@@ -449,7 +449,7 @@
                 <w:rFonts w:ascii="Arial" w:hAnsi="Arial"/>
                 <w:sz w:val="20"/>
               </w:rPr>
-              <w:t>2026-06-12</w:t>
+              <w:t>2026-06-15</w:t>
             </w:r>
           </w:p>
         </w:tc>
@@ -518,7 +518,7 @@
                 <w:rFonts w:ascii="Arial" w:hAnsi="Arial"/>
                 <w:sz w:val="20"/>
               </w:rPr>
-              <w:t>2026-06-12</w:t>
+              <w:t>2026-06-15</w:t>
             </w:r>
           </w:p>
         </w:tc>
@@ -585,7 +585,7 @@
                 <w:rFonts w:ascii="Arial" w:hAnsi="Arial"/>
                 <w:sz w:val="20"/>
               </w:rPr>
-              <w:t>2026-06-12</w:t>
+              <w:t>2026-06-15</w:t>
             </w:r>
           </w:p>
         </w:tc>
@@ -721,7 +721,7 @@
                 <w:rFonts w:ascii="Arial" w:hAnsi="Arial"/>
                 <w:sz w:val="20"/>
               </w:rPr>
-              <w:t>2026-06-12</w:t>
+              <w:t>2026-06-15</w:t>
             </w:r>
           </w:p>
         </w:tc>
@@ -790,7 +790,7 @@
                 <w:rFonts w:ascii="Arial" w:hAnsi="Arial"/>
                 <w:sz w:val="20"/>
               </w:rPr>
-              <w:t>2026-06-12</w:t>
+              <w:t>2026-06-15</w:t>
             </w:r>
           </w:p>
         </w:tc>
@@ -4351,7 +4351,7 @@
                 <w:rFonts w:ascii="Arial" w:hAnsi="Arial"/>
                 <w:sz w:val="20"/>
               </w:rPr>
-              <w:t>2026-06-12</w:t>
+              <w:t>2026-06-15</w:t>
             </w:r>
           </w:p>
         </w:tc>
@@ -4489,7 +4489,7 @@
                 <w:rFonts w:ascii="Arial" w:hAnsi="Arial"/>
                 <w:sz w:val="20"/>
               </w:rPr>
-              <w:t>2026-06-12</w:t>
+              <w:t>2026-06-15</w:t>
             </w:r>
           </w:p>
         </w:tc>
@@ -4619,7 +4619,7 @@
                 <w:rFonts w:ascii="Arial" w:hAnsi="Arial"/>
                 <w:sz w:val="20"/>
               </w:rPr>
-              <w:t>2026-06-12</w:t>
+              <w:t>2026-06-15</w:t>
             </w:r>
           </w:p>
         </w:tc>
@@ -4757,7 +4757,7 @@
                 <w:rFonts w:ascii="Arial" w:hAnsi="Arial"/>
                 <w:sz w:val="20"/>
               </w:rPr>
-              <w:t>2026-06-12</w:t>
+              <w:t>2026-06-15</w:t>
             </w:r>
           </w:p>
         </w:tc>
@@ -5523,7 +5523,7 @@
                 <w:rFonts w:ascii="Arial" w:hAnsi="Arial"/>
                 <w:sz w:val="20"/>
               </w:rPr>
-              <w:t>2026-06-15T04:40:20+00:00</w:t>
+              <w:t>2026-06-16T00:59:21+00:00</w:t>
             </w:r>
           </w:p>
         </w:tc>
@@ -5670,7 +5670,7 @@
                 <w:rFonts w:ascii="Arial" w:hAnsi="Arial"/>
                 <w:sz w:val="20"/>
               </w:rPr>
-              <w:t>2026-06-15T04:40:23+00:00</w:t>
+              <w:t>2026-06-16T00:59:23+00:00</w:t>
             </w:r>
           </w:p>
         </w:tc>
@@ -5965,7 +5965,7 @@
                 <w:rFonts w:ascii="Arial" w:hAnsi="Arial"/>
                 <w:sz w:val="20"/>
               </w:rPr>
-              <w:t>2026-06-15T04:40:21+00:00</w:t>
+              <w:t>2026-06-16T00:59:22+00:00</w:t>
             </w:r>
           </w:p>
         </w:tc>
@@ -6115,7 +6115,7 @@
                 <w:rFonts w:ascii="Arial" w:hAnsi="Arial"/>
                 <w:sz w:val="20"/>
               </w:rPr>
-              <w:t>2026-06-15T04:40:21+00:00</w:t>
+              <w:t>2026-06-16T00:59:21+00:00</w:t>
             </w:r>
           </w:p>
         </w:tc>
@@ -6848,7 +6848,7 @@
                 <w:rFonts w:ascii="Arial" w:hAnsi="Arial"/>
                 <w:sz w:val="20"/>
               </w:rPr>
-              <w:t>2026-06-15T04:40:22+00:00</w:t>
+              <w:t>2026-06-16T00:59:22+00:00</w:t>
             </w:r>
           </w:p>
         </w:tc>
@@ -7729,7 +7729,7 @@
                 <w:rFonts w:ascii="Arial" w:hAnsi="Arial"/>
                 <w:sz w:val="20"/>
               </w:rPr>
-              <w:t>2026-06-15T04:40:25+00:00</w:t>
+              <w:t>2026-06-16T00:59:24+00:00</w:t>
             </w:r>
           </w:p>
         </w:tc>
@@ -7879,7 +7879,7 @@
                 <w:rFonts w:ascii="Arial" w:hAnsi="Arial"/>
                 <w:sz w:val="20"/>
               </w:rPr>
-              <w:t>2026-06-15T04:40:25+00:00</w:t>
+              <w:t>2026-06-16T00:59:25+00:00</w:t>
             </w:r>
           </w:p>
         </w:tc>
@@ -8026,7 +8026,7 @@
                 <w:rFonts w:ascii="Arial" w:hAnsi="Arial"/>
                 <w:sz w:val="20"/>
               </w:rPr>
-              <w:t>2026-06-15T04:40:26+00:00</w:t>
+              <w:t>2026-06-16T00:59:25+00:00</w:t>
             </w:r>
           </w:p>
         </w:tc>
@@ -8176,7 +8176,7 @@
                 <w:rFonts w:ascii="Arial" w:hAnsi="Arial"/>
                 <w:sz w:val="20"/>
               </w:rPr>
-              <w:t>2026-06-15T04:40:24+00:00</w:t>
+              <w:t>2026-06-16T00:59:23+00:00</w:t>
             </w:r>
           </w:p>
         </w:tc>
@@ -8193,7 +8193,7 @@
                 <w:rFonts w:ascii="Arial" w:hAnsi="Arial"/>
                 <w:sz w:val="20"/>
               </w:rPr>
-              <w:t>302148</w:t>
+              <w:t>302215</w:t>
             </w:r>
           </w:p>
         </w:tc>
@@ -9660,7 +9660,7 @@
                 <w:rFonts w:ascii="Arial" w:hAnsi="Arial"/>
                 <w:sz w:val="20"/>
               </w:rPr>
-              <w:t>2026-06-16T10:26:53</w:t>
+              <w:t>2026-06-16T10:59:27</w:t>
             </w:r>
           </w:p>
         </w:tc>
@@ -9763,7 +9763,7 @@
                 <w:rFonts w:ascii="Arial" w:hAnsi="Arial"/>
                 <w:sz w:val="20"/>
               </w:rPr>
-              <w:t>2026-06-16T10:26:53</w:t>
+              <w:t>2026-06-16T10:59:27</w:t>
             </w:r>
           </w:p>
         </w:tc>
@@ -9862,7 +9862,7 @@
                 <w:rFonts w:ascii="Arial" w:hAnsi="Arial"/>
                 <w:sz w:val="20"/>
               </w:rPr>
-              <w:t>2026-06-16T10:26:53</w:t>
+              <w:t>2026-06-16T10:59:27</w:t>
             </w:r>
           </w:p>
         </w:tc>
@@ -9965,7 +9965,7 @@
                 <w:rFonts w:ascii="Arial" w:hAnsi="Arial"/>
                 <w:sz w:val="20"/>
               </w:rPr>
-              <w:t>2026-06-16T10:26:53</w:t>
+              <w:t>2026-06-16T10:59:27</w:t>
             </w:r>
           </w:p>
         </w:tc>
@@ -10064,7 +10064,7 @@
                 <w:rFonts w:ascii="Arial" w:hAnsi="Arial"/>
                 <w:sz w:val="20"/>
               </w:rPr>
-              <w:t>2026-06-16T10:26:53</w:t>
+              <w:t>2026-06-16T10:59:27</w:t>
             </w:r>
           </w:p>
         </w:tc>
@@ -10167,7 +10167,7 @@
                 <w:rFonts w:ascii="Arial" w:hAnsi="Arial"/>
                 <w:sz w:val="20"/>
               </w:rPr>
-              <w:t>2026-06-16T10:26:53</w:t>
+              <w:t>2026-06-16T10:59:27</w:t>
             </w:r>
           </w:p>
         </w:tc>
@@ -10266,7 +10266,7 @@
                 <w:rFonts w:ascii="Arial" w:hAnsi="Arial"/>
                 <w:sz w:val="20"/>
               </w:rPr>
-              <w:t>2026-06-16T10:26:53</w:t>
+              <w:t>2026-06-16T10:59:27</w:t>
             </w:r>
           </w:p>
         </w:tc>
@@ -10369,7 +10369,7 @@
                 <w:rFonts w:ascii="Arial" w:hAnsi="Arial"/>
                 <w:sz w:val="20"/>
               </w:rPr>
-              <w:t>2026-06-16T10:26:53</w:t>
+              <w:t>2026-06-16T10:59:27</w:t>
             </w:r>
           </w:p>
         </w:tc>
@@ -15392,7 +15392,7 @@
                 <w:rFonts w:ascii="Arial" w:hAnsi="Arial"/>
                 <w:sz w:val="20"/>
               </w:rPr>
-              <w:t>2026-06-12</w:t>
+              <w:t>2026-06-15</w:t>
             </w:r>
           </w:p>
         </w:tc>
@@ -15523,7 +15523,7 @@
                 <w:rFonts w:ascii="Arial" w:hAnsi="Arial"/>
                 <w:sz w:val="20"/>
               </w:rPr>
-              <w:t>2026-06-12</w:t>
+              <w:t>2026-06-15</w:t>
             </w:r>
           </w:p>
         </w:tc>
@@ -15660,7 +15660,7 @@
                 <w:rFonts w:ascii="Arial" w:hAnsi="Arial"/>
                 <w:sz w:val="20"/>
               </w:rPr>
-              <w:t>2026-06-12</w:t>
+              <w:t>2026-06-15</w:t>
             </w:r>
           </w:p>
         </w:tc>
@@ -15791,7 +15791,7 @@
                 <w:rFonts w:ascii="Arial" w:hAnsi="Arial"/>
                 <w:sz w:val="20"/>
               </w:rPr>
-              <w:t>2026-06-12</w:t>
+              <w:t>2026-06-15</w:t>
             </w:r>
           </w:p>
         </w:tc>
@@ -16072,7 +16072,7 @@
                 <w:rFonts w:ascii="Arial" w:hAnsi="Arial"/>
                 <w:sz w:val="20"/>
               </w:rPr>
-              <w:t>2026-06-12</w:t>
+              <w:t>2026-06-15</w:t>
             </w:r>
           </w:p>
         </w:tc>
@@ -30286,7 +30286,7 @@
                 <w:rFonts w:ascii="Arial" w:hAnsi="Arial"/>
                 <w:sz w:val="20"/>
               </w:rPr>
-              <w:t>3.85</w:t>
+              <w:t>4.35</w:t>
             </w:r>
           </w:p>
         </w:tc>
@@ -30302,7 +30302,7 @@
                 <w:rFonts w:ascii="Arial" w:hAnsi="Arial"/>
                 <w:sz w:val="20"/>
               </w:rPr>
-              <w:t>4.1</w:t>
+              <w:t>4.6</w:t>
             </w:r>
           </w:p>
         </w:tc>
@@ -30318,7 +30318,7 @@
                 <w:rFonts w:ascii="Arial" w:hAnsi="Arial"/>
                 <w:sz w:val="20"/>
               </w:rPr>
-              <w:t>4.35</w:t>
+              <w:t>4.85</w:t>
             </w:r>
           </w:p>
         </w:tc>
@@ -30334,7 +30334,7 @@
                 <w:rFonts w:ascii="Arial" w:hAnsi="Arial"/>
                 <w:sz w:val="20"/>
               </w:rPr>
-              <w:t>4.6</w:t>
+              <w:t>5.1</w:t>
             </w:r>
           </w:p>
         </w:tc>

</xml_diff>

<commit_message>
Refresh contracts + reports to the latest fetched public data (2026-06-16)
Ran the full pipeline (live ABS/RBA/PTRS fetch). Cash rate holds at 4.35%
(+0.5pp YoY); industry risk levels unchanged (4 Elevated / 2 Moderate-high /
12 Medium); as-of advances to 2026-06-16. Regenerated all contracts, the macro
context/stress outputs, and the Board/Technical reports; README as-of bumped.
</commit_message>
<xml_diff>
--- a/outputs/reports/Industry_Analysis_Q1_2026_Board.docx
+++ b/outputs/reports/Industry_Analysis_Q1_2026_Board.docx
@@ -5523,7 +5523,7 @@
                 <w:rFonts w:ascii="Arial" w:hAnsi="Arial"/>
                 <w:sz w:val="20"/>
               </w:rPr>
-              <w:t>2026-06-16T00:59:21+00:00</w:t>
+              <w:t>2026-06-16T01:19:44+00:00</w:t>
             </w:r>
           </w:p>
         </w:tc>
@@ -5670,7 +5670,7 @@
                 <w:rFonts w:ascii="Arial" w:hAnsi="Arial"/>
                 <w:sz w:val="20"/>
               </w:rPr>
-              <w:t>2026-06-16T00:59:23+00:00</w:t>
+              <w:t>2026-06-16T01:19:46+00:00</w:t>
             </w:r>
           </w:p>
         </w:tc>
@@ -5965,7 +5965,7 @@
                 <w:rFonts w:ascii="Arial" w:hAnsi="Arial"/>
                 <w:sz w:val="20"/>
               </w:rPr>
-              <w:t>2026-06-16T00:59:22+00:00</w:t>
+              <w:t>2026-06-16T01:19:45+00:00</w:t>
             </w:r>
           </w:p>
         </w:tc>
@@ -6115,7 +6115,7 @@
                 <w:rFonts w:ascii="Arial" w:hAnsi="Arial"/>
                 <w:sz w:val="20"/>
               </w:rPr>
-              <w:t>2026-06-16T00:59:21+00:00</w:t>
+              <w:t>2026-06-16T01:19:45+00:00</w:t>
             </w:r>
           </w:p>
         </w:tc>
@@ -6848,7 +6848,7 @@
                 <w:rFonts w:ascii="Arial" w:hAnsi="Arial"/>
                 <w:sz w:val="20"/>
               </w:rPr>
-              <w:t>2026-06-16T00:59:22+00:00</w:t>
+              <w:t>2026-06-16T01:19:46+00:00</w:t>
             </w:r>
           </w:p>
         </w:tc>
@@ -7729,7 +7729,7 @@
                 <w:rFonts w:ascii="Arial" w:hAnsi="Arial"/>
                 <w:sz w:val="20"/>
               </w:rPr>
-              <w:t>2026-06-16T00:59:24+00:00</w:t>
+              <w:t>2026-06-16T01:19:47+00:00</w:t>
             </w:r>
           </w:p>
         </w:tc>
@@ -7879,7 +7879,7 @@
                 <w:rFonts w:ascii="Arial" w:hAnsi="Arial"/>
                 <w:sz w:val="20"/>
               </w:rPr>
-              <w:t>2026-06-16T00:59:25+00:00</w:t>
+              <w:t>2026-06-16T01:19:48+00:00</w:t>
             </w:r>
           </w:p>
         </w:tc>
@@ -8026,7 +8026,7 @@
                 <w:rFonts w:ascii="Arial" w:hAnsi="Arial"/>
                 <w:sz w:val="20"/>
               </w:rPr>
-              <w:t>2026-06-16T00:59:25+00:00</w:t>
+              <w:t>2026-06-16T01:19:49+00:00</w:t>
             </w:r>
           </w:p>
         </w:tc>
@@ -8176,7 +8176,7 @@
                 <w:rFonts w:ascii="Arial" w:hAnsi="Arial"/>
                 <w:sz w:val="20"/>
               </w:rPr>
-              <w:t>2026-06-16T00:59:23+00:00</w:t>
+              <w:t>2026-06-16T01:19:47+00:00</w:t>
             </w:r>
           </w:p>
         </w:tc>
@@ -9660,7 +9660,7 @@
                 <w:rFonts w:ascii="Arial" w:hAnsi="Arial"/>
                 <w:sz w:val="20"/>
               </w:rPr>
-              <w:t>2026-06-16T10:59:27</w:t>
+              <w:t>2026-06-16T11:19:51</w:t>
             </w:r>
           </w:p>
         </w:tc>
@@ -9763,7 +9763,7 @@
                 <w:rFonts w:ascii="Arial" w:hAnsi="Arial"/>
                 <w:sz w:val="20"/>
               </w:rPr>
-              <w:t>2026-06-16T10:59:27</w:t>
+              <w:t>2026-06-16T11:19:51</w:t>
             </w:r>
           </w:p>
         </w:tc>
@@ -9862,7 +9862,7 @@
                 <w:rFonts w:ascii="Arial" w:hAnsi="Arial"/>
                 <w:sz w:val="20"/>
               </w:rPr>
-              <w:t>2026-06-16T10:59:27</w:t>
+              <w:t>2026-06-16T11:19:51</w:t>
             </w:r>
           </w:p>
         </w:tc>
@@ -9965,7 +9965,7 @@
                 <w:rFonts w:ascii="Arial" w:hAnsi="Arial"/>
                 <w:sz w:val="20"/>
               </w:rPr>
-              <w:t>2026-06-16T10:59:27</w:t>
+              <w:t>2026-06-16T11:19:51</w:t>
             </w:r>
           </w:p>
         </w:tc>
@@ -10064,7 +10064,7 @@
                 <w:rFonts w:ascii="Arial" w:hAnsi="Arial"/>
                 <w:sz w:val="20"/>
               </w:rPr>
-              <w:t>2026-06-16T10:59:27</w:t>
+              <w:t>2026-06-16T11:19:51</w:t>
             </w:r>
           </w:p>
         </w:tc>
@@ -10167,7 +10167,7 @@
                 <w:rFonts w:ascii="Arial" w:hAnsi="Arial"/>
                 <w:sz w:val="20"/>
               </w:rPr>
-              <w:t>2026-06-16T10:59:27</w:t>
+              <w:t>2026-06-16T11:19:51</w:t>
             </w:r>
           </w:p>
         </w:tc>
@@ -10266,7 +10266,7 @@
                 <w:rFonts w:ascii="Arial" w:hAnsi="Arial"/>
                 <w:sz w:val="20"/>
               </w:rPr>
-              <w:t>2026-06-16T10:59:27</w:t>
+              <w:t>2026-06-16T11:19:51</w:t>
             </w:r>
           </w:p>
         </w:tc>
@@ -10369,7 +10369,7 @@
                 <w:rFonts w:ascii="Arial" w:hAnsi="Arial"/>
                 <w:sz w:val="20"/>
               </w:rPr>
-              <w:t>2026-06-16T10:59:27</w:t>
+              <w:t>2026-06-16T11:19:51</w:t>
             </w:r>
           </w:p>
         </w:tc>

</xml_diff>